<commit_message>
Archive resolved field surveys (relevés 3/4/5) to docs/releves_resolus.md
Sur demande utilisateur : une fois un relevé tranché, sortir sa fiche de la liste
"à faire" pour la garder consignée ailleurs. Les relevés 3 (twill 0,20 mm),
4 (chants à l'air libre -> h_bord_x0 effectif) et 5 (thermostat = max des TC
d'interface) sont RÉSOLUS -> déplacés dans docs/releves_resolus.md (donnée +
conséquence modèle + journal de référence). mesures_a_realiser.md ne garde qu'un
pointeur court ; il redevient une liste de mesures encore à faire (relevés 1-2,
exp 6-8, mesures 9-10). Numéros conservés (référencés ailleurs). .docx régénéré.

Co-Authored-By: Claude Opus 4.8 <noreply@anthropic.com>
</commit_message>
<xml_diff>
--- a/docs/mesures_a_realiser.docx
+++ b/docs/mesures_a_realiser.docx
@@ -547,7 +547,7 @@
       </w:r>
     </w:p>
     <w:bookmarkEnd w:id="9"/>
-    <w:bookmarkStart w:id="15" w:name="Xe12900a8f44a7fabd6c7e53142ebd366849e083"/>
+    <w:bookmarkStart w:id="13" w:name="Xe12900a8f44a7fabd6c7e53142ebd366849e083"/>
     <w:p>
       <w:pPr>
         <w:pStyle w:val="Heading2"/>
@@ -912,7 +912,7 @@
       </w:r>
     </w:p>
     <w:bookmarkEnd w:id="10"/>
-    <w:bookmarkStart w:id="11" w:name="Xcc34eeb381769149bb77a3a4a65b5aa15ec2d07"/>
+    <w:bookmarkStart w:id="12" w:name="Xcc34eeb381769149bb77a3a4a65b5aa15ec2d07"/>
     <w:p>
       <w:pPr>
         <w:pStyle w:val="Heading3"/>
@@ -1051,147 +1051,83 @@
         <w:t xml:space="preserve">(en attente)</w:t>
       </w:r>
     </w:p>
-    <w:bookmarkEnd w:id="11"/>
-    <w:bookmarkStart w:id="12" w:name="relevé-3.-épaisseur-réelle-du-pli-twill"/>
-    <w:p>
-      <w:pPr>
-        <w:pStyle w:val="Heading3"/>
-      </w:pPr>
-      <w:r>
-        <w:t xml:space="preserve">Relevé 3. Épaisseur réelle du pli twill</w:t>
-      </w:r>
-    </w:p>
-    <w:p>
-      <w:pPr>
-        <w:pStyle w:val="FirstParagraph"/>
-      </w:pPr>
-      <w:r>
-        <w:rPr>
-          <w:b/>
-          <w:bCs/>
-        </w:rPr>
-        <w:t xml:space="preserve">Objectif.</w:t>
-      </w:r>
-      <w:r>
-        <w:t xml:space="preserve"> </w:t>
-      </w:r>
-      <w:r>
-        <w:t xml:space="preserve">Mesurer l’épaisseur du pli twill suscepteur.</w:t>
-      </w:r>
-    </w:p>
-    <w:p>
-      <w:pPr>
-        <w:pStyle w:val="BodyText"/>
-      </w:pPr>
-      <w:r>
-        <w:rPr>
-          <w:b/>
-          <w:bCs/>
-        </w:rPr>
-        <w:t xml:space="preserve">Méthode.</w:t>
-      </w:r>
-      <w:r>
-        <w:t xml:space="preserve"> </w:t>
-      </w:r>
-      <w:r>
-        <w:t xml:space="preserve">Un micromètre sur un pli twill seul, ou une mesure sur une coupe polie d’un</w:t>
-      </w:r>
-      <w:r>
-        <w:t xml:space="preserve"> </w:t>
-      </w:r>
-      <w:r>
-        <w:t xml:space="preserve">échantillon soudé.</w:t>
-      </w:r>
-    </w:p>
-    <w:p>
-      <w:pPr>
-        <w:pStyle w:val="BodyText"/>
-      </w:pPr>
-      <w:r>
-        <w:rPr>
-          <w:b/>
-          <w:bCs/>
-        </w:rPr>
-        <w:t xml:space="preserve">Paramètre du modèle résolu.</w:t>
-      </w:r>
-      <w:r>
-        <w:t xml:space="preserve"> </w:t>
-      </w:r>
-      <w:r>
-        <w:t xml:space="preserve">L’épaisseur du twill (0,28 mm, marquée « à confirmer ») et,</w:t>
-      </w:r>
-      <w:r>
-        <w:t xml:space="preserve"> </w:t>
-      </w:r>
-      <w:r>
-        <w:t xml:space="preserve">par cohérence, sa conductivité.</w:t>
-      </w:r>
-    </w:p>
-    <w:p>
-      <w:pPr>
-        <w:pStyle w:val="BodyText"/>
-      </w:pPr>
-      <w:r>
-        <w:rPr>
-          <w:b/>
-          <w:bCs/>
-        </w:rPr>
-        <w:t xml:space="preserve">Gain attendu.</w:t>
-      </w:r>
-      <w:r>
-        <w:t xml:space="preserve"> </w:t>
-      </w:r>
-      <w:r>
-        <w:t xml:space="preserve">Le twill porte l’essentiel de la chaleur. Fiabiliser son épaisseur affine la</w:t>
-      </w:r>
-      <w:r>
-        <w:t xml:space="preserve"> </w:t>
-      </w:r>
-      <w:r>
-        <w:t xml:space="preserve">répartition de puissance entre couches, au cœur du déficit de surface.</w:t>
-      </w:r>
-    </w:p>
-    <w:p>
-      <w:pPr>
-        <w:pStyle w:val="BodyText"/>
-      </w:pPr>
-      <w:r>
-        <w:rPr>
-          <w:b/>
-          <w:bCs/>
-        </w:rPr>
-        <w:t xml:space="preserve">Temps estimé.</w:t>
-      </w:r>
-      <w:r>
-        <w:t xml:space="preserve"> </w:t>
-      </w:r>
-      <w:r>
-        <w:t xml:space="preserve">10 minutes.</w:t>
-      </w:r>
-    </w:p>
-    <w:p>
-      <w:pPr>
-        <w:pStyle w:val="BodyText"/>
-      </w:pPr>
-      <w:r>
-        <w:rPr>
-          <w:b/>
-          <w:bCs/>
-        </w:rPr>
-        <w:t xml:space="preserve">Réponse (utilisateur, 2026-07-27) :</w:t>
-      </w:r>
-      <w:r>
-        <w:t xml:space="preserve"> </w:t>
-      </w:r>
-      <w:r>
-        <w:t xml:space="preserve">« Le pli de twill a une épaisseur de 0,20 mm. »</w:t>
-      </w:r>
-    </w:p>
     <w:p>
       <w:pPr>
         <w:pStyle w:val="BlockText"/>
       </w:pPr>
       <w:r>
+        <w:rPr>
+          <w:b/>
+          <w:bCs/>
+        </w:rPr>
+        <w:t xml:space="preserve">Relevés 3, 4 et 5 — RÉSOLUS (27 juillet 2026), archivés dans</w:t>
+      </w:r>
+      <w:r>
+        <w:rPr>
+          <w:b/>
+          <w:bCs/>
+        </w:rPr>
+        <w:t xml:space="preserve"> </w:t>
+      </w:r>
+      <w:hyperlink r:id="rId11">
+        <w:r>
+          <w:rPr>
+            <w:rStyle w:val="VerbatimChar"/>
+            <w:b/>
+            <w:bCs/>
+          </w:rPr>
+          <w:t xml:space="preserve">releves_resolus.md</w:t>
+        </w:r>
+      </w:hyperlink>
+      <w:r>
+        <w:rPr>
+          <w:b/>
+          <w:bCs/>
+        </w:rPr>
+        <w:t xml:space="preserve">.</w:t>
+      </w:r>
+      <w:r>
+        <w:t xml:space="preserve"> </w:t>
+      </w:r>
+      <w:r>
+        <w:t xml:space="preserve">En bref : twill mesuré</w:t>
+      </w:r>
+      <w:r>
+        <w:t xml:space="preserve"> </w:t>
+      </w:r>
+      <w:r>
+        <w:rPr>
+          <w:b/>
+          <w:bCs/>
+        </w:rPr>
+        <w:t xml:space="preserve">0,20 mm</w:t>
+      </w:r>
+      <w:r>
+        <w:t xml:space="preserve"> </w:t>
+      </w:r>
+      <w:r>
+        <w:t xml:space="preserve">(corr.</w:t>
+      </w:r>
+      <w:r>
+        <w:t xml:space="preserve"> </w:t>
+      </w:r>
+      <w:r>
+        <w:t xml:space="preserve">préparée) ; chants</w:t>
+      </w:r>
+      <w:r>
+        <w:t xml:space="preserve"> </w:t>
+      </w:r>
+      <w:r>
+        <w:rPr>
+          <w:b/>
+          <w:bCs/>
+        </w:rPr>
+        <w:t xml:space="preserve">à l’air libre</w:t>
+      </w:r>
+      <w:r>
+        <w:t xml:space="preserve"> </w:t>
+      </w:r>
+      <w:r>
         <w:t xml:space="preserve">→</w:t>
       </w:r>
       <w:r>
@@ -1199,802 +1135,49 @@
       </w:r>
       <w:r>
         <w:rPr>
-          <w:b/>
-          <w:bCs/>
-        </w:rPr>
-        <w:t xml:space="preserve">✔ FAIT — donnée acquise.</w:t>
-      </w:r>
-      <w:r>
-        <w:t xml:space="preserve"> </w:t>
-      </w:r>
-      <w:r>
-        <w:t xml:space="preserve">Le modèle utilise</w:t>
-      </w:r>
-      <w:r>
-        <w:t xml:space="preserve"> </w:t>
-      </w:r>
-      <w:r>
-        <w:rPr>
           <w:rStyle w:val="VerbatimChar"/>
         </w:rPr>
-        <w:t xml:space="preserve">twill_suscepteur.epaisseur = 0,28 mm</w:t>
-      </w:r>
-      <w:r>
-        <w:t xml:space="preserve"> </w:t>
-      </w:r>
-      <w:r>
-        <w:t xml:space="preserve">(marqué « à confirmer »). Valeur mesurée :</w:t>
-      </w:r>
-      <w:r>
-        <w:t xml:space="preserve"> </w:t>
-      </w:r>
-      <w:r>
-        <w:rPr>
-          <w:b/>
-          <w:bCs/>
-        </w:rPr>
-        <w:t xml:space="preserve">0,20 mm</w:t>
-      </w:r>
-      <w:r>
-        <w:t xml:space="preserve">. Correction préparée dans</w:t>
-      </w:r>
-      <w:r>
-        <w:t xml:space="preserve"> </w:t>
-      </w:r>
-      <w:r>
-        <w:rPr>
-          <w:rStyle w:val="VerbatimChar"/>
-        </w:rPr>
-        <w:t xml:space="preserve">config/materiaux.yaml</w:t>
-      </w:r>
-      <w:r>
-        <w:t xml:space="preserve"> </w:t>
-      </w:r>
-      <w:r>
-        <w:t xml:space="preserve">(commentaire),</w:t>
-      </w:r>
-      <w:r>
-        <w:t xml:space="preserve"> </w:t>
-      </w:r>
-      <w:r>
-        <w:rPr>
-          <w:b/>
-          <w:bCs/>
-        </w:rPr>
-        <w:t xml:space="preserve">à appliquer à la prochaine recalibration</w:t>
-      </w:r>
-      <w:r>
-        <w:t xml:space="preserve"> </w:t>
-      </w:r>
-      <w:r>
-        <w:t xml:space="preserve">:</w:t>
-      </w:r>
-      <w:r>
-        <w:t xml:space="preserve"> </w:t>
-      </w:r>
-      <w:r>
-        <w:t xml:space="preserve">l’épaisseur du twill change la répartition de puissance entre couches, donc impose un refit</w:t>
-      </w:r>
-      <w:r>
-        <w:t xml:space="preserve"> </w:t>
-      </w:r>
-      <w:r>
-        <w:t xml:space="preserve">de θ*. Non appliquée immédiatement pour ne pas confondre avec l’expérience « thermostat</w:t>
-      </w:r>
-      <w:r>
-        <w:t xml:space="preserve"> </w:t>
-      </w:r>
-      <w:r>
-        <w:t xml:space="preserve">capteurs » en cours.</w:t>
-      </w:r>
-    </w:p>
-    <w:bookmarkEnd w:id="12"/>
-    <w:bookmarkStart w:id="13" w:name="X072f22971216f2fcb87c34edb04681c61afe7e1"/>
-    <w:p>
-      <w:pPr>
-        <w:pStyle w:val="Heading3"/>
-      </w:pPr>
-      <w:r>
-        <w:t xml:space="preserve">Relevé 4. Condition aux bords de l’échantillon</w:t>
-      </w:r>
-    </w:p>
-    <w:p>
-      <w:pPr>
-        <w:pStyle w:val="FirstParagraph"/>
-      </w:pPr>
-      <w:r>
-        <w:rPr>
-          <w:b/>
-          <w:bCs/>
-        </w:rPr>
-        <w:t xml:space="preserve">Objectif.</w:t>
-      </w:r>
-      <w:r>
-        <w:t xml:space="preserve"> </w:t>
-      </w:r>
-      <w:r>
-        <w:t xml:space="preserve">Documenter ce qui touche les quatre chants de l’échantillon pendant un essai.</w:t>
-      </w:r>
-    </w:p>
-    <w:p>
-      <w:pPr>
-        <w:pStyle w:val="BodyText"/>
-      </w:pPr>
-      <w:r>
-        <w:rPr>
-          <w:b/>
-          <w:bCs/>
-        </w:rPr>
-        <w:t xml:space="preserve">Méthode.</w:t>
-      </w:r>
-      <w:r>
-        <w:t xml:space="preserve"> </w:t>
-      </w:r>
-      <w:r>
-        <w:t xml:space="preserve">Photographier et décrire l’appui, la bride ou l’absence de contact sur chaque</w:t>
-      </w:r>
-      <w:r>
-        <w:t xml:space="preserve"> </w:t>
-      </w:r>
-      <w:r>
-        <w:t xml:space="preserve">chant.</w:t>
-      </w:r>
-    </w:p>
-    <w:p>
-      <w:pPr>
-        <w:pStyle w:val="BodyText"/>
-      </w:pPr>
-      <w:r>
-        <w:rPr>
-          <w:b/>
-          <w:bCs/>
-        </w:rPr>
-        <w:t xml:space="preserve">Paramètre du modèle résolu.</w:t>
-      </w:r>
-      <w:r>
-        <w:t xml:space="preserve"> </w:t>
-      </w:r>
-      <w:r>
-        <w:t xml:space="preserve">La justification du paramètre</w:t>
-      </w:r>
-      <w:r>
-        <w:t xml:space="preserve"> </w:t>
-      </w:r>
-      <w:r>
-        <w:rPr>
-          <w:rStyle w:val="VerbatimChar"/>
-        </w:rPr>
         <w:t xml:space="preserve">h_bord_x0</w:t>
       </w:r>
       <w:r>
         <w:t xml:space="preserve"> </w:t>
       </w:r>
       <w:r>
-        <w:t xml:space="preserve">(puits de chaleur au</w:t>
-      </w:r>
-      <w:r>
-        <w:t xml:space="preserve"> </w:t>
-      </w:r>
-      <w:r>
-        <w:t xml:space="preserve">chant x = 0), aujourd’hui fragilisée.</w:t>
-      </w:r>
-    </w:p>
-    <w:p>
-      <w:pPr>
-        <w:pStyle w:val="BodyText"/>
-      </w:pPr>
-      <w:r>
-        <w:rPr>
-          <w:b/>
-          <w:bCs/>
-        </w:rPr>
-        <w:t xml:space="preserve">Gain attendu.</w:t>
-      </w:r>
-      <w:r>
-        <w:t xml:space="preserve"> </w:t>
-      </w:r>
-      <w:r>
-        <w:t xml:space="preserve">Tranche si</w:t>
-      </w:r>
-      <w:r>
-        <w:t xml:space="preserve"> </w:t>
-      </w:r>
-      <w:r>
-        <w:rPr>
-          <w:rStyle w:val="VerbatimChar"/>
-        </w:rPr>
-        <w:t xml:space="preserve">h_bord_x0 = 250</w:t>
-      </w:r>
-      <w:r>
-        <w:t xml:space="preserve"> </w:t>
-      </w:r>
-      <w:r>
-        <w:t xml:space="preserve">correspond à une condition physique réelle ou</w:t>
-      </w:r>
-      <w:r>
-        <w:t xml:space="preserve"> </w:t>
-      </w:r>
-      <w:r>
-        <w:t xml:space="preserve">n’est qu’un paramètre effectif, auquel cas le rapport doit le présenter comme tel.</w:t>
-      </w:r>
-    </w:p>
-    <w:p>
-      <w:pPr>
-        <w:pStyle w:val="BodyText"/>
-      </w:pPr>
-      <w:r>
-        <w:rPr>
-          <w:b/>
-          <w:bCs/>
-        </w:rPr>
-        <w:t xml:space="preserve">Temps estimé.</w:t>
-      </w:r>
-      <w:r>
-        <w:t xml:space="preserve"> </w:t>
-      </w:r>
-      <w:r>
-        <w:t xml:space="preserve">Une photo par essai.</w:t>
-      </w:r>
-    </w:p>
-    <w:p>
-      <w:pPr>
-        <w:pStyle w:val="BodyText"/>
-      </w:pPr>
-      <w:r>
-        <w:rPr>
-          <w:b/>
-          <w:bCs/>
-        </w:rPr>
-        <w:t xml:space="preserve">Réponse (utilisateur, 2026-07-27) :</w:t>
-      </w:r>
-      <w:r>
-        <w:t xml:space="preserve"> </w:t>
-      </w:r>
-      <w:r>
-        <w:t xml:space="preserve">« Les bords de l’échantillon sont à l’air libre pour</w:t>
-      </w:r>
-      <w:r>
-        <w:t xml:space="preserve"> </w:t>
-      </w:r>
-      <w:r>
-        <w:t xml:space="preserve">les faces latérales. La face inférieure (de l’assemblage soudé) est en contact avec le bloc</w:t>
-      </w:r>
-      <w:r>
-        <w:t xml:space="preserve"> </w:t>
-      </w:r>
-      <w:r>
-        <w:t xml:space="preserve">céramique du dessous. La face supérieure est en contact avec la céramique d’espacement, au</w:t>
-      </w:r>
-      <w:r>
-        <w:t xml:space="preserve"> </w:t>
-      </w:r>
-      <w:r>
-        <w:t xml:space="preserve">dessus de laquelle se trouve le CFC. »</w:t>
-      </w:r>
-    </w:p>
-    <w:p>
-      <w:pPr>
-        <w:pStyle w:val="BlockText"/>
-      </w:pPr>
-      <w:r>
-        <w:t xml:space="preserve">→</w:t>
-      </w:r>
-      <w:r>
-        <w:t xml:space="preserve"> </w:t>
-      </w:r>
-      <w:r>
-        <w:rPr>
-          <w:b/>
-          <w:bCs/>
-        </w:rPr>
-        <w:t xml:space="preserve">✔ RÉSOUT la question</w:t>
-      </w:r>
-      <w:r>
-        <w:rPr>
-          <w:b/>
-          <w:bCs/>
-        </w:rPr>
-        <w:t xml:space="preserve"> </w:t>
-      </w:r>
-      <w:r>
-        <w:rPr>
-          <w:rStyle w:val="VerbatimChar"/>
-          <w:b/>
-          <w:bCs/>
-        </w:rPr>
-        <w:t xml:space="preserve">h_bord_x0</w:t>
-      </w:r>
-      <w:r>
-        <w:rPr>
-          <w:b/>
-          <w:bCs/>
-        </w:rPr>
-        <w:t xml:space="preserve">.</w:t>
-      </w:r>
-      <w:r>
-        <w:t xml:space="preserve"> </w:t>
-      </w:r>
-      <w:r>
-        <w:t xml:space="preserve">Les quatre chants latéraux sont</w:t>
-      </w:r>
-      <w:r>
-        <w:t xml:space="preserve"> </w:t>
-      </w:r>
-      <w:r>
-        <w:rPr>
-          <w:b/>
-          <w:bCs/>
-        </w:rPr>
-        <w:t xml:space="preserve">à l’air libre</w:t>
-      </w:r>
-      <w:r>
-        <w:t xml:space="preserve"> </w:t>
-      </w:r>
-      <w:r>
-        <w:t xml:space="preserve">(aucune bride, aucun appui, aucun puits au chant x=0). Les seuls échanges verticaux sont la</w:t>
-      </w:r>
-      <w:r>
-        <w:t xml:space="preserve"> </w:t>
-      </w:r>
-      <w:r>
-        <w:t xml:space="preserve">face inférieure (bloc céramique →</w:t>
-      </w:r>
-      <w:r>
-        <w:t xml:space="preserve"> </w:t>
-      </w:r>
-      <w:r>
-        <w:rPr>
-          <w:rStyle w:val="VerbatimChar"/>
-        </w:rPr>
-        <w:t xml:space="preserve">h_bas</w:t>
-      </w:r>
-      <w:r>
-        <w:t xml:space="preserve">) et la face supérieure (céramique d’espacement →</w:t>
-      </w:r>
-      <w:r>
-        <w:t xml:space="preserve"> </w:t>
-      </w:r>
-      <w:r>
-        <w:t xml:space="preserve">CFC →</w:t>
-      </w:r>
-      <w:r>
-        <w:t xml:space="preserve"> </w:t>
-      </w:r>
-      <w:r>
-        <w:rPr>
-          <w:rStyle w:val="VerbatimChar"/>
-        </w:rPr>
-        <w:t xml:space="preserve">h_haut</w:t>
-      </w:r>
-      <w:r>
-        <w:t xml:space="preserve">).</w:t>
-      </w:r>
-      <w:r>
-        <w:t xml:space="preserve"> </w:t>
-      </w:r>
-      <w:r>
-        <w:rPr>
-          <w:b/>
-          <w:bCs/>
-        </w:rPr>
-        <w:t xml:space="preserve">Conclusion :</w:t>
-      </w:r>
-      <w:r>
-        <w:rPr>
-          <w:b/>
-          <w:bCs/>
-        </w:rPr>
-        <w:t xml:space="preserve"> </w:t>
-      </w:r>
-      <w:r>
-        <w:rPr>
-          <w:rStyle w:val="VerbatimChar"/>
-          <w:b/>
-          <w:bCs/>
-        </w:rPr>
-        <w:t xml:space="preserve">h_bord_x0 = 250</w:t>
-      </w:r>
-      <w:r>
-        <w:rPr>
-          <w:b/>
-          <w:bCs/>
-        </w:rPr>
-        <w:t xml:space="preserve"> </w:t>
-      </w:r>
-      <w:r>
-        <w:rPr>
-          <w:b/>
-          <w:bCs/>
-        </w:rPr>
-        <w:t xml:space="preserve">n’a AUCUNE base physique</w:t>
-      </w:r>
-      <w:r>
-        <w:t xml:space="preserve"> </w:t>
-      </w:r>
-      <w:r>
-        <w:t xml:space="preserve">— c’est un</w:t>
-      </w:r>
-      <w:r>
-        <w:t xml:space="preserve"> </w:t>
-      </w:r>
-      <w:r>
-        <w:t xml:space="preserve">paramètre EFFECTIF qui compense autre chose (vraisemblablement le bord trop chaud du profil</w:t>
-      </w:r>
-      <w:r>
-        <w:t xml:space="preserve"> </w:t>
-      </w:r>
-      <w:r>
-        <w:t xml:space="preserve">en « M » côté x=0), pas une condition réelle du montage. À requalifier comme tel dans les</w:t>
-      </w:r>
-      <w:r>
-        <w:t xml:space="preserve"> </w:t>
-      </w:r>
-      <w:r>
-        <w:t xml:space="preserve">docs, et</w:t>
-      </w:r>
-      <w:r>
-        <w:t xml:space="preserve"> </w:t>
-      </w:r>
-      <w:r>
-        <w:rPr>
-          <w:b/>
-          <w:bCs/>
-        </w:rPr>
-        <w:t xml:space="preserve">candidat au retrait</w:t>
-      </w:r>
-      <w:r>
-        <w:t xml:space="preserve"> </w:t>
-      </w:r>
-      <w:r>
-        <w:t xml:space="preserve">lors de la prochaine recalibration (le tester à 0 ou le</w:t>
-      </w:r>
-      <w:r>
-        <w:t xml:space="preserve"> </w:t>
-      </w:r>
-      <w:r>
-        <w:t xml:space="preserve">remplacer par une convection latérale faible et uniforme sur les quatre chants).</w:t>
-      </w:r>
-    </w:p>
-    <w:bookmarkEnd w:id="13"/>
-    <w:bookmarkStart w:id="14" w:name="X1c045007fa98702ff2e006a7fe28f6ac1cfc1b0"/>
-    <w:p>
-      <w:pPr>
-        <w:pStyle w:val="Heading3"/>
-      </w:pPr>
-      <w:r>
-        <w:t xml:space="preserve">Relevé 5. Point de coupure réel du thermostat</w:t>
-      </w:r>
-    </w:p>
-    <w:p>
-      <w:pPr>
-        <w:pStyle w:val="FirstParagraph"/>
-      </w:pPr>
-      <w:r>
-        <w:rPr>
-          <w:b/>
-          <w:bCs/>
-        </w:rPr>
-        <w:t xml:space="preserve">Objectif.</w:t>
-      </w:r>
-      <w:r>
-        <w:t xml:space="preserve"> </w:t>
-      </w:r>
-      <w:r>
-        <w:t xml:space="preserve">Établir sur quel signal la chauffe était coupée pendant les essais des séries</w:t>
-      </w:r>
-      <w:r>
-        <w:t xml:space="preserve"> </w:t>
-      </w:r>
-      <w:r>
-        <w:t xml:space="preserve">A et B : quel thermocouple ou quelle voie pilotait la régulation, et à quelle position sur</w:t>
-      </w:r>
-      <w:r>
-        <w:t xml:space="preserve"> </w:t>
-      </w:r>
-      <w:r>
-        <w:t xml:space="preserve">l’échantillon.</w:t>
-      </w:r>
-    </w:p>
-    <w:p>
-      <w:pPr>
-        <w:pStyle w:val="BodyText"/>
-      </w:pPr>
-      <w:r>
-        <w:rPr>
-          <w:b/>
-          <w:bCs/>
-        </w:rPr>
-        <w:t xml:space="preserve">Méthode.</w:t>
-      </w:r>
-      <w:r>
-        <w:t xml:space="preserve"> </w:t>
-      </w:r>
-      <w:r>
-        <w:t xml:space="preserve">Relire la configuration LabVIEW ou le cahier de laboratoire de la campagne, et</w:t>
-      </w:r>
-      <w:r>
-        <w:t xml:space="preserve"> </w:t>
-      </w:r>
-      <w:r>
-        <w:t xml:space="preserve">identifier la voie de consigne. Aucune manipulation de banc n’est nécessaire.</w:t>
-      </w:r>
-    </w:p>
-    <w:p>
-      <w:pPr>
-        <w:pStyle w:val="BodyText"/>
-      </w:pPr>
-      <w:r>
-        <w:rPr>
-          <w:b/>
-          <w:bCs/>
-        </w:rPr>
-        <w:t xml:space="preserve">Paramètre du modèle résolu.</w:t>
-      </w:r>
-      <w:r>
-        <w:t xml:space="preserve"> </w:t>
-      </w:r>
-      <w:r>
-        <w:t xml:space="preserve">Le nœud de contrôle du thermostat simulé. Le modèle coupe</w:t>
-      </w:r>
-      <w:r>
-        <w:t xml:space="preserve"> </w:t>
-      </w:r>
-      <w:r>
-        <w:t xml:space="preserve">aujourd’hui quand le</w:t>
-      </w:r>
-      <w:r>
-        <w:t xml:space="preserve"> </w:t>
-      </w:r>
-      <w:r>
-        <w:rPr>
-          <w:b/>
-          <w:bCs/>
-        </w:rPr>
-        <w:t xml:space="preserve">centre de l’empreinte</w:t>
-      </w:r>
-      <w:r>
-        <w:t xml:space="preserve"> </w:t>
-      </w:r>
-      <w:r>
-        <w:t xml:space="preserve">atteint la consigne ; s’il s’agissait en</w:t>
-      </w:r>
-      <w:r>
-        <w:t xml:space="preserve"> </w:t>
-      </w:r>
-      <w:r>
-        <w:t xml:space="preserve">réalité d’un thermocouple d’interface situé à une quinzaine de millimètres, les impulsions</w:t>
-      </w:r>
-      <w:r>
-        <w:t xml:space="preserve"> </w:t>
-      </w:r>
-      <w:r>
-        <w:t xml:space="preserve">réelles étaient plus longues.</w:t>
-      </w:r>
-    </w:p>
-    <w:p>
-      <w:pPr>
-        <w:pStyle w:val="BodyText"/>
-      </w:pPr>
-      <w:r>
-        <w:rPr>
-          <w:b/>
-          <w:bCs/>
-        </w:rPr>
-        <w:t xml:space="preserve">Gain attendu.</w:t>
-      </w:r>
-      <w:r>
-        <w:t xml:space="preserve"> </w:t>
-      </w:r>
-      <w:r>
-        <w:t xml:space="preserve">C’est la mesure qui tranche le résidu ouvert à basse consigne (essai B-2,</w:t>
-      </w:r>
-      <w:r>
-        <w:t xml:space="preserve"> </w:t>
-      </w:r>
-      <w:r>
-        <w:t xml:space="preserve">sous-chauffe de 30 à 55 °C entre empreintes). Trois correctifs numériques ont été prototypés</w:t>
-      </w:r>
-      <w:r>
-        <w:t xml:space="preserve"> </w:t>
-      </w:r>
-      <w:r>
-        <w:t xml:space="preserve">et réfutés faute de savoir où le procédé coupait réellement : la donnée manque, pas le code.</w:t>
-      </w:r>
-    </w:p>
-    <w:p>
-      <w:pPr>
-        <w:pStyle w:val="BodyText"/>
-      </w:pPr>
-      <w:r>
-        <w:rPr>
-          <w:b/>
-          <w:bCs/>
-        </w:rPr>
-        <w:t xml:space="preserve">Temps estimé.</w:t>
-      </w:r>
-      <w:r>
-        <w:t xml:space="preserve"> </w:t>
-      </w:r>
-      <w:r>
-        <w:t xml:space="preserve">Une relecture de configuration, quelques minutes.</w:t>
-      </w:r>
-    </w:p>
-    <w:p>
-      <w:pPr>
-        <w:pStyle w:val="BodyText"/>
-      </w:pPr>
-      <w:r>
-        <w:rPr>
-          <w:b/>
-          <w:bCs/>
-        </w:rPr>
-        <w:t xml:space="preserve">Réponse (utilisateur, 2026-07-27) :</w:t>
-      </w:r>
-      <w:r>
-        <w:t xml:space="preserve"> </w:t>
-      </w:r>
-      <w:r>
-        <w:t xml:space="preserve">« Regarde le cahier de laboratoire. »</w:t>
-      </w:r>
-    </w:p>
-    <w:p>
-      <w:pPr>
-        <w:pStyle w:val="BlockText"/>
-      </w:pPr>
-      <w:r>
-        <w:t xml:space="preserve">→</w:t>
-      </w:r>
-      <w:r>
-        <w:t xml:space="preserve"> </w:t>
-      </w:r>
-      <w:r>
-        <w:rPr>
-          <w:b/>
-          <w:bCs/>
-        </w:rPr>
-        <w:t xml:space="preserve">✔ RÉSOLU par le cahier de laboratoire.</w:t>
-      </w:r>
-      <w:r>
-        <w:t xml:space="preserve"> </w:t>
-      </w:r>
-      <w:r>
-        <w:t xml:space="preserve">Étape 6 de la procédure : « chauffe à 250 A</w:t>
-      </w:r>
-      <w:r>
-        <w:t xml:space="preserve"> </w:t>
-      </w:r>
-      <w:r>
-        <w:rPr>
-          <w:b/>
-          <w:bCs/>
-        </w:rPr>
-        <w:t xml:space="preserve">jusqu’à T = Tprocessing</w:t>
-      </w:r>
-      <w:r>
-        <w:t xml:space="preserve"> </w:t>
-      </w:r>
-      <w:r>
-        <w:t xml:space="preserve">», et la fiche B-1 formule la cible comme «</w:t>
-      </w:r>
-      <w:r>
-        <w:t xml:space="preserve"> </w:t>
-      </w:r>
-      <w:r>
-        <w:rPr>
-          <w:b/>
-          <w:bCs/>
-        </w:rPr>
-        <w:t xml:space="preserve">T max interface</w:t>
-      </w:r>
-      <w:r>
-        <w:rPr>
-          <w:b/>
-          <w:bCs/>
-        </w:rPr>
-        <w:t xml:space="preserve"> </w:t>
-      </w:r>
-      <w:r>
-        <w:rPr>
-          <w:b/>
-          <w:bCs/>
-        </w:rPr>
-        <w:t xml:space="preserve">(TC fiables 1/3/5)</w:t>
-      </w:r>
-      <w:r>
-        <w:t xml:space="preserve"> </w:t>
-      </w:r>
-      <w:r>
-        <w:t xml:space="preserve">… jamais dépassé ~372 °C ». La coupure se faisait donc</w:t>
-      </w:r>
-      <w:r>
-        <w:t xml:space="preserve"> </w:t>
-      </w:r>
-      <w:r>
-        <w:rPr>
-          <w:b/>
-          <w:bCs/>
-        </w:rPr>
-        <w:t xml:space="preserve">quand le</w:t>
-      </w:r>
-      <w:r>
-        <w:rPr>
-          <w:b/>
-          <w:bCs/>
-        </w:rPr>
-        <w:t xml:space="preserve"> </w:t>
-      </w:r>
-      <w:r>
-        <w:rPr>
-          <w:b/>
-          <w:bCs/>
-        </w:rPr>
-        <w:t xml:space="preserve">thermocouple d’interface le plus chaud atteignait la consigne</w:t>
-      </w:r>
-      <w:r>
-        <w:t xml:space="preserve">, pas quand le centre du spot</w:t>
-      </w:r>
-      <w:r>
-        <w:t xml:space="preserve"> </w:t>
-      </w:r>
-      <w:r>
-        <w:t xml:space="preserve">l’atteignait. C’est cohérent avec les données B-2 (chaque impulsion coupée par le TC le plus</w:t>
-      </w:r>
-      <w:r>
-        <w:t xml:space="preserve"> </w:t>
-      </w:r>
-      <w:r>
-        <w:t xml:space="preserve">proche, alternant devant/derrière — cf. analyse).</w:t>
-      </w:r>
-      <w:r>
-        <w:t xml:space="preserve"> </w:t>
-      </w:r>
-      <w:r>
-        <w:rPr>
-          <w:b/>
-          <w:bCs/>
-        </w:rPr>
-        <w:t xml:space="preserve">Le modèle, lui, coupe au centre du</w:t>
-      </w:r>
-      <w:r>
-        <w:rPr>
-          <w:b/>
-          <w:bCs/>
-        </w:rPr>
-        <w:t xml:space="preserve"> </w:t>
-      </w:r>
-      <w:r>
-        <w:rPr>
-          <w:b/>
-          <w:bCs/>
-        </w:rPr>
-        <w:t xml:space="preserve">spot</w:t>
-      </w:r>
-      <w:r>
-        <w:t xml:space="preserve"> </w:t>
-      </w:r>
-      <w:r>
-        <w:t xml:space="preserve">→ il coupe trop tôt → sous-chauffe les points inter-empreintes. Le correctif</w:t>
-      </w:r>
-      <w:r>
-        <w:t xml:space="preserve"> </w:t>
-      </w:r>
-      <w:r>
-        <w:t xml:space="preserve">physiquement fondé (« loi capteurs » : couper sur le max de T aux positions TC réelles) est</w:t>
-      </w:r>
-      <w:r>
-        <w:t xml:space="preserve"> </w:t>
-      </w:r>
-      <w:r>
-        <w:t xml:space="preserve">en cours de test + recalibration (</w:t>
-      </w:r>
-      <w:r>
-        <w:rPr>
-          <w:rStyle w:val="VerbatimChar"/>
-        </w:rPr>
-        <w:t xml:space="preserve">resultats_diag_b2_thermostat_capteurs.log</w:t>
-      </w:r>
-      <w:r>
-        <w:t xml:space="preserve">, à venir).</w:t>
+        <w:t xml:space="preserve">est un paramètre effectif, pas physique ;</w:t>
+      </w:r>
+      <w:r>
+        <w:t xml:space="preserve"> </w:t>
+      </w:r>
+      <w:r>
+        <w:t xml:space="preserve">thermostat coupait sur le</w:t>
+      </w:r>
+      <w:r>
+        <w:t xml:space="preserve"> </w:t>
+      </w:r>
+      <w:r>
+        <w:rPr>
+          <w:b/>
+          <w:bCs/>
+        </w:rPr>
+        <w:t xml:space="preserve">max des TC d’interface</w:t>
+      </w:r>
+      <w:r>
+        <w:t xml:space="preserve"> </w:t>
+      </w:r>
+      <w:r>
+        <w:t xml:space="preserve">(cahier de labo) → loi « capteurs »</w:t>
+      </w:r>
+      <w:r>
+        <w:t xml:space="preserve"> </w:t>
+      </w:r>
+      <w:r>
+        <w:t xml:space="preserve">implémentée derrière un flag. Les trois corrections s’intégreront à la prochaine</w:t>
+      </w:r>
+      <w:r>
+        <w:t xml:space="preserve"> </w:t>
+      </w:r>
+      <w:r>
+        <w:t xml:space="preserve">recalibration.</w:t>
       </w:r>
     </w:p>
     <w:p>
@@ -2004,603 +1187,603 @@
         </w:pict>
       </w:r>
     </w:p>
+    <w:bookmarkEnd w:id="12"/>
+    <w:bookmarkEnd w:id="13"/>
+    <w:bookmarkStart w:id="17" w:name="X050f80098886d27d0233576c23f921ac46bb86f"/>
+    <w:p>
+      <w:pPr>
+        <w:pStyle w:val="Heading2"/>
+      </w:pPr>
+      <w:r>
+        <w:t xml:space="preserve">Niveau 2. Expériences rapides (un essai chacune, même banc)</w:t>
+      </w:r>
+    </w:p>
+    <w:bookmarkStart w:id="14" w:name="X7b864b83b0bd743e51ddb75723b23c433aa888b"/>
+    <w:p>
+      <w:pPr>
+        <w:pStyle w:val="Heading3"/>
+      </w:pPr>
+      <w:r>
+        <w:t xml:space="preserve">Expérience 6. Cartographie latérale de la diffusivité dans le plan</w:t>
+      </w:r>
+    </w:p>
+    <w:p>
+      <w:pPr>
+        <w:pStyle w:val="BlockText"/>
+      </w:pPr>
+      <w:r>
+        <w:t xml:space="preserve">⚠</w:t>
+      </w:r>
+      <w:r>
+        <w:t xml:space="preserve"> </w:t>
+      </w:r>
+      <w:r>
+        <w:rPr>
+          <w:b/>
+          <w:bCs/>
+        </w:rPr>
+        <w:t xml:space="preserve">Priorité revue à la baisse le 24 juillet.</w:t>
+      </w:r>
+      <w:r>
+        <w:t xml:space="preserve"> </w:t>
+      </w:r>
+      <w:r>
+        <w:t xml:space="preserve">Cette expérience visait un</w:t>
+      </w:r>
+      <w:r>
+        <w:t xml:space="preserve"> </w:t>
+      </w:r>
+      <w:r>
+        <w:rPr>
+          <w:rStyle w:val="VerbatimChar"/>
+        </w:rPr>
+        <w:t xml:space="preserve">k_plan</w:t>
+      </w:r>
+      <w:r>
+        <w:t xml:space="preserve"> </w:t>
+      </w:r>
+      <w:r>
+        <w:t xml:space="preserve">de 6 à</w:t>
+      </w:r>
+      <w:r>
+        <w:t xml:space="preserve"> </w:t>
+      </w:r>
+      <w:r>
+        <w:t xml:space="preserve">9 W/m·K que la donnée semblait réclamer. Après correction de la géométrie de bobine, le</w:t>
+      </w:r>
+      <w:r>
+        <w:t xml:space="preserve"> </w:t>
+      </w:r>
+      <w:r>
+        <w:t xml:space="preserve">modèle s’accorde à</w:t>
+      </w:r>
+      <w:r>
+        <w:t xml:space="preserve"> </w:t>
+      </w:r>
+      <w:r>
+        <w:rPr>
+          <w:rStyle w:val="VerbatimChar"/>
+        </w:rPr>
+        <w:t xml:space="preserve">k_plan = 3 W/m·K</w:t>
+      </w:r>
+      <w:r>
+        <w:t xml:space="preserve">, la valeur homogénéisée physique, et un balayage</w:t>
+      </w:r>
+      <w:r>
+        <w:t xml:space="preserve"> </w:t>
+      </w:r>
+      <w:r>
+        <w:t xml:space="preserve">jusqu’à k = 6 ne corrige pas le résidu restant. La mesure garde sa valeur de</w:t>
+      </w:r>
+      <w:r>
+        <w:t xml:space="preserve"> </w:t>
+      </w:r>
+      <w:r>
+        <w:rPr>
+          <w:b/>
+          <w:bCs/>
+        </w:rPr>
+        <w:t xml:space="preserve">vérification</w:t>
+      </w:r>
+      <w:r>
+        <w:t xml:space="preserve"> </w:t>
+      </w:r>
+      <w:r>
+        <w:t xml:space="preserve">d’une propriété assumée, mais elle ne tranche plus un écart ouvert.</w:t>
+      </w:r>
+    </w:p>
+    <w:p>
+      <w:pPr>
+        <w:pStyle w:val="FirstParagraph"/>
+      </w:pPr>
+      <w:r>
+        <w:rPr>
+          <w:b/>
+          <w:bCs/>
+        </w:rPr>
+        <w:t xml:space="preserve">Objectif.</w:t>
+      </w:r>
+      <w:r>
+        <w:t xml:space="preserve"> </w:t>
+      </w:r>
+      <w:r>
+        <w:t xml:space="preserve">Mesurer la diffusivité thermique effective dans le plan du laminé.</w:t>
+      </w:r>
+    </w:p>
+    <w:p>
+      <w:pPr>
+        <w:pStyle w:val="BodyText"/>
+      </w:pPr>
+      <w:r>
+        <w:rPr>
+          <w:b/>
+          <w:bCs/>
+        </w:rPr>
+        <w:t xml:space="preserve">Méthode.</w:t>
+      </w:r>
+      <w:r>
+        <w:t xml:space="preserve"> </w:t>
+      </w:r>
+      <w:r>
+        <w:t xml:space="preserve">Chauffer un seul spot. Placer 3 ou 4 thermocouples en ligne à distances</w:t>
+      </w:r>
+      <w:r>
+        <w:t xml:space="preserve"> </w:t>
+      </w:r>
+      <w:r>
+        <w:t xml:space="preserve">croissantes du centre du spot, à profondeur constante. Mesurer la décroissance latérale de</w:t>
+      </w:r>
+      <w:r>
+        <w:t xml:space="preserve"> </w:t>
+      </w:r>
+      <w:r>
+        <w:t xml:space="preserve">température. La longueur de décroissance donne la diffusivité effective dans le plan.</w:t>
+      </w:r>
+    </w:p>
+    <w:p>
+      <w:pPr>
+        <w:pStyle w:val="BodyText"/>
+      </w:pPr>
+      <w:r>
+        <w:rPr>
+          <w:b/>
+          <w:bCs/>
+        </w:rPr>
+        <w:t xml:space="preserve">Paramètre du modèle résolu.</w:t>
+      </w:r>
+      <w:r>
+        <w:t xml:space="preserve"> </w:t>
+      </w:r>
+      <w:r>
+        <w:t xml:space="preserve">La conductivité</w:t>
+      </w:r>
+      <w:r>
+        <w:t xml:space="preserve"> </w:t>
+      </w:r>
+      <w:r>
+        <w:rPr>
+          <w:rStyle w:val="VerbatimChar"/>
+        </w:rPr>
+        <w:t xml:space="preserve">k_plan</w:t>
+      </w:r>
+      <w:r>
+        <w:t xml:space="preserve">, utilisée à 3 W/m·K (valeur</w:t>
+      </w:r>
+      <w:r>
+        <w:t xml:space="preserve"> </w:t>
+      </w:r>
+      <w:r>
+        <w:t xml:space="preserve">homogénéisée) et marquée « incertain ».</w:t>
+      </w:r>
+    </w:p>
+    <w:p>
+      <w:pPr>
+        <w:pStyle w:val="BodyText"/>
+      </w:pPr>
+      <w:r>
+        <w:rPr>
+          <w:b/>
+          <w:bCs/>
+        </w:rPr>
+        <w:t xml:space="preserve">Gain attendu.</w:t>
+      </w:r>
+      <w:r>
+        <w:t xml:space="preserve"> </w:t>
+      </w:r>
+      <w:r>
+        <w:t xml:space="preserve">Transforme une propriété assumée en propriété vérifiée, et fixe une borne</w:t>
+      </w:r>
+      <w:r>
+        <w:t xml:space="preserve"> </w:t>
+      </w:r>
+      <w:r>
+        <w:t xml:space="preserve">sur l’étalement latéral que le modèle peut produire.</w:t>
+      </w:r>
+    </w:p>
+    <w:p>
+      <w:pPr>
+        <w:pStyle w:val="BodyText"/>
+      </w:pPr>
+      <w:r>
+        <w:rPr>
+          <w:b/>
+          <w:bCs/>
+        </w:rPr>
+        <w:t xml:space="preserve">Temps estimé.</w:t>
+      </w:r>
+      <w:r>
+        <w:t xml:space="preserve"> </w:t>
+      </w:r>
+      <w:r>
+        <w:t xml:space="preserve">Un essai de chauffe instrumenté en ligne.</w:t>
+      </w:r>
+    </w:p>
+    <w:p>
+      <w:pPr>
+        <w:pStyle w:val="BodyText"/>
+      </w:pPr>
+      <w:r>
+        <w:rPr>
+          <w:b/>
+          <w:bCs/>
+        </w:rPr>
+        <w:t xml:space="preserve">Réponse (utilisateur, 2026-07-27) :</w:t>
+      </w:r>
+      <w:r>
+        <w:t xml:space="preserve"> </w:t>
+      </w:r>
+      <w:r>
+        <w:t xml:space="preserve">« Expérience intéressante. Faut-il atteindre la Tfusion</w:t>
+      </w:r>
+      <w:r>
+        <w:t xml:space="preserve"> </w:t>
+      </w:r>
+      <w:r>
+        <w:t xml:space="preserve">du PEKK ? J’aimerais réutiliser mes échantillons. Quels ampérages sont intéressants pour</w:t>
+      </w:r>
+      <w:r>
+        <w:t xml:space="preserve"> </w:t>
+      </w:r>
+      <w:r>
+        <w:t xml:space="preserve">calibrer, et quel temps de maintien ? Idée : réaliser l’essai</w:t>
+      </w:r>
+      <w:r>
+        <w:t xml:space="preserve"> </w:t>
+      </w:r>
+      <w:r>
+        <w:rPr>
+          <w:b/>
+          <w:bCs/>
+        </w:rPr>
+        <w:t xml:space="preserve">sans le système de pression</w:t>
+      </w:r>
+      <w:r>
+        <w:t xml:space="preserve"> </w:t>
+      </w:r>
+      <w:r>
+        <w:t xml:space="preserve">et mettre une</w:t>
+      </w:r>
+      <w:r>
+        <w:t xml:space="preserve"> </w:t>
+      </w:r>
+      <w:r>
+        <w:rPr>
+          <w:b/>
+          <w:bCs/>
+        </w:rPr>
+        <w:t xml:space="preserve">caméra thermique au-dessus</w:t>
+      </w:r>
+      <w:r>
+        <w:t xml:space="preserve"> </w:t>
+      </w:r>
+      <w:r>
+        <w:t xml:space="preserve">de l’échantillon. Motivation : le modèle ne tient</w:t>
+      </w:r>
+      <w:r>
+        <w:t xml:space="preserve"> </w:t>
+      </w:r>
+      <w:r>
+        <w:t xml:space="preserve">compte ni de la pression ni de la céramique d’espacement. »</w:t>
+      </w:r>
+    </w:p>
+    <w:p>
+      <w:pPr>
+        <w:pStyle w:val="BlockText"/>
+      </w:pPr>
+      <w:r>
+        <w:t xml:space="preserve">→</w:t>
+      </w:r>
+      <w:r>
+        <w:t xml:space="preserve"> </w:t>
+      </w:r>
+      <w:r>
+        <w:rPr>
+          <w:b/>
+          <w:bCs/>
+        </w:rPr>
+        <w:t xml:space="preserve">Précisions.</w:t>
+      </w:r>
+      <w:r>
+        <w:t xml:space="preserve"> </w:t>
+      </w:r>
+      <w:r>
+        <w:t xml:space="preserve">-</w:t>
+      </w:r>
+      <w:r>
+        <w:t xml:space="preserve"> </w:t>
+      </w:r>
+      <w:r>
+        <w:rPr>
+          <w:b/>
+          <w:bCs/>
+        </w:rPr>
+        <w:t xml:space="preserve">Pas besoin d’atteindre Tf.</w:t>
+      </w:r>
+      <w:r>
+        <w:t xml:space="preserve"> </w:t>
+      </w:r>
+      <w:r>
+        <w:t xml:space="preserve">La diffusivité latérale se lit sur un simple gradient ;</w:t>
+      </w:r>
+      <w:r>
+        <w:t xml:space="preserve"> </w:t>
+      </w:r>
+      <w:r>
+        <w:t xml:space="preserve">reste bien sous 337 °C (pic ~150-250 °C) →</w:t>
+      </w:r>
+      <w:r>
+        <w:t xml:space="preserve"> </w:t>
+      </w:r>
+      <w:r>
+        <w:rPr>
+          <w:b/>
+          <w:bCs/>
+        </w:rPr>
+        <w:t xml:space="preserve">tu réutilises tes échantillons</w:t>
+      </w:r>
+      <w:r>
+        <w:t xml:space="preserve">.</w:t>
+      </w:r>
+      <w:r>
+        <w:t xml:space="preserve"> </w:t>
+      </w:r>
+      <w:r>
+        <w:t xml:space="preserve">-</w:t>
+      </w:r>
+      <w:r>
+        <w:t xml:space="preserve"> </w:t>
+      </w:r>
+      <w:r>
+        <w:rPr>
+          <w:b/>
+          <w:bCs/>
+        </w:rPr>
+        <w:t xml:space="preserve">Ampérages</w:t>
+      </w:r>
+      <w:r>
+        <w:t xml:space="preserve"> </w:t>
+      </w:r>
+      <w:r>
+        <w:t xml:space="preserve">: les mêmes que la calibration,</w:t>
+      </w:r>
+      <w:r>
+        <w:t xml:space="preserve"> </w:t>
+      </w:r>
+      <w:r>
+        <w:rPr>
+          <w:b/>
+          <w:bCs/>
+        </w:rPr>
+        <w:t xml:space="preserve">250 A et 200 A</w:t>
+      </w:r>
+      <w:r>
+        <w:t xml:space="preserve"> </w:t>
+      </w:r>
+      <w:r>
+        <w:t xml:space="preserve">(conditions A-1/A-3), pour</w:t>
+      </w:r>
+      <w:r>
+        <w:t xml:space="preserve"> </w:t>
+      </w:r>
+      <w:r>
+        <w:t xml:space="preserve">rester comparable au modèle. Un courant plus bas aide à rester sous Tf.</w:t>
+      </w:r>
+      <w:r>
+        <w:t xml:space="preserve"> </w:t>
+      </w:r>
+      <w:r>
+        <w:t xml:space="preserve">-</w:t>
+      </w:r>
+      <w:r>
+        <w:t xml:space="preserve"> </w:t>
+      </w:r>
+      <w:r>
+        <w:rPr>
+          <w:b/>
+          <w:bCs/>
+        </w:rPr>
+        <w:t xml:space="preserve">Temps de maintien</w:t>
+      </w:r>
+      <w:r>
+        <w:t xml:space="preserve"> </w:t>
+      </w:r>
+      <w:r>
+        <w:t xml:space="preserve">: quelques secondes à ~30 s suffisent ; c’est la</w:t>
+      </w:r>
+      <w:r>
+        <w:t xml:space="preserve"> </w:t>
+      </w:r>
+      <w:r>
+        <w:rPr>
+          <w:b/>
+          <w:bCs/>
+        </w:rPr>
+        <w:t xml:space="preserve">longueur de</w:t>
+      </w:r>
+      <w:r>
+        <w:rPr>
+          <w:b/>
+          <w:bCs/>
+        </w:rPr>
+        <w:t xml:space="preserve"> </w:t>
+      </w:r>
+      <w:r>
+        <w:rPr>
+          <w:b/>
+          <w:bCs/>
+        </w:rPr>
+        <w:t xml:space="preserve">décroissance latérale</w:t>
+      </w:r>
+      <w:r>
+        <w:t xml:space="preserve"> </w:t>
+      </w:r>
+      <w:r>
+        <w:t xml:space="preserve">pendant le transitoire qui porte l’information, pas un long plateau.</w:t>
+      </w:r>
+      <w:r>
+        <w:t xml:space="preserve"> </w:t>
+      </w:r>
+      <w:r>
+        <w:t xml:space="preserve">-</w:t>
+      </w:r>
+      <w:r>
+        <w:t xml:space="preserve"> </w:t>
+      </w:r>
+      <w:r>
+        <w:rPr>
+          <w:b/>
+          <w:bCs/>
+        </w:rPr>
+        <w:t xml:space="preserve">Caméra sans pression</w:t>
+      </w:r>
+      <w:r>
+        <w:t xml:space="preserve"> </w:t>
+      </w:r>
+      <w:r>
+        <w:t xml:space="preserve">: bonne idée, mais ⚠️</w:t>
+      </w:r>
+      <w:r>
+        <w:t xml:space="preserve"> </w:t>
+      </w:r>
+      <w:r>
+        <w:rPr>
+          <w:b/>
+          <w:bCs/>
+        </w:rPr>
+        <w:t xml:space="preserve">la caméra de dessus ne voit PAS</w:t>
+      </w:r>
+      <w:r>
+        <w:rPr>
+          <w:b/>
+          <w:bCs/>
+        </w:rPr>
+        <w:t xml:space="preserve"> </w:t>
+      </w:r>
+      <w:r>
+        <w:rPr>
+          <w:b/>
+          <w:bCs/>
+        </w:rPr>
+        <w:t xml:space="preserve">l’interface</w:t>
+      </w:r>
+      <w:r>
+        <w:t xml:space="preserve"> </w:t>
+      </w:r>
+      <w:r>
+        <w:t xml:space="preserve">— le CFC et la céramique la masquent, elle ne lirait que la surface du laminé</w:t>
+      </w:r>
+      <w:r>
+        <w:t xml:space="preserve"> </w:t>
+      </w:r>
+      <w:r>
+        <w:t xml:space="preserve">supérieur (M atténué par la diffusion dans l’épaisseur). Utile quand même (champ de surface,</w:t>
+      </w:r>
+      <w:r>
+        <w:t xml:space="preserve"> </w:t>
+      </w:r>
+      <w:r>
+        <w:t xml:space="preserve">et parfaite pour l’exp 8, face du CFC), mais l’interface exige des TC noyés.</w:t>
+      </w:r>
+      <w:r>
+        <w:t xml:space="preserve"> </w:t>
+      </w:r>
+      <w:r>
+        <w:t xml:space="preserve">- Le modèle ignore effectivement la</w:t>
+      </w:r>
+      <w:r>
+        <w:t xml:space="preserve"> </w:t>
+      </w:r>
+      <w:r>
+        <w:rPr>
+          <w:b/>
+          <w:bCs/>
+        </w:rPr>
+        <w:t xml:space="preserve">mécanique</w:t>
+      </w:r>
+      <w:r>
+        <w:t xml:space="preserve"> </w:t>
+      </w:r>
+      <w:r>
+        <w:t xml:space="preserve">de pression (son effet de contact est</w:t>
+      </w:r>
+      <w:r>
+        <w:t xml:space="preserve"> </w:t>
+      </w:r>
+      <w:r>
+        <w:t xml:space="preserve">absorbé dans</w:t>
+      </w:r>
+      <w:r>
+        <w:t xml:space="preserve"> </w:t>
+      </w:r>
+      <w:r>
+        <w:rPr>
+          <w:rStyle w:val="VerbatimChar"/>
+        </w:rPr>
+        <w:t xml:space="preserve">h_haut</w:t>
+      </w:r>
+      <w:r>
+        <w:t xml:space="preserve">) et traite la</w:t>
+      </w:r>
+      <w:r>
+        <w:t xml:space="preserve"> </w:t>
+      </w:r>
+      <w:r>
+        <w:rPr>
+          <w:b/>
+          <w:bCs/>
+        </w:rPr>
+        <w:t xml:space="preserve">céramique d’espacement</w:t>
+      </w:r>
+      <w:r>
+        <w:t xml:space="preserve"> </w:t>
+      </w:r>
+      <w:r>
+        <w:t xml:space="preserve">comme la condition limite</w:t>
+      </w:r>
+      <w:r>
+        <w:t xml:space="preserve"> </w:t>
+      </w:r>
+      <w:r>
+        <w:rPr>
+          <w:rStyle w:val="VerbatimChar"/>
+        </w:rPr>
+        <w:t xml:space="preserve">h_haut</w:t>
+      </w:r>
+      <w:r>
+        <w:t xml:space="preserve"> </w:t>
+      </w:r>
+      <w:r>
+        <w:t xml:space="preserve">(pas comme un solide résolu) : retirer la pression pour ce test est donc sans</w:t>
+      </w:r>
+      <w:r>
+        <w:t xml:space="preserve"> </w:t>
+      </w:r>
+      <w:r>
+        <w:t xml:space="preserve">conséquence sur la comparaison.</w:t>
+      </w:r>
+    </w:p>
     <w:bookmarkEnd w:id="14"/>
-    <w:bookmarkEnd w:id="15"/>
-    <w:bookmarkStart w:id="19" w:name="X050f80098886d27d0233576c23f921ac46bb86f"/>
-    <w:p>
-      <w:pPr>
-        <w:pStyle w:val="Heading2"/>
-      </w:pPr>
-      <w:r>
-        <w:t xml:space="preserve">Niveau 2. Expériences rapides (un essai chacune, même banc)</w:t>
-      </w:r>
-    </w:p>
-    <w:bookmarkStart w:id="16" w:name="X7b864b83b0bd743e51ddb75723b23c433aa888b"/>
-    <w:p>
-      <w:pPr>
-        <w:pStyle w:val="Heading3"/>
-      </w:pPr>
-      <w:r>
-        <w:t xml:space="preserve">Expérience 6. Cartographie latérale de la diffusivité dans le plan</w:t>
-      </w:r>
-    </w:p>
-    <w:p>
-      <w:pPr>
-        <w:pStyle w:val="BlockText"/>
-      </w:pPr>
-      <w:r>
-        <w:t xml:space="preserve">⚠</w:t>
-      </w:r>
-      <w:r>
-        <w:t xml:space="preserve"> </w:t>
-      </w:r>
-      <w:r>
-        <w:rPr>
-          <w:b/>
-          <w:bCs/>
-        </w:rPr>
-        <w:t xml:space="preserve">Priorité revue à la baisse le 24 juillet.</w:t>
-      </w:r>
-      <w:r>
-        <w:t xml:space="preserve"> </w:t>
-      </w:r>
-      <w:r>
-        <w:t xml:space="preserve">Cette expérience visait un</w:t>
-      </w:r>
-      <w:r>
-        <w:t xml:space="preserve"> </w:t>
-      </w:r>
-      <w:r>
-        <w:rPr>
-          <w:rStyle w:val="VerbatimChar"/>
-        </w:rPr>
-        <w:t xml:space="preserve">k_plan</w:t>
-      </w:r>
-      <w:r>
-        <w:t xml:space="preserve"> </w:t>
-      </w:r>
-      <w:r>
-        <w:t xml:space="preserve">de 6 à</w:t>
-      </w:r>
-      <w:r>
-        <w:t xml:space="preserve"> </w:t>
-      </w:r>
-      <w:r>
-        <w:t xml:space="preserve">9 W/m·K que la donnée semblait réclamer. Après correction de la géométrie de bobine, le</w:t>
-      </w:r>
-      <w:r>
-        <w:t xml:space="preserve"> </w:t>
-      </w:r>
-      <w:r>
-        <w:t xml:space="preserve">modèle s’accorde à</w:t>
-      </w:r>
-      <w:r>
-        <w:t xml:space="preserve"> </w:t>
-      </w:r>
-      <w:r>
-        <w:rPr>
-          <w:rStyle w:val="VerbatimChar"/>
-        </w:rPr>
-        <w:t xml:space="preserve">k_plan = 3 W/m·K</w:t>
-      </w:r>
-      <w:r>
-        <w:t xml:space="preserve">, la valeur homogénéisée physique, et un balayage</w:t>
-      </w:r>
-      <w:r>
-        <w:t xml:space="preserve"> </w:t>
-      </w:r>
-      <w:r>
-        <w:t xml:space="preserve">jusqu’à k = 6 ne corrige pas le résidu restant. La mesure garde sa valeur de</w:t>
-      </w:r>
-      <w:r>
-        <w:t xml:space="preserve"> </w:t>
-      </w:r>
-      <w:r>
-        <w:rPr>
-          <w:b/>
-          <w:bCs/>
-        </w:rPr>
-        <w:t xml:space="preserve">vérification</w:t>
-      </w:r>
-      <w:r>
-        <w:t xml:space="preserve"> </w:t>
-      </w:r>
-      <w:r>
-        <w:t xml:space="preserve">d’une propriété assumée, mais elle ne tranche plus un écart ouvert.</w:t>
-      </w:r>
-    </w:p>
-    <w:p>
-      <w:pPr>
-        <w:pStyle w:val="FirstParagraph"/>
-      </w:pPr>
-      <w:r>
-        <w:rPr>
-          <w:b/>
-          <w:bCs/>
-        </w:rPr>
-        <w:t xml:space="preserve">Objectif.</w:t>
-      </w:r>
-      <w:r>
-        <w:t xml:space="preserve"> </w:t>
-      </w:r>
-      <w:r>
-        <w:t xml:space="preserve">Mesurer la diffusivité thermique effective dans le plan du laminé.</w:t>
-      </w:r>
-    </w:p>
-    <w:p>
-      <w:pPr>
-        <w:pStyle w:val="BodyText"/>
-      </w:pPr>
-      <w:r>
-        <w:rPr>
-          <w:b/>
-          <w:bCs/>
-        </w:rPr>
-        <w:t xml:space="preserve">Méthode.</w:t>
-      </w:r>
-      <w:r>
-        <w:t xml:space="preserve"> </w:t>
-      </w:r>
-      <w:r>
-        <w:t xml:space="preserve">Chauffer un seul spot. Placer 3 ou 4 thermocouples en ligne à distances</w:t>
-      </w:r>
-      <w:r>
-        <w:t xml:space="preserve"> </w:t>
-      </w:r>
-      <w:r>
-        <w:t xml:space="preserve">croissantes du centre du spot, à profondeur constante. Mesurer la décroissance latérale de</w:t>
-      </w:r>
-      <w:r>
-        <w:t xml:space="preserve"> </w:t>
-      </w:r>
-      <w:r>
-        <w:t xml:space="preserve">température. La longueur de décroissance donne la diffusivité effective dans le plan.</w:t>
-      </w:r>
-    </w:p>
-    <w:p>
-      <w:pPr>
-        <w:pStyle w:val="BodyText"/>
-      </w:pPr>
-      <w:r>
-        <w:rPr>
-          <w:b/>
-          <w:bCs/>
-        </w:rPr>
-        <w:t xml:space="preserve">Paramètre du modèle résolu.</w:t>
-      </w:r>
-      <w:r>
-        <w:t xml:space="preserve"> </w:t>
-      </w:r>
-      <w:r>
-        <w:t xml:space="preserve">La conductivité</w:t>
-      </w:r>
-      <w:r>
-        <w:t xml:space="preserve"> </w:t>
-      </w:r>
-      <w:r>
-        <w:rPr>
-          <w:rStyle w:val="VerbatimChar"/>
-        </w:rPr>
-        <w:t xml:space="preserve">k_plan</w:t>
-      </w:r>
-      <w:r>
-        <w:t xml:space="preserve">, utilisée à 3 W/m·K (valeur</w:t>
-      </w:r>
-      <w:r>
-        <w:t xml:space="preserve"> </w:t>
-      </w:r>
-      <w:r>
-        <w:t xml:space="preserve">homogénéisée) et marquée « incertain ».</w:t>
-      </w:r>
-    </w:p>
-    <w:p>
-      <w:pPr>
-        <w:pStyle w:val="BodyText"/>
-      </w:pPr>
-      <w:r>
-        <w:rPr>
-          <w:b/>
-          <w:bCs/>
-        </w:rPr>
-        <w:t xml:space="preserve">Gain attendu.</w:t>
-      </w:r>
-      <w:r>
-        <w:t xml:space="preserve"> </w:t>
-      </w:r>
-      <w:r>
-        <w:t xml:space="preserve">Transforme une propriété assumée en propriété vérifiée, et fixe une borne</w:t>
-      </w:r>
-      <w:r>
-        <w:t xml:space="preserve"> </w:t>
-      </w:r>
-      <w:r>
-        <w:t xml:space="preserve">sur l’étalement latéral que le modèle peut produire.</w:t>
-      </w:r>
-    </w:p>
-    <w:p>
-      <w:pPr>
-        <w:pStyle w:val="BodyText"/>
-      </w:pPr>
-      <w:r>
-        <w:rPr>
-          <w:b/>
-          <w:bCs/>
-        </w:rPr>
-        <w:t xml:space="preserve">Temps estimé.</w:t>
-      </w:r>
-      <w:r>
-        <w:t xml:space="preserve"> </w:t>
-      </w:r>
-      <w:r>
-        <w:t xml:space="preserve">Un essai de chauffe instrumenté en ligne.</w:t>
-      </w:r>
-    </w:p>
-    <w:p>
-      <w:pPr>
-        <w:pStyle w:val="BodyText"/>
-      </w:pPr>
-      <w:r>
-        <w:rPr>
-          <w:b/>
-          <w:bCs/>
-        </w:rPr>
-        <w:t xml:space="preserve">Réponse (utilisateur, 2026-07-27) :</w:t>
-      </w:r>
-      <w:r>
-        <w:t xml:space="preserve"> </w:t>
-      </w:r>
-      <w:r>
-        <w:t xml:space="preserve">« Expérience intéressante. Faut-il atteindre la Tfusion</w:t>
-      </w:r>
-      <w:r>
-        <w:t xml:space="preserve"> </w:t>
-      </w:r>
-      <w:r>
-        <w:t xml:space="preserve">du PEKK ? J’aimerais réutiliser mes échantillons. Quels ampérages sont intéressants pour</w:t>
-      </w:r>
-      <w:r>
-        <w:t xml:space="preserve"> </w:t>
-      </w:r>
-      <w:r>
-        <w:t xml:space="preserve">calibrer, et quel temps de maintien ? Idée : réaliser l’essai</w:t>
-      </w:r>
-      <w:r>
-        <w:t xml:space="preserve"> </w:t>
-      </w:r>
-      <w:r>
-        <w:rPr>
-          <w:b/>
-          <w:bCs/>
-        </w:rPr>
-        <w:t xml:space="preserve">sans le système de pression</w:t>
-      </w:r>
-      <w:r>
-        <w:t xml:space="preserve"> </w:t>
-      </w:r>
-      <w:r>
-        <w:t xml:space="preserve">et mettre une</w:t>
-      </w:r>
-      <w:r>
-        <w:t xml:space="preserve"> </w:t>
-      </w:r>
-      <w:r>
-        <w:rPr>
-          <w:b/>
-          <w:bCs/>
-        </w:rPr>
-        <w:t xml:space="preserve">caméra thermique au-dessus</w:t>
-      </w:r>
-      <w:r>
-        <w:t xml:space="preserve"> </w:t>
-      </w:r>
-      <w:r>
-        <w:t xml:space="preserve">de l’échantillon. Motivation : le modèle ne tient</w:t>
-      </w:r>
-      <w:r>
-        <w:t xml:space="preserve"> </w:t>
-      </w:r>
-      <w:r>
-        <w:t xml:space="preserve">compte ni de la pression ni de la céramique d’espacement. »</w:t>
-      </w:r>
-    </w:p>
-    <w:p>
-      <w:pPr>
-        <w:pStyle w:val="BlockText"/>
-      </w:pPr>
-      <w:r>
-        <w:t xml:space="preserve">→</w:t>
-      </w:r>
-      <w:r>
-        <w:t xml:space="preserve"> </w:t>
-      </w:r>
-      <w:r>
-        <w:rPr>
-          <w:b/>
-          <w:bCs/>
-        </w:rPr>
-        <w:t xml:space="preserve">Précisions.</w:t>
-      </w:r>
-      <w:r>
-        <w:t xml:space="preserve"> </w:t>
-      </w:r>
-      <w:r>
-        <w:t xml:space="preserve">-</w:t>
-      </w:r>
-      <w:r>
-        <w:t xml:space="preserve"> </w:t>
-      </w:r>
-      <w:r>
-        <w:rPr>
-          <w:b/>
-          <w:bCs/>
-        </w:rPr>
-        <w:t xml:space="preserve">Pas besoin d’atteindre Tf.</w:t>
-      </w:r>
-      <w:r>
-        <w:t xml:space="preserve"> </w:t>
-      </w:r>
-      <w:r>
-        <w:t xml:space="preserve">La diffusivité latérale se lit sur un simple gradient ;</w:t>
-      </w:r>
-      <w:r>
-        <w:t xml:space="preserve"> </w:t>
-      </w:r>
-      <w:r>
-        <w:t xml:space="preserve">reste bien sous 337 °C (pic ~150-250 °C) →</w:t>
-      </w:r>
-      <w:r>
-        <w:t xml:space="preserve"> </w:t>
-      </w:r>
-      <w:r>
-        <w:rPr>
-          <w:b/>
-          <w:bCs/>
-        </w:rPr>
-        <w:t xml:space="preserve">tu réutilises tes échantillons</w:t>
-      </w:r>
-      <w:r>
-        <w:t xml:space="preserve">.</w:t>
-      </w:r>
-      <w:r>
-        <w:t xml:space="preserve"> </w:t>
-      </w:r>
-      <w:r>
-        <w:t xml:space="preserve">-</w:t>
-      </w:r>
-      <w:r>
-        <w:t xml:space="preserve"> </w:t>
-      </w:r>
-      <w:r>
-        <w:rPr>
-          <w:b/>
-          <w:bCs/>
-        </w:rPr>
-        <w:t xml:space="preserve">Ampérages</w:t>
-      </w:r>
-      <w:r>
-        <w:t xml:space="preserve"> </w:t>
-      </w:r>
-      <w:r>
-        <w:t xml:space="preserve">: les mêmes que la calibration,</w:t>
-      </w:r>
-      <w:r>
-        <w:t xml:space="preserve"> </w:t>
-      </w:r>
-      <w:r>
-        <w:rPr>
-          <w:b/>
-          <w:bCs/>
-        </w:rPr>
-        <w:t xml:space="preserve">250 A et 200 A</w:t>
-      </w:r>
-      <w:r>
-        <w:t xml:space="preserve"> </w:t>
-      </w:r>
-      <w:r>
-        <w:t xml:space="preserve">(conditions A-1/A-3), pour</w:t>
-      </w:r>
-      <w:r>
-        <w:t xml:space="preserve"> </w:t>
-      </w:r>
-      <w:r>
-        <w:t xml:space="preserve">rester comparable au modèle. Un courant plus bas aide à rester sous Tf.</w:t>
-      </w:r>
-      <w:r>
-        <w:t xml:space="preserve"> </w:t>
-      </w:r>
-      <w:r>
-        <w:t xml:space="preserve">-</w:t>
-      </w:r>
-      <w:r>
-        <w:t xml:space="preserve"> </w:t>
-      </w:r>
-      <w:r>
-        <w:rPr>
-          <w:b/>
-          <w:bCs/>
-        </w:rPr>
-        <w:t xml:space="preserve">Temps de maintien</w:t>
-      </w:r>
-      <w:r>
-        <w:t xml:space="preserve"> </w:t>
-      </w:r>
-      <w:r>
-        <w:t xml:space="preserve">: quelques secondes à ~30 s suffisent ; c’est la</w:t>
-      </w:r>
-      <w:r>
-        <w:t xml:space="preserve"> </w:t>
-      </w:r>
-      <w:r>
-        <w:rPr>
-          <w:b/>
-          <w:bCs/>
-        </w:rPr>
-        <w:t xml:space="preserve">longueur de</w:t>
-      </w:r>
-      <w:r>
-        <w:rPr>
-          <w:b/>
-          <w:bCs/>
-        </w:rPr>
-        <w:t xml:space="preserve"> </w:t>
-      </w:r>
-      <w:r>
-        <w:rPr>
-          <w:b/>
-          <w:bCs/>
-        </w:rPr>
-        <w:t xml:space="preserve">décroissance latérale</w:t>
-      </w:r>
-      <w:r>
-        <w:t xml:space="preserve"> </w:t>
-      </w:r>
-      <w:r>
-        <w:t xml:space="preserve">pendant le transitoire qui porte l’information, pas un long plateau.</w:t>
-      </w:r>
-      <w:r>
-        <w:t xml:space="preserve"> </w:t>
-      </w:r>
-      <w:r>
-        <w:t xml:space="preserve">-</w:t>
-      </w:r>
-      <w:r>
-        <w:t xml:space="preserve"> </w:t>
-      </w:r>
-      <w:r>
-        <w:rPr>
-          <w:b/>
-          <w:bCs/>
-        </w:rPr>
-        <w:t xml:space="preserve">Caméra sans pression</w:t>
-      </w:r>
-      <w:r>
-        <w:t xml:space="preserve"> </w:t>
-      </w:r>
-      <w:r>
-        <w:t xml:space="preserve">: bonne idée, mais ⚠️</w:t>
-      </w:r>
-      <w:r>
-        <w:t xml:space="preserve"> </w:t>
-      </w:r>
-      <w:r>
-        <w:rPr>
-          <w:b/>
-          <w:bCs/>
-        </w:rPr>
-        <w:t xml:space="preserve">la caméra de dessus ne voit PAS</w:t>
-      </w:r>
-      <w:r>
-        <w:rPr>
-          <w:b/>
-          <w:bCs/>
-        </w:rPr>
-        <w:t xml:space="preserve"> </w:t>
-      </w:r>
-      <w:r>
-        <w:rPr>
-          <w:b/>
-          <w:bCs/>
-        </w:rPr>
-        <w:t xml:space="preserve">l’interface</w:t>
-      </w:r>
-      <w:r>
-        <w:t xml:space="preserve"> </w:t>
-      </w:r>
-      <w:r>
-        <w:t xml:space="preserve">— le CFC et la céramique la masquent, elle ne lirait que la surface du laminé</w:t>
-      </w:r>
-      <w:r>
-        <w:t xml:space="preserve"> </w:t>
-      </w:r>
-      <w:r>
-        <w:t xml:space="preserve">supérieur (M atténué par la diffusion dans l’épaisseur). Utile quand même (champ de surface,</w:t>
-      </w:r>
-      <w:r>
-        <w:t xml:space="preserve"> </w:t>
-      </w:r>
-      <w:r>
-        <w:t xml:space="preserve">et parfaite pour l’exp 8, face du CFC), mais l’interface exige des TC noyés.</w:t>
-      </w:r>
-      <w:r>
-        <w:t xml:space="preserve"> </w:t>
-      </w:r>
-      <w:r>
-        <w:t xml:space="preserve">- Le modèle ignore effectivement la</w:t>
-      </w:r>
-      <w:r>
-        <w:t xml:space="preserve"> </w:t>
-      </w:r>
-      <w:r>
-        <w:rPr>
-          <w:b/>
-          <w:bCs/>
-        </w:rPr>
-        <w:t xml:space="preserve">mécanique</w:t>
-      </w:r>
-      <w:r>
-        <w:t xml:space="preserve"> </w:t>
-      </w:r>
-      <w:r>
-        <w:t xml:space="preserve">de pression (son effet de contact est</w:t>
-      </w:r>
-      <w:r>
-        <w:t xml:space="preserve"> </w:t>
-      </w:r>
-      <w:r>
-        <w:t xml:space="preserve">absorbé dans</w:t>
-      </w:r>
-      <w:r>
-        <w:t xml:space="preserve"> </w:t>
-      </w:r>
-      <w:r>
-        <w:rPr>
-          <w:rStyle w:val="VerbatimChar"/>
-        </w:rPr>
-        <w:t xml:space="preserve">h_haut</w:t>
-      </w:r>
-      <w:r>
-        <w:t xml:space="preserve">) et traite la</w:t>
-      </w:r>
-      <w:r>
-        <w:t xml:space="preserve"> </w:t>
-      </w:r>
-      <w:r>
-        <w:rPr>
-          <w:b/>
-          <w:bCs/>
-        </w:rPr>
-        <w:t xml:space="preserve">céramique d’espacement</w:t>
-      </w:r>
-      <w:r>
-        <w:t xml:space="preserve"> </w:t>
-      </w:r>
-      <w:r>
-        <w:t xml:space="preserve">comme la condition limite</w:t>
-      </w:r>
-      <w:r>
-        <w:t xml:space="preserve"> </w:t>
-      </w:r>
-      <w:r>
-        <w:rPr>
-          <w:rStyle w:val="VerbatimChar"/>
-        </w:rPr>
-        <w:t xml:space="preserve">h_haut</w:t>
-      </w:r>
-      <w:r>
-        <w:t xml:space="preserve"> </w:t>
-      </w:r>
-      <w:r>
-        <w:t xml:space="preserve">(pas comme un solide résolu) : retirer la pression pour ce test est donc sans</w:t>
-      </w:r>
-      <w:r>
-        <w:t xml:space="preserve"> </w:t>
-      </w:r>
-      <w:r>
-        <w:t xml:space="preserve">conséquence sur la comparaison.</w:t>
-      </w:r>
-    </w:p>
-    <w:bookmarkEnd w:id="16"/>
-    <w:bookmarkStart w:id="17" w:name="X8d23be7ef90e71b4632fda43cede6943294545c"/>
+    <w:bookmarkStart w:id="15" w:name="X8d23be7ef90e71b4632fda43cede6943294545c"/>
     <w:p>
       <w:pPr>
         <w:pStyle w:val="Heading3"/>
@@ -3187,8 +2370,8 @@
         <w:t xml:space="preserve">falsifier la cible chiffrée ci-dessus.</w:t>
       </w:r>
     </w:p>
-    <w:bookmarkEnd w:id="17"/>
-    <w:bookmarkStart w:id="18" w:name="X3c1cdae2de844c3576b3855646d50728992e02e"/>
+    <w:bookmarkEnd w:id="15"/>
+    <w:bookmarkStart w:id="16" w:name="X3c1cdae2de844c3576b3855646d50728992e02e"/>
     <w:p>
       <w:pPr>
         <w:pStyle w:val="Heading3"/>
@@ -3378,309 +2561,309 @@
         </w:pict>
       </w:r>
     </w:p>
+    <w:bookmarkEnd w:id="16"/>
+    <w:bookmarkEnd w:id="17"/>
+    <w:bookmarkStart w:id="20" w:name="Xbd611265407e50f203bfabccbfdafc710a5ac1e"/>
+    <w:p>
+      <w:pPr>
+        <w:pStyle w:val="Heading2"/>
+      </w:pPr>
+      <w:r>
+        <w:t xml:space="preserve">Niveau 3. Mesures de propriété (appareil de laboratoire)</w:t>
+      </w:r>
+    </w:p>
+    <w:bookmarkStart w:id="18" w:name="X65c8a4b8084d57e4184b75723c3c30610e8e8a5"/>
+    <w:p>
+      <w:pPr>
+        <w:pStyle w:val="Heading3"/>
+      </w:pPr>
+      <w:r>
+        <w:t xml:space="preserve">Mesure 9. Conductivité thermique dans le plan du laminé</w:t>
+      </w:r>
+    </w:p>
+    <w:p>
+      <w:pPr>
+        <w:pStyle w:val="FirstParagraph"/>
+      </w:pPr>
+      <w:r>
+        <w:rPr>
+          <w:b/>
+          <w:bCs/>
+        </w:rPr>
+        <w:t xml:space="preserve">Objectif.</w:t>
+      </w:r>
+      <w:r>
+        <w:t xml:space="preserve"> </w:t>
+      </w:r>
+      <w:r>
+        <w:t xml:space="preserve">Mesurer directement la conductivité thermique dans le plan du CF/PEKK.</w:t>
+      </w:r>
+    </w:p>
+    <w:p>
+      <w:pPr>
+        <w:pStyle w:val="BodyText"/>
+      </w:pPr>
+      <w:r>
+        <w:rPr>
+          <w:b/>
+          <w:bCs/>
+        </w:rPr>
+        <w:t xml:space="preserve">Méthode.</w:t>
+      </w:r>
+      <w:r>
+        <w:t xml:space="preserve"> </w:t>
+      </w:r>
+      <w:r>
+        <w:t xml:space="preserve">Flash laser ou disque chaud (hot-disk) sur un échantillon de laminé.</w:t>
+      </w:r>
+    </w:p>
+    <w:p>
+      <w:pPr>
+        <w:pStyle w:val="BodyText"/>
+      </w:pPr>
+      <w:r>
+        <w:rPr>
+          <w:b/>
+          <w:bCs/>
+        </w:rPr>
+        <w:t xml:space="preserve">Paramètre du modèle résolu.</w:t>
+      </w:r>
+      <w:r>
+        <w:t xml:space="preserve"> </w:t>
+      </w:r>
+      <w:r>
+        <w:t xml:space="preserve">La conductivité</w:t>
+      </w:r>
+      <w:r>
+        <w:t xml:space="preserve"> </w:t>
+      </w:r>
+      <w:r>
+        <w:rPr>
+          <w:rStyle w:val="VerbatimChar"/>
+        </w:rPr>
+        <w:t xml:space="preserve">k_plan</w:t>
+      </w:r>
+      <w:r>
+        <w:t xml:space="preserve">, la même que l’expérience 6 attaque</w:t>
+      </w:r>
+      <w:r>
+        <w:t xml:space="preserve"> </w:t>
+      </w:r>
+      <w:r>
+        <w:t xml:space="preserve">sur le banc.</w:t>
+      </w:r>
+    </w:p>
+    <w:p>
+      <w:pPr>
+        <w:pStyle w:val="BodyText"/>
+      </w:pPr>
+      <w:r>
+        <w:rPr>
+          <w:b/>
+          <w:bCs/>
+        </w:rPr>
+        <w:t xml:space="preserve">Gain attendu.</w:t>
+      </w:r>
+      <w:r>
+        <w:t xml:space="preserve"> </w:t>
+      </w:r>
+      <w:r>
+        <w:t xml:space="preserve">Transforme un</w:t>
+      </w:r>
+      <w:r>
+        <w:t xml:space="preserve"> </w:t>
+      </w:r>
+      <w:r>
+        <w:rPr>
+          <w:rStyle w:val="VerbatimChar"/>
+        </w:rPr>
+        <w:t xml:space="preserve">k_plan</w:t>
+      </w:r>
+      <w:r>
+        <w:t xml:space="preserve"> </w:t>
+      </w:r>
+      <w:r>
+        <w:t xml:space="preserve">assumé en propriété sourcée. L’écart d’un facteur 3</w:t>
+      </w:r>
+      <w:r>
+        <w:t xml:space="preserve"> </w:t>
+      </w:r>
+      <w:r>
+        <w:t xml:space="preserve">qui semblait requis le 23 juillet au matin ne l’est plus (voir l’encadré de tête), mais la</w:t>
+      </w:r>
+      <w:r>
+        <w:t xml:space="preserve"> </w:t>
+      </w:r>
+      <w:r>
+        <w:t xml:space="preserve">valeur homogénéisée de 3 W/m·K reste, elle, non vérifiée expérimentalement.</w:t>
+      </w:r>
+    </w:p>
+    <w:p>
+      <w:pPr>
+        <w:pStyle w:val="BodyText"/>
+      </w:pPr>
+      <w:r>
+        <w:rPr>
+          <w:b/>
+          <w:bCs/>
+        </w:rPr>
+        <w:t xml:space="preserve">Temps estimé.</w:t>
+      </w:r>
+      <w:r>
+        <w:t xml:space="preserve"> </w:t>
+      </w:r>
+      <w:r>
+        <w:t xml:space="preserve">Préparation d’échantillon plus appareil dédié. L’expérience 6 en est le</w:t>
+      </w:r>
+      <w:r>
+        <w:t xml:space="preserve"> </w:t>
+      </w:r>
+      <w:r>
+        <w:t xml:space="preserve">substitut rapide sur le banc du laboratoire.</w:t>
+      </w:r>
+    </w:p>
+    <w:p>
+      <w:pPr>
+        <w:pStyle w:val="BodyText"/>
+      </w:pPr>
+      <w:r>
+        <w:rPr>
+          <w:b/>
+          <w:bCs/>
+        </w:rPr>
+        <w:t xml:space="preserve">Réponse (utilisateur, 2026-07-27) :</w:t>
+      </w:r>
+      <w:r>
+        <w:t xml:space="preserve"> </w:t>
+      </w:r>
+      <w:r>
+        <w:t xml:space="preserve">« J’ai pas compris cette expérience. »</w:t>
+      </w:r>
+    </w:p>
+    <w:p>
+      <w:pPr>
+        <w:pStyle w:val="BlockText"/>
+      </w:pPr>
+      <w:r>
+        <w:t xml:space="preserve">→</w:t>
+      </w:r>
+      <w:r>
+        <w:t xml:space="preserve"> </w:t>
+      </w:r>
+      <w:r>
+        <w:rPr>
+          <w:b/>
+          <w:bCs/>
+        </w:rPr>
+        <w:t xml:space="preserve">Précision.</w:t>
+      </w:r>
+      <w:r>
+        <w:t xml:space="preserve"> </w:t>
+      </w:r>
+      <w:r>
+        <w:t xml:space="preserve">C’est une mesure d’</w:t>
+      </w:r>
+      <w:r>
+        <w:rPr>
+          <w:b/>
+          <w:bCs/>
+        </w:rPr>
+        <w:t xml:space="preserve">appareil de labo</w:t>
+      </w:r>
+      <w:r>
+        <w:t xml:space="preserve"> </w:t>
+      </w:r>
+      <w:r>
+        <w:t xml:space="preserve">(hot-disk ou flash laser), pas sur</w:t>
+      </w:r>
+      <w:r>
+        <w:t xml:space="preserve"> </w:t>
+      </w:r>
+      <w:r>
+        <w:t xml:space="preserve">le banc de soudage : on dépose une impulsion de chaleur sur un petit</w:t>
+      </w:r>
+      <w:r>
+        <w:t xml:space="preserve"> </w:t>
+      </w:r>
+      <w:r>
+        <w:rPr>
+          <w:b/>
+          <w:bCs/>
+        </w:rPr>
+        <w:t xml:space="preserve">échantillon de</w:t>
+      </w:r>
+      <w:r>
+        <w:rPr>
+          <w:b/>
+          <w:bCs/>
+        </w:rPr>
+        <w:t xml:space="preserve"> </w:t>
+      </w:r>
+      <w:r>
+        <w:rPr>
+          <w:b/>
+          <w:bCs/>
+        </w:rPr>
+        <w:t xml:space="preserve">matière</w:t>
+      </w:r>
+      <w:r>
+        <w:t xml:space="preserve"> </w:t>
+      </w:r>
+      <w:r>
+        <w:t xml:space="preserve">et on chronomètre sa vitesse d’étalement → on en déduit la conductivité thermique</w:t>
+      </w:r>
+      <w:r>
+        <w:t xml:space="preserve"> </w:t>
+      </w:r>
+      <w:r>
+        <w:t xml:space="preserve">dans le plan</w:t>
+      </w:r>
+      <w:r>
+        <w:t xml:space="preserve"> </w:t>
+      </w:r>
+      <w:r>
+        <w:rPr>
+          <w:rStyle w:val="VerbatimChar"/>
+        </w:rPr>
+        <w:t xml:space="preserve">k_plan</w:t>
+      </w:r>
+      <w:r>
+        <w:t xml:space="preserve">. L’</w:t>
+      </w:r>
+      <w:r>
+        <w:rPr>
+          <w:b/>
+          <w:bCs/>
+        </w:rPr>
+        <w:t xml:space="preserve">expérience 6</w:t>
+      </w:r>
+      <w:r>
+        <w:t xml:space="preserve"> </w:t>
+      </w:r>
+      <w:r>
+        <w:t xml:space="preserve">(spot + TC en ligne sur le banc) en est le</w:t>
+      </w:r>
+      <w:r>
+        <w:t xml:space="preserve"> </w:t>
+      </w:r>
+      <w:r>
+        <w:t xml:space="preserve">substitut « maison ». Non prioritaire : sers-toi de l’exp 6 si tu veux vérifier</w:t>
+      </w:r>
+      <w:r>
+        <w:t xml:space="preserve"> </w:t>
+      </w:r>
+      <w:r>
+        <w:rPr>
+          <w:rStyle w:val="VerbatimChar"/>
+        </w:rPr>
+        <w:t xml:space="preserve">k_plan</w:t>
+      </w:r>
+      <w:r>
+        <w:t xml:space="preserve">.</w:t>
+      </w:r>
+    </w:p>
     <w:bookmarkEnd w:id="18"/>
-    <w:bookmarkEnd w:id="19"/>
-    <w:bookmarkStart w:id="22" w:name="Xbd611265407e50f203bfabccbfdafc710a5ac1e"/>
-    <w:p>
-      <w:pPr>
-        <w:pStyle w:val="Heading2"/>
-      </w:pPr>
-      <w:r>
-        <w:t xml:space="preserve">Niveau 3. Mesures de propriété (appareil de laboratoire)</w:t>
-      </w:r>
-    </w:p>
-    <w:bookmarkStart w:id="20" w:name="X65c8a4b8084d57e4184b75723c3c30610e8e8a5"/>
-    <w:p>
-      <w:pPr>
-        <w:pStyle w:val="Heading3"/>
-      </w:pPr>
-      <w:r>
-        <w:t xml:space="preserve">Mesure 9. Conductivité thermique dans le plan du laminé</w:t>
-      </w:r>
-    </w:p>
-    <w:p>
-      <w:pPr>
-        <w:pStyle w:val="FirstParagraph"/>
-      </w:pPr>
-      <w:r>
-        <w:rPr>
-          <w:b/>
-          <w:bCs/>
-        </w:rPr>
-        <w:t xml:space="preserve">Objectif.</w:t>
-      </w:r>
-      <w:r>
-        <w:t xml:space="preserve"> </w:t>
-      </w:r>
-      <w:r>
-        <w:t xml:space="preserve">Mesurer directement la conductivité thermique dans le plan du CF/PEKK.</w:t>
-      </w:r>
-    </w:p>
-    <w:p>
-      <w:pPr>
-        <w:pStyle w:val="BodyText"/>
-      </w:pPr>
-      <w:r>
-        <w:rPr>
-          <w:b/>
-          <w:bCs/>
-        </w:rPr>
-        <w:t xml:space="preserve">Méthode.</w:t>
-      </w:r>
-      <w:r>
-        <w:t xml:space="preserve"> </w:t>
-      </w:r>
-      <w:r>
-        <w:t xml:space="preserve">Flash laser ou disque chaud (hot-disk) sur un échantillon de laminé.</w:t>
-      </w:r>
-    </w:p>
-    <w:p>
-      <w:pPr>
-        <w:pStyle w:val="BodyText"/>
-      </w:pPr>
-      <w:r>
-        <w:rPr>
-          <w:b/>
-          <w:bCs/>
-        </w:rPr>
-        <w:t xml:space="preserve">Paramètre du modèle résolu.</w:t>
-      </w:r>
-      <w:r>
-        <w:t xml:space="preserve"> </w:t>
-      </w:r>
-      <w:r>
-        <w:t xml:space="preserve">La conductivité</w:t>
-      </w:r>
-      <w:r>
-        <w:t xml:space="preserve"> </w:t>
-      </w:r>
-      <w:r>
-        <w:rPr>
-          <w:rStyle w:val="VerbatimChar"/>
-        </w:rPr>
-        <w:t xml:space="preserve">k_plan</w:t>
-      </w:r>
-      <w:r>
-        <w:t xml:space="preserve">, la même que l’expérience 6 attaque</w:t>
-      </w:r>
-      <w:r>
-        <w:t xml:space="preserve"> </w:t>
-      </w:r>
-      <w:r>
-        <w:t xml:space="preserve">sur le banc.</w:t>
-      </w:r>
-    </w:p>
-    <w:p>
-      <w:pPr>
-        <w:pStyle w:val="BodyText"/>
-      </w:pPr>
-      <w:r>
-        <w:rPr>
-          <w:b/>
-          <w:bCs/>
-        </w:rPr>
-        <w:t xml:space="preserve">Gain attendu.</w:t>
-      </w:r>
-      <w:r>
-        <w:t xml:space="preserve"> </w:t>
-      </w:r>
-      <w:r>
-        <w:t xml:space="preserve">Transforme un</w:t>
-      </w:r>
-      <w:r>
-        <w:t xml:space="preserve"> </w:t>
-      </w:r>
-      <w:r>
-        <w:rPr>
-          <w:rStyle w:val="VerbatimChar"/>
-        </w:rPr>
-        <w:t xml:space="preserve">k_plan</w:t>
-      </w:r>
-      <w:r>
-        <w:t xml:space="preserve"> </w:t>
-      </w:r>
-      <w:r>
-        <w:t xml:space="preserve">assumé en propriété sourcée. L’écart d’un facteur 3</w:t>
-      </w:r>
-      <w:r>
-        <w:t xml:space="preserve"> </w:t>
-      </w:r>
-      <w:r>
-        <w:t xml:space="preserve">qui semblait requis le 23 juillet au matin ne l’est plus (voir l’encadré de tête), mais la</w:t>
-      </w:r>
-      <w:r>
-        <w:t xml:space="preserve"> </w:t>
-      </w:r>
-      <w:r>
-        <w:t xml:space="preserve">valeur homogénéisée de 3 W/m·K reste, elle, non vérifiée expérimentalement.</w:t>
-      </w:r>
-    </w:p>
-    <w:p>
-      <w:pPr>
-        <w:pStyle w:val="BodyText"/>
-      </w:pPr>
-      <w:r>
-        <w:rPr>
-          <w:b/>
-          <w:bCs/>
-        </w:rPr>
-        <w:t xml:space="preserve">Temps estimé.</w:t>
-      </w:r>
-      <w:r>
-        <w:t xml:space="preserve"> </w:t>
-      </w:r>
-      <w:r>
-        <w:t xml:space="preserve">Préparation d’échantillon plus appareil dédié. L’expérience 6 en est le</w:t>
-      </w:r>
-      <w:r>
-        <w:t xml:space="preserve"> </w:t>
-      </w:r>
-      <w:r>
-        <w:t xml:space="preserve">substitut rapide sur le banc du laboratoire.</w:t>
-      </w:r>
-    </w:p>
-    <w:p>
-      <w:pPr>
-        <w:pStyle w:val="BodyText"/>
-      </w:pPr>
-      <w:r>
-        <w:rPr>
-          <w:b/>
-          <w:bCs/>
-        </w:rPr>
-        <w:t xml:space="preserve">Réponse (utilisateur, 2026-07-27) :</w:t>
-      </w:r>
-      <w:r>
-        <w:t xml:space="preserve"> </w:t>
-      </w:r>
-      <w:r>
-        <w:t xml:space="preserve">« J’ai pas compris cette expérience. »</w:t>
-      </w:r>
-    </w:p>
-    <w:p>
-      <w:pPr>
-        <w:pStyle w:val="BlockText"/>
-      </w:pPr>
-      <w:r>
-        <w:t xml:space="preserve">→</w:t>
-      </w:r>
-      <w:r>
-        <w:t xml:space="preserve"> </w:t>
-      </w:r>
-      <w:r>
-        <w:rPr>
-          <w:b/>
-          <w:bCs/>
-        </w:rPr>
-        <w:t xml:space="preserve">Précision.</w:t>
-      </w:r>
-      <w:r>
-        <w:t xml:space="preserve"> </w:t>
-      </w:r>
-      <w:r>
-        <w:t xml:space="preserve">C’est une mesure d’</w:t>
-      </w:r>
-      <w:r>
-        <w:rPr>
-          <w:b/>
-          <w:bCs/>
-        </w:rPr>
-        <w:t xml:space="preserve">appareil de labo</w:t>
-      </w:r>
-      <w:r>
-        <w:t xml:space="preserve"> </w:t>
-      </w:r>
-      <w:r>
-        <w:t xml:space="preserve">(hot-disk ou flash laser), pas sur</w:t>
-      </w:r>
-      <w:r>
-        <w:t xml:space="preserve"> </w:t>
-      </w:r>
-      <w:r>
-        <w:t xml:space="preserve">le banc de soudage : on dépose une impulsion de chaleur sur un petit</w:t>
-      </w:r>
-      <w:r>
-        <w:t xml:space="preserve"> </w:t>
-      </w:r>
-      <w:r>
-        <w:rPr>
-          <w:b/>
-          <w:bCs/>
-        </w:rPr>
-        <w:t xml:space="preserve">échantillon de</w:t>
-      </w:r>
-      <w:r>
-        <w:rPr>
-          <w:b/>
-          <w:bCs/>
-        </w:rPr>
-        <w:t xml:space="preserve"> </w:t>
-      </w:r>
-      <w:r>
-        <w:rPr>
-          <w:b/>
-          <w:bCs/>
-        </w:rPr>
-        <w:t xml:space="preserve">matière</w:t>
-      </w:r>
-      <w:r>
-        <w:t xml:space="preserve"> </w:t>
-      </w:r>
-      <w:r>
-        <w:t xml:space="preserve">et on chronomètre sa vitesse d’étalement → on en déduit la conductivité thermique</w:t>
-      </w:r>
-      <w:r>
-        <w:t xml:space="preserve"> </w:t>
-      </w:r>
-      <w:r>
-        <w:t xml:space="preserve">dans le plan</w:t>
-      </w:r>
-      <w:r>
-        <w:t xml:space="preserve"> </w:t>
-      </w:r>
-      <w:r>
-        <w:rPr>
-          <w:rStyle w:val="VerbatimChar"/>
-        </w:rPr>
-        <w:t xml:space="preserve">k_plan</w:t>
-      </w:r>
-      <w:r>
-        <w:t xml:space="preserve">. L’</w:t>
-      </w:r>
-      <w:r>
-        <w:rPr>
-          <w:b/>
-          <w:bCs/>
-        </w:rPr>
-        <w:t xml:space="preserve">expérience 6</w:t>
-      </w:r>
-      <w:r>
-        <w:t xml:space="preserve"> </w:t>
-      </w:r>
-      <w:r>
-        <w:t xml:space="preserve">(spot + TC en ligne sur le banc) en est le</w:t>
-      </w:r>
-      <w:r>
-        <w:t xml:space="preserve"> </w:t>
-      </w:r>
-      <w:r>
-        <w:t xml:space="preserve">substitut « maison ». Non prioritaire : sers-toi de l’exp 6 si tu veux vérifier</w:t>
-      </w:r>
-      <w:r>
-        <w:t xml:space="preserve"> </w:t>
-      </w:r>
-      <w:r>
-        <w:rPr>
-          <w:rStyle w:val="VerbatimChar"/>
-        </w:rPr>
-        <w:t xml:space="preserve">k_plan</w:t>
-      </w:r>
-      <w:r>
-        <w:t xml:space="preserve">.</w:t>
-      </w:r>
-    </w:p>
-    <w:bookmarkEnd w:id="20"/>
-    <w:bookmarkStart w:id="21" w:name="Xbcbfbd036e1830f701e3e206f87ccdb9e70e470"/>
+    <w:bookmarkStart w:id="19" w:name="Xbcbfbd036e1830f701e3e206f87ccdb9e70e470"/>
     <w:p>
       <w:pPr>
         <w:pStyle w:val="Heading3"/>
@@ -3908,9 +3091,9 @@
         </w:pict>
       </w:r>
     </w:p>
-    <w:bookmarkEnd w:id="21"/>
-    <w:bookmarkEnd w:id="22"/>
-    <w:bookmarkStart w:id="23" w:name="recommandation"/>
+    <w:bookmarkEnd w:id="19"/>
+    <w:bookmarkEnd w:id="20"/>
+    <w:bookmarkStart w:id="21" w:name="recommandation"/>
     <w:p>
       <w:pPr>
         <w:pStyle w:val="Heading2"/>
@@ -4084,8 +3267,8 @@
         </w:pict>
       </w:r>
     </w:p>
-    <w:bookmarkEnd w:id="23"/>
-    <w:bookmarkStart w:id="24" w:name="tableau-de-synthèse"/>
+    <w:bookmarkEnd w:id="21"/>
+    <w:bookmarkStart w:id="22" w:name="tableau-de-synthèse"/>
     <w:p>
       <w:pPr>
         <w:pStyle w:val="Heading2"/>
@@ -4827,7 +4010,7 @@
         </w:tc>
       </w:tr>
     </w:tbl>
-    <w:bookmarkEnd w:id="24"/>
+    <w:bookmarkEnd w:id="22"/>
     <w:sectPr>
       <w:footnotePr>
         <w:numRestart w:val="eachSect"/>

</xml_diff>

<commit_message>
Add camera protocol to exp 6 (lateral diffusivity) fiche
Reporte le protocole discuté (2026-07-27) dans la fiche exp 6 : caméra thermique
de dessus pour la décroissance en longueur (x) au-delà du CFC, avec les deux
mises au point de physique — la caméra lit la surface (pas l'interface, OK pour
la longueur de décroissance latérale mais comparer au modèle 3D de surface) et
retirer la céramique d'espacement modifie la géométrie EM (gap 2 mm) + h_haut,
donc ne "rapproche" pas du modèle. Mode opératoire : spot unique 250/200 A sous
Tf, échantillons réutilisables, x-décroissance au-delà de l'empreinte CFC ; la
largeur (y) masquée par le CFC reste aux TC noyés (exp 7). .docx régénéré.

Co-Authored-By: Claude Opus 4.8 <noreply@anthropic.com>
</commit_message>
<xml_diff>
--- a/docs/mesures_a_realiser.docx
+++ b/docs/mesures_a_realiser.docx
@@ -1742,23 +1742,150 @@
         <w:t xml:space="preserve">h_haut</w:t>
       </w:r>
       <w:r>
-        <w:t xml:space="preserve">) et traite la</w:t>
-      </w:r>
-      <w:r>
-        <w:t xml:space="preserve"> </w:t>
-      </w:r>
-      <w:r>
-        <w:rPr>
-          <w:b/>
-          <w:bCs/>
-        </w:rPr>
-        <w:t xml:space="preserve">céramique d’espacement</w:t>
-      </w:r>
-      <w:r>
-        <w:t xml:space="preserve"> </w:t>
-      </w:r>
-      <w:r>
-        <w:t xml:space="preserve">comme la condition limite</w:t>
+        <w:t xml:space="preserve">) : retirer la pression pour ce test est sans conséquence.</w:t>
+      </w:r>
+    </w:p>
+    <w:p>
+      <w:pPr>
+        <w:pStyle w:val="BlockText"/>
+      </w:pPr>
+      <w:r>
+        <w:t xml:space="preserve">→</w:t>
+      </w:r>
+      <w:r>
+        <w:t xml:space="preserve"> </w:t>
+      </w:r>
+      <w:r>
+        <w:rPr>
+          <w:b/>
+          <w:bCs/>
+        </w:rPr>
+        <w:t xml:space="preserve">PROTOCOLE RETENU — caméra thermique de dessus (2026-07-27).</w:t>
+      </w:r>
+    </w:p>
+    <w:p>
+      <w:pPr>
+        <w:pStyle w:val="BlockText"/>
+      </w:pPr>
+      <w:r>
+        <w:rPr>
+          <w:b/>
+          <w:bCs/>
+        </w:rPr>
+        <w:t xml:space="preserve">Deux mises au point de physique</w:t>
+      </w:r>
+      <w:r>
+        <w:t xml:space="preserve"> </w:t>
+      </w:r>
+      <w:r>
+        <w:t xml:space="preserve">(suite à « chauffer sans céramique + caméra ») :</w:t>
+      </w:r>
+      <w:r>
+        <w:t xml:space="preserve"> </w:t>
+      </w:r>
+      <w:r>
+        <w:t xml:space="preserve">1.</w:t>
+      </w:r>
+      <w:r>
+        <w:t xml:space="preserve"> </w:t>
+      </w:r>
+      <w:r>
+        <w:rPr>
+          <w:b/>
+          <w:bCs/>
+        </w:rPr>
+        <w:t xml:space="preserve">La caméra lit la SURFACE, pas l’interface.</w:t>
+      </w:r>
+      <w:r>
+        <w:t xml:space="preserve"> </w:t>
+      </w:r>
+      <w:r>
+        <w:t xml:space="preserve">Pour la diffusivité latérale c’est OK — la</w:t>
+      </w:r>
+      <w:r>
+        <w:t xml:space="preserve"> </w:t>
+      </w:r>
+      <w:r>
+        <w:rPr>
+          <w:i/>
+          <w:iCs/>
+        </w:rPr>
+        <w:t xml:space="preserve">longueur de décroissance</w:t>
+      </w:r>
+      <w:r>
+        <w:t xml:space="preserve"> </w:t>
+      </w:r>
+      <w:r>
+        <w:t xml:space="preserve">latérale est la même propriété matériau en surface qu’à</w:t>
+      </w:r>
+      <w:r>
+        <w:t xml:space="preserve"> </w:t>
+      </w:r>
+      <w:r>
+        <w:t xml:space="preserve">l’interface. Mais la T absolue de surface est plus basse/retardée (diffusion sur 3,36 mm)</w:t>
+      </w:r>
+      <w:r>
+        <w:t xml:space="preserve"> </w:t>
+      </w:r>
+      <w:r>
+        <w:t xml:space="preserve">→ comparer à la prédiction de</w:t>
+      </w:r>
+      <w:r>
+        <w:t xml:space="preserve"> </w:t>
+      </w:r>
+      <w:r>
+        <w:rPr>
+          <w:b/>
+          <w:bCs/>
+        </w:rPr>
+        <w:t xml:space="preserve">surface du modèle 3D</w:t>
+      </w:r>
+      <w:r>
+        <w:t xml:space="preserve">, pas à l’interface.</w:t>
+      </w:r>
+      <w:r>
+        <w:t xml:space="preserve"> </w:t>
+      </w:r>
+      <w:r>
+        <w:t xml:space="preserve">2.</w:t>
+      </w:r>
+      <w:r>
+        <w:t xml:space="preserve"> </w:t>
+      </w:r>
+      <w:r>
+        <w:rPr>
+          <w:b/>
+          <w:bCs/>
+        </w:rPr>
+        <w:t xml:space="preserve">Retirer la céramique d’espacement ≠ se rapprocher du modèle.</w:t>
+      </w:r>
+      <w:r>
+        <w:t xml:space="preserve"> </w:t>
+      </w:r>
+      <w:r>
+        <w:t xml:space="preserve">Le modèle ne la néglige</w:t>
+      </w:r>
+      <w:r>
+        <w:t xml:space="preserve"> </w:t>
+      </w:r>
+      <w:r>
+        <w:t xml:space="preserve">PAS : il la représente comme le</w:t>
+      </w:r>
+      <w:r>
+        <w:t xml:space="preserve"> </w:t>
+      </w:r>
+      <w:r>
+        <w:rPr>
+          <w:b/>
+          <w:bCs/>
+        </w:rPr>
+        <w:t xml:space="preserve">gap bobine-laminé de 2 mm</w:t>
+      </w:r>
+      <w:r>
+        <w:t xml:space="preserve"> </w:t>
+      </w:r>
+      <w:r>
+        <w:t xml:space="preserve">(couplage EM) ET la condition</w:t>
       </w:r>
       <w:r>
         <w:t xml:space="preserve"> </w:t>
@@ -1770,16 +1897,264 @@
         <w:t xml:space="preserve">h_haut</w:t>
       </w:r>
       <w:r>
-        <w:t xml:space="preserve"> </w:t>
-      </w:r>
-      <w:r>
-        <w:t xml:space="preserve">(pas comme un solide résolu) : retirer la pression pour ce test est donc sans</w:t>
-      </w:r>
-      <w:r>
-        <w:t xml:space="preserve"> </w:t>
-      </w:r>
-      <w:r>
-        <w:t xml:space="preserve">conséquence sur la comparaison.</w:t>
+        <w:t xml:space="preserve">. La retirer supprime le gap (bobine 2 mm plus bas →</w:t>
+      </w:r>
+      <w:r>
+        <w:t xml:space="preserve"> </w:t>
+      </w:r>
+      <w:r>
+        <w:rPr>
+          <w:b/>
+          <w:bCs/>
+        </w:rPr>
+        <w:t xml:space="preserve">source EM plus forte et de</w:t>
+      </w:r>
+      <w:r>
+        <w:rPr>
+          <w:b/>
+          <w:bCs/>
+        </w:rPr>
+        <w:t xml:space="preserve"> </w:t>
+      </w:r>
+      <w:r>
+        <w:rPr>
+          <w:b/>
+          <w:bCs/>
+        </w:rPr>
+        <w:t xml:space="preserve">forme différente</w:t>
+      </w:r>
+      <w:r>
+        <w:t xml:space="preserve">) et change</w:t>
+      </w:r>
+      <w:r>
+        <w:t xml:space="preserve"> </w:t>
+      </w:r>
+      <w:r>
+        <w:rPr>
+          <w:rStyle w:val="VerbatimChar"/>
+        </w:rPr>
+        <w:t xml:space="preserve">h_haut</w:t>
+      </w:r>
+      <w:r>
+        <w:t xml:space="preserve">. La diffusivité reste mesurable (la décroissance</w:t>
+      </w:r>
+      <w:r>
+        <w:t xml:space="preserve"> </w:t>
+      </w:r>
+      <w:r>
+        <w:t xml:space="preserve">latérale est robuste à ces changements), mais</w:t>
+      </w:r>
+      <w:r>
+        <w:t xml:space="preserve"> </w:t>
+      </w:r>
+      <w:r>
+        <w:rPr>
+          <w:b/>
+          <w:bCs/>
+        </w:rPr>
+        <w:t xml:space="preserve">la géométrie n’est plus celle des essais</w:t>
+      </w:r>
+      <w:r>
+        <w:rPr>
+          <w:b/>
+          <w:bCs/>
+        </w:rPr>
+        <w:t xml:space="preserve"> </w:t>
+      </w:r>
+      <w:r>
+        <w:rPr>
+          <w:b/>
+          <w:bCs/>
+        </w:rPr>
+        <w:t xml:space="preserve">de calibration</w:t>
+      </w:r>
+      <w:r>
+        <w:t xml:space="preserve"> </w:t>
+      </w:r>
+      <w:r>
+        <w:t xml:space="preserve">: à documenter, et à re-représenter dans la config pour toute comparaison</w:t>
+      </w:r>
+      <w:r>
+        <w:t xml:space="preserve"> </w:t>
+      </w:r>
+      <w:r>
+        <w:t xml:space="preserve">quantitative.</w:t>
+      </w:r>
+    </w:p>
+    <w:p>
+      <w:pPr>
+        <w:pStyle w:val="BlockText"/>
+      </w:pPr>
+      <w:r>
+        <w:rPr>
+          <w:b/>
+          <w:bCs/>
+        </w:rPr>
+        <w:t xml:space="preserve">Mode opératoire.</w:t>
+      </w:r>
+      <w:r>
+        <w:t xml:space="preserve"> </w:t>
+      </w:r>
+      <w:r>
+        <w:t xml:space="preserve">- Chauffer un</w:t>
+      </w:r>
+      <w:r>
+        <w:t xml:space="preserve"> </w:t>
+      </w:r>
+      <w:r>
+        <w:rPr>
+          <w:b/>
+          <w:bCs/>
+        </w:rPr>
+        <w:t xml:space="preserve">spot unique</w:t>
+      </w:r>
+      <w:r>
+        <w:t xml:space="preserve"> </w:t>
+      </w:r>
+      <w:r>
+        <w:t xml:space="preserve">(250 A puis 200 A), rester</w:t>
+      </w:r>
+      <w:r>
+        <w:t xml:space="preserve"> </w:t>
+      </w:r>
+      <w:r>
+        <w:rPr>
+          <w:b/>
+          <w:bCs/>
+        </w:rPr>
+        <w:t xml:space="preserve">sous Tf</w:t>
+      </w:r>
+      <w:r>
+        <w:t xml:space="preserve"> </w:t>
+      </w:r>
+      <w:r>
+        <w:t xml:space="preserve">(pic ~150-250 °C),</w:t>
+      </w:r>
+      <w:r>
+        <w:t xml:space="preserve"> </w:t>
+      </w:r>
+      <w:r>
+        <w:t xml:space="preserve">échantillons réutilisables ; maintien quelques s à ~30 s.</w:t>
+      </w:r>
+      <w:r>
+        <w:t xml:space="preserve"> </w:t>
+      </w:r>
+      <w:r>
+        <w:t xml:space="preserve">- Caméra au-dessus : mesurer la</w:t>
+      </w:r>
+      <w:r>
+        <w:t xml:space="preserve"> </w:t>
+      </w:r>
+      <w:r>
+        <w:rPr>
+          <w:b/>
+          <w:bCs/>
+        </w:rPr>
+        <w:t xml:space="preserve">décroissance en LONGUEUR (x), au-delà de l’empreinte du</w:t>
+      </w:r>
+      <w:r>
+        <w:rPr>
+          <w:b/>
+          <w:bCs/>
+        </w:rPr>
+        <w:t xml:space="preserve"> </w:t>
+      </w:r>
+      <w:r>
+        <w:rPr>
+          <w:b/>
+          <w:bCs/>
+        </w:rPr>
+        <w:t xml:space="preserve">CFC</w:t>
+      </w:r>
+      <w:r>
+        <w:t xml:space="preserve"> </w:t>
+      </w:r>
+      <w:r>
+        <w:t xml:space="preserve">(55×31,5 mm) — c’est là qu’est l’info. En</w:t>
+      </w:r>
+      <w:r>
+        <w:t xml:space="preserve"> </w:t>
+      </w:r>
+      <w:r>
+        <w:rPr>
+          <w:b/>
+          <w:bCs/>
+        </w:rPr>
+        <w:t xml:space="preserve">largeur (y)</w:t>
+      </w:r>
+      <w:r>
+        <w:t xml:space="preserve">, le CFC déborde les 40 mm et</w:t>
+      </w:r>
+      <w:r>
+        <w:t xml:space="preserve"> </w:t>
+      </w:r>
+      <w:r>
+        <w:rPr>
+          <w:b/>
+          <w:bCs/>
+        </w:rPr>
+        <w:t xml:space="preserve">masque la zone</w:t>
+      </w:r>
+      <w:r>
+        <w:t xml:space="preserve"> </w:t>
+      </w:r>
+      <w:r>
+        <w:t xml:space="preserve">→ non mesurable à la caméra (réserver aux TC noyés, exp 7).</w:t>
+      </w:r>
+      <w:r>
+        <w:t xml:space="preserve"> </w:t>
+      </w:r>
+      <w:r>
+        <w:t xml:space="preserve">- Si la céramique d’espacement couvre tout le laminé (cahier B-1 : 120×40 mm) et masque la</w:t>
+      </w:r>
+      <w:r>
+        <w:t xml:space="preserve"> </w:t>
+      </w:r>
+      <w:r>
+        <w:t xml:space="preserve">surface, la retirer est acceptable</w:t>
+      </w:r>
+      <w:r>
+        <w:t xml:space="preserve"> </w:t>
+      </w:r>
+      <w:r>
+        <w:rPr>
+          <w:b/>
+          <w:bCs/>
+        </w:rPr>
+        <w:t xml:space="preserve">pour ce seul but</w:t>
+      </w:r>
+      <w:r>
+        <w:t xml:space="preserve"> </w:t>
+      </w:r>
+      <w:r>
+        <w:t xml:space="preserve">— noter alors « gap nul » dans le</w:t>
+      </w:r>
+      <w:r>
+        <w:t xml:space="preserve"> </w:t>
+      </w:r>
+      <w:r>
+        <w:t xml:space="preserve">compte rendu.</w:t>
+      </w:r>
+      <w:r>
+        <w:t xml:space="preserve"> </w:t>
+      </w:r>
+      <w:r>
+        <w:t xml:space="preserve">- Sortie utile : profil T_surface(x) à quelques instants → longueur de décroissance →</w:t>
+      </w:r>
+      <w:r>
+        <w:t xml:space="preserve"> </w:t>
+      </w:r>
+      <w:r>
+        <w:rPr>
+          <w:rStyle w:val="VerbatimChar"/>
+        </w:rPr>
+        <w:t xml:space="preserve">k_plan</w:t>
+      </w:r>
+      <w:r>
+        <w:t xml:space="preserve"> </w:t>
+      </w:r>
+      <w:r>
+        <w:t xml:space="preserve">effectif, confronté à la surface du modèle 3D à même géométrie.</w:t>
       </w:r>
     </w:p>
     <w:bookmarkEnd w:id="14"/>

</xml_diff>

<commit_message>
Record 200A frequency (383 kHz) + scaffold exp 6 data folder
- Relevé 2 résolu : fréquence à 200 A = 383 kHz (vs 388 à 250 A, user 2026-07-27).
  L'essai A-3 devrait l'utiliser ; fréquence aujourd'hui globale -> correction
  préparée (commentaire geometrie.yaml + releves_resolus.md), fréquence par essai
  à ajouter à la prochaine recalibration. Archivé + tableau/pointeur mesures MAJ ;
  journal_avancees §3bis passe à 4 corrections préparées.
- data/exp6_diffusivite_2026-07-27/README.md : gabarit de description + format
  d'export attendu (CSV radiométrique ROI/ligne de préférence) pour recevoir les
  résultats de l'expérience 6 (caméra thermique) et son analyse.

Co-Authored-By: Claude Opus 4.8 <noreply@anthropic.com>
</commit_message>
<xml_diff>
--- a/docs/mesures_a_realiser.docx
+++ b/docs/mesures_a_realiser.docx
@@ -547,7 +547,7 @@
       </w:r>
     </w:p>
     <w:bookmarkEnd w:id="9"/>
-    <w:bookmarkStart w:id="13" w:name="Xe12900a8f44a7fabd6c7e53142ebd366849e083"/>
+    <w:bookmarkStart w:id="12" w:name="Xe12900a8f44a7fabd6c7e53142ebd366849e083"/>
     <w:p>
       <w:pPr>
         <w:pStyle w:val="Heading2"/>
@@ -556,7 +556,7 @@
         <w:t xml:space="preserve">Niveau 1. Relevés triviaux (quelques minutes chacun)</w:t>
       </w:r>
     </w:p>
-    <w:bookmarkStart w:id="10" w:name="X98252d34dec511e56f01f613239482d36b1f9a2"/>
+    <w:bookmarkStart w:id="11" w:name="X98252d34dec511e56f01f613239482d36b1f9a2"/>
     <w:p>
       <w:pPr>
         <w:pStyle w:val="Heading3"/>
@@ -911,146 +911,6 @@
         <w:t xml:space="preserve">figé. (Les cotes de section/entraxe/hauteur de la bobine, elles, sont déjà résolues.)</w:t>
       </w:r>
     </w:p>
-    <w:bookmarkEnd w:id="10"/>
-    <w:bookmarkStart w:id="12" w:name="Xcc34eeb381769149bb77a3a4a65b5aa15ec2d07"/>
-    <w:p>
-      <w:pPr>
-        <w:pStyle w:val="Heading3"/>
-      </w:pPr>
-      <w:r>
-        <w:t xml:space="preserve">Relevé 2. Fréquence du générateur à 200 A</w:t>
-      </w:r>
-    </w:p>
-    <w:p>
-      <w:pPr>
-        <w:pStyle w:val="FirstParagraph"/>
-      </w:pPr>
-      <w:r>
-        <w:rPr>
-          <w:b/>
-          <w:bCs/>
-        </w:rPr>
-        <w:t xml:space="preserve">Objectif.</w:t>
-      </w:r>
-      <w:r>
-        <w:t xml:space="preserve"> </w:t>
-      </w:r>
-      <w:r>
-        <w:t xml:space="preserve">Relever la fréquence de travail de l’EASYHEAT à 200 A.</w:t>
-      </w:r>
-    </w:p>
-    <w:p>
-      <w:pPr>
-        <w:pStyle w:val="BodyText"/>
-      </w:pPr>
-      <w:r>
-        <w:rPr>
-          <w:b/>
-          <w:bCs/>
-        </w:rPr>
-        <w:t xml:space="preserve">Méthode.</w:t>
-      </w:r>
-      <w:r>
-        <w:t xml:space="preserve"> </w:t>
-      </w:r>
-      <w:r>
-        <w:t xml:space="preserve">Lire l’afficheur du générateur pendant un essai à 200 A (type A-3). La fréquence</w:t>
-      </w:r>
-      <w:r>
-        <w:t xml:space="preserve"> </w:t>
-      </w:r>
-      <w:r>
-        <w:t xml:space="preserve">à 250 A vaut 388 kHz (relevé du 17 juillet). Le cahier note qu’elle varie avec l’ampérage.</w:t>
-      </w:r>
-    </w:p>
-    <w:p>
-      <w:pPr>
-        <w:pStyle w:val="BodyText"/>
-      </w:pPr>
-      <w:r>
-        <w:rPr>
-          <w:b/>
-          <w:bCs/>
-        </w:rPr>
-        <w:t xml:space="preserve">Paramètre du modèle résolu.</w:t>
-      </w:r>
-      <w:r>
-        <w:t xml:space="preserve"> </w:t>
-      </w:r>
-      <w:r>
-        <w:t xml:space="preserve">La fréquence EM de l’essai A-3, aujourd’hui supposée égale à</w:t>
-      </w:r>
-      <w:r>
-        <w:t xml:space="preserve"> </w:t>
-      </w:r>
-      <w:r>
-        <w:t xml:space="preserve">celle de 250 A.</w:t>
-      </w:r>
-    </w:p>
-    <w:p>
-      <w:pPr>
-        <w:pStyle w:val="BodyText"/>
-      </w:pPr>
-      <w:r>
-        <w:rPr>
-          <w:b/>
-          <w:bCs/>
-        </w:rPr>
-        <w:t xml:space="preserve">Gain attendu.</w:t>
-      </w:r>
-      <w:r>
-        <w:t xml:space="preserve"> </w:t>
-      </w:r>
-      <w:r>
-        <w:t xml:space="preserve">Entrée EM correcte pour l’essai aveugle à 200 A, celui qui teste la loi en</w:t>
-      </w:r>
-      <w:r>
-        <w:t xml:space="preserve"> </w:t>
-      </w:r>
-      <w:r>
-        <w:t xml:space="preserve">courant.</w:t>
-      </w:r>
-    </w:p>
-    <w:p>
-      <w:pPr>
-        <w:pStyle w:val="BodyText"/>
-      </w:pPr>
-      <w:r>
-        <w:rPr>
-          <w:b/>
-          <w:bCs/>
-        </w:rPr>
-        <w:t xml:space="preserve">Temps estimé.</w:t>
-      </w:r>
-      <w:r>
-        <w:t xml:space="preserve"> </w:t>
-      </w:r>
-      <w:r>
-        <w:t xml:space="preserve">Une lecture pendant un essai.</w:t>
-      </w:r>
-    </w:p>
-    <w:p>
-      <w:pPr>
-        <w:pStyle w:val="BodyText"/>
-      </w:pPr>
-      <w:r>
-        <w:rPr>
-          <w:b/>
-          <w:bCs/>
-        </w:rPr>
-        <w:t xml:space="preserve">Réponse (utilisateur, 2026-07-27) :</w:t>
-      </w:r>
-      <w:r>
-        <w:t xml:space="preserve"> </w:t>
-      </w:r>
-      <w:r>
-        <w:rPr>
-          <w:i/>
-          <w:iCs/>
-        </w:rPr>
-        <w:t xml:space="preserve">(en attente)</w:t>
-      </w:r>
-    </w:p>
     <w:p>
       <w:pPr>
         <w:pStyle w:val="BlockText"/>
@@ -1060,16 +920,16 @@
           <w:b/>
           <w:bCs/>
         </w:rPr>
-        <w:t xml:space="preserve">Relevés 3, 4 et 5 — RÉSOLUS (27 juillet 2026), archivés dans</w:t>
-      </w:r>
-      <w:r>
-        <w:rPr>
-          <w:b/>
-          <w:bCs/>
-        </w:rPr>
-        <w:t xml:space="preserve"> </w:t>
-      </w:r>
-      <w:hyperlink r:id="rId11">
+        <w:t xml:space="preserve">Relevés 2, 3, 4 et 5 — RÉSOLUS (27 juillet 2026), archivés dans</w:t>
+      </w:r>
+      <w:r>
+        <w:rPr>
+          <w:b/>
+          <w:bCs/>
+        </w:rPr>
+        <w:t xml:space="preserve"> </w:t>
+      </w:r>
+      <w:hyperlink r:id="rId10">
         <w:r>
           <w:rPr>
             <w:rStyle w:val="VerbatimChar"/>
@@ -1090,7 +950,23 @@
         <w:t xml:space="preserve"> </w:t>
       </w:r>
       <w:r>
-        <w:t xml:space="preserve">En bref : twill mesuré</w:t>
+        <w:t xml:space="preserve">En bref : fréquence à 200 A =</w:t>
+      </w:r>
+      <w:r>
+        <w:t xml:space="preserve"> </w:t>
+      </w:r>
+      <w:r>
+        <w:rPr>
+          <w:b/>
+          <w:bCs/>
+        </w:rPr>
+        <w:t xml:space="preserve">383 kHz</w:t>
+      </w:r>
+      <w:r>
+        <w:t xml:space="preserve"> </w:t>
+      </w:r>
+      <w:r>
+        <w:t xml:space="preserve">(corr. A-3 préparée) ; twill mesuré</w:t>
       </w:r>
       <w:r>
         <w:t xml:space="preserve"> </w:t>
@@ -1106,13 +982,7 @@
         <w:t xml:space="preserve"> </w:t>
       </w:r>
       <w:r>
-        <w:t xml:space="preserve">(corr.</w:t>
-      </w:r>
-      <w:r>
-        <w:t xml:space="preserve"> </w:t>
-      </w:r>
-      <w:r>
-        <w:t xml:space="preserve">préparée) ; chants</w:t>
+        <w:t xml:space="preserve">(corr. préparée) ; chants</w:t>
       </w:r>
       <w:r>
         <w:t xml:space="preserve"> </w:t>
@@ -1143,41 +1013,43 @@
         <w:t xml:space="preserve"> </w:t>
       </w:r>
       <w:r>
-        <w:t xml:space="preserve">est un paramètre effectif, pas physique ;</w:t>
-      </w:r>
-      <w:r>
-        <w:t xml:space="preserve"> </w:t>
-      </w:r>
-      <w:r>
-        <w:t xml:space="preserve">thermostat coupait sur le</w:t>
-      </w:r>
-      <w:r>
-        <w:t xml:space="preserve"> </w:t>
-      </w:r>
-      <w:r>
-        <w:rPr>
-          <w:b/>
-          <w:bCs/>
-        </w:rPr>
-        <w:t xml:space="preserve">max des TC d’interface</w:t>
-      </w:r>
-      <w:r>
-        <w:t xml:space="preserve"> </w:t>
-      </w:r>
-      <w:r>
-        <w:t xml:space="preserve">(cahier de labo) → loi « capteurs »</w:t>
-      </w:r>
-      <w:r>
-        <w:t xml:space="preserve"> </w:t>
-      </w:r>
-      <w:r>
-        <w:t xml:space="preserve">implémentée derrière un flag. Les trois corrections s’intégreront à la prochaine</w:t>
-      </w:r>
-      <w:r>
-        <w:t xml:space="preserve"> </w:t>
-      </w:r>
-      <w:r>
-        <w:t xml:space="preserve">recalibration.</w:t>
+        <w:t xml:space="preserve">est un paramètre effectif, pas physique ; thermostat coupait sur le</w:t>
+      </w:r>
+      <w:r>
+        <w:t xml:space="preserve"> </w:t>
+      </w:r>
+      <w:r>
+        <w:rPr>
+          <w:b/>
+          <w:bCs/>
+        </w:rPr>
+        <w:t xml:space="preserve">max des TC</w:t>
+      </w:r>
+      <w:r>
+        <w:rPr>
+          <w:b/>
+          <w:bCs/>
+        </w:rPr>
+        <w:t xml:space="preserve"> </w:t>
+      </w:r>
+      <w:r>
+        <w:rPr>
+          <w:b/>
+          <w:bCs/>
+        </w:rPr>
+        <w:t xml:space="preserve">d’interface</w:t>
+      </w:r>
+      <w:r>
+        <w:t xml:space="preserve"> </w:t>
+      </w:r>
+      <w:r>
+        <w:t xml:space="preserve">(cahier de labo) → loi « capteurs » implémentée derrière un flag. Ces</w:t>
+      </w:r>
+      <w:r>
+        <w:t xml:space="preserve"> </w:t>
+      </w:r>
+      <w:r>
+        <w:t xml:space="preserve">corrections s’intégreront à la prochaine recalibration.</w:t>
       </w:r>
     </w:p>
     <w:p>
@@ -1187,9 +1059,9 @@
         </w:pict>
       </w:r>
     </w:p>
+    <w:bookmarkEnd w:id="11"/>
     <w:bookmarkEnd w:id="12"/>
-    <w:bookmarkEnd w:id="13"/>
-    <w:bookmarkStart w:id="17" w:name="X050f80098886d27d0233576c23f921ac46bb86f"/>
+    <w:bookmarkStart w:id="16" w:name="X050f80098886d27d0233576c23f921ac46bb86f"/>
     <w:p>
       <w:pPr>
         <w:pStyle w:val="Heading2"/>
@@ -1198,7 +1070,7 @@
         <w:t xml:space="preserve">Niveau 2. Expériences rapides (un essai chacune, même banc)</w:t>
       </w:r>
     </w:p>
-    <w:bookmarkStart w:id="14" w:name="X7b864b83b0bd743e51ddb75723b23c433aa888b"/>
+    <w:bookmarkStart w:id="13" w:name="X7b864b83b0bd743e51ddb75723b23c433aa888b"/>
     <w:p>
       <w:pPr>
         <w:pStyle w:val="Heading3"/>
@@ -2157,8 +2029,8 @@
         <w:t xml:space="preserve">effectif, confronté à la surface du modèle 3D à même géométrie.</w:t>
       </w:r>
     </w:p>
-    <w:bookmarkEnd w:id="14"/>
-    <w:bookmarkStart w:id="15" w:name="X8d23be7ef90e71b4632fda43cede6943294545c"/>
+    <w:bookmarkEnd w:id="13"/>
+    <w:bookmarkStart w:id="14" w:name="X8d23be7ef90e71b4632fda43cede6943294545c"/>
     <w:p>
       <w:pPr>
         <w:pStyle w:val="Heading3"/>
@@ -2745,8 +2617,8 @@
         <w:t xml:space="preserve">falsifier la cible chiffrée ci-dessus.</w:t>
       </w:r>
     </w:p>
-    <w:bookmarkEnd w:id="15"/>
-    <w:bookmarkStart w:id="16" w:name="X3c1cdae2de844c3576b3855646d50728992e02e"/>
+    <w:bookmarkEnd w:id="14"/>
+    <w:bookmarkStart w:id="15" w:name="X3c1cdae2de844c3576b3855646d50728992e02e"/>
     <w:p>
       <w:pPr>
         <w:pStyle w:val="Heading3"/>
@@ -2936,309 +2808,309 @@
         </w:pict>
       </w:r>
     </w:p>
+    <w:bookmarkEnd w:id="15"/>
     <w:bookmarkEnd w:id="16"/>
+    <w:bookmarkStart w:id="19" w:name="Xbd611265407e50f203bfabccbfdafc710a5ac1e"/>
+    <w:p>
+      <w:pPr>
+        <w:pStyle w:val="Heading2"/>
+      </w:pPr>
+      <w:r>
+        <w:t xml:space="preserve">Niveau 3. Mesures de propriété (appareil de laboratoire)</w:t>
+      </w:r>
+    </w:p>
+    <w:bookmarkStart w:id="17" w:name="X65c8a4b8084d57e4184b75723c3c30610e8e8a5"/>
+    <w:p>
+      <w:pPr>
+        <w:pStyle w:val="Heading3"/>
+      </w:pPr>
+      <w:r>
+        <w:t xml:space="preserve">Mesure 9. Conductivité thermique dans le plan du laminé</w:t>
+      </w:r>
+    </w:p>
+    <w:p>
+      <w:pPr>
+        <w:pStyle w:val="FirstParagraph"/>
+      </w:pPr>
+      <w:r>
+        <w:rPr>
+          <w:b/>
+          <w:bCs/>
+        </w:rPr>
+        <w:t xml:space="preserve">Objectif.</w:t>
+      </w:r>
+      <w:r>
+        <w:t xml:space="preserve"> </w:t>
+      </w:r>
+      <w:r>
+        <w:t xml:space="preserve">Mesurer directement la conductivité thermique dans le plan du CF/PEKK.</w:t>
+      </w:r>
+    </w:p>
+    <w:p>
+      <w:pPr>
+        <w:pStyle w:val="BodyText"/>
+      </w:pPr>
+      <w:r>
+        <w:rPr>
+          <w:b/>
+          <w:bCs/>
+        </w:rPr>
+        <w:t xml:space="preserve">Méthode.</w:t>
+      </w:r>
+      <w:r>
+        <w:t xml:space="preserve"> </w:t>
+      </w:r>
+      <w:r>
+        <w:t xml:space="preserve">Flash laser ou disque chaud (hot-disk) sur un échantillon de laminé.</w:t>
+      </w:r>
+    </w:p>
+    <w:p>
+      <w:pPr>
+        <w:pStyle w:val="BodyText"/>
+      </w:pPr>
+      <w:r>
+        <w:rPr>
+          <w:b/>
+          <w:bCs/>
+        </w:rPr>
+        <w:t xml:space="preserve">Paramètre du modèle résolu.</w:t>
+      </w:r>
+      <w:r>
+        <w:t xml:space="preserve"> </w:t>
+      </w:r>
+      <w:r>
+        <w:t xml:space="preserve">La conductivité</w:t>
+      </w:r>
+      <w:r>
+        <w:t xml:space="preserve"> </w:t>
+      </w:r>
+      <w:r>
+        <w:rPr>
+          <w:rStyle w:val="VerbatimChar"/>
+        </w:rPr>
+        <w:t xml:space="preserve">k_plan</w:t>
+      </w:r>
+      <w:r>
+        <w:t xml:space="preserve">, la même que l’expérience 6 attaque</w:t>
+      </w:r>
+      <w:r>
+        <w:t xml:space="preserve"> </w:t>
+      </w:r>
+      <w:r>
+        <w:t xml:space="preserve">sur le banc.</w:t>
+      </w:r>
+    </w:p>
+    <w:p>
+      <w:pPr>
+        <w:pStyle w:val="BodyText"/>
+      </w:pPr>
+      <w:r>
+        <w:rPr>
+          <w:b/>
+          <w:bCs/>
+        </w:rPr>
+        <w:t xml:space="preserve">Gain attendu.</w:t>
+      </w:r>
+      <w:r>
+        <w:t xml:space="preserve"> </w:t>
+      </w:r>
+      <w:r>
+        <w:t xml:space="preserve">Transforme un</w:t>
+      </w:r>
+      <w:r>
+        <w:t xml:space="preserve"> </w:t>
+      </w:r>
+      <w:r>
+        <w:rPr>
+          <w:rStyle w:val="VerbatimChar"/>
+        </w:rPr>
+        <w:t xml:space="preserve">k_plan</w:t>
+      </w:r>
+      <w:r>
+        <w:t xml:space="preserve"> </w:t>
+      </w:r>
+      <w:r>
+        <w:t xml:space="preserve">assumé en propriété sourcée. L’écart d’un facteur 3</w:t>
+      </w:r>
+      <w:r>
+        <w:t xml:space="preserve"> </w:t>
+      </w:r>
+      <w:r>
+        <w:t xml:space="preserve">qui semblait requis le 23 juillet au matin ne l’est plus (voir l’encadré de tête), mais la</w:t>
+      </w:r>
+      <w:r>
+        <w:t xml:space="preserve"> </w:t>
+      </w:r>
+      <w:r>
+        <w:t xml:space="preserve">valeur homogénéisée de 3 W/m·K reste, elle, non vérifiée expérimentalement.</w:t>
+      </w:r>
+    </w:p>
+    <w:p>
+      <w:pPr>
+        <w:pStyle w:val="BodyText"/>
+      </w:pPr>
+      <w:r>
+        <w:rPr>
+          <w:b/>
+          <w:bCs/>
+        </w:rPr>
+        <w:t xml:space="preserve">Temps estimé.</w:t>
+      </w:r>
+      <w:r>
+        <w:t xml:space="preserve"> </w:t>
+      </w:r>
+      <w:r>
+        <w:t xml:space="preserve">Préparation d’échantillon plus appareil dédié. L’expérience 6 en est le</w:t>
+      </w:r>
+      <w:r>
+        <w:t xml:space="preserve"> </w:t>
+      </w:r>
+      <w:r>
+        <w:t xml:space="preserve">substitut rapide sur le banc du laboratoire.</w:t>
+      </w:r>
+    </w:p>
+    <w:p>
+      <w:pPr>
+        <w:pStyle w:val="BodyText"/>
+      </w:pPr>
+      <w:r>
+        <w:rPr>
+          <w:b/>
+          <w:bCs/>
+        </w:rPr>
+        <w:t xml:space="preserve">Réponse (utilisateur, 2026-07-27) :</w:t>
+      </w:r>
+      <w:r>
+        <w:t xml:space="preserve"> </w:t>
+      </w:r>
+      <w:r>
+        <w:t xml:space="preserve">« J’ai pas compris cette expérience. »</w:t>
+      </w:r>
+    </w:p>
+    <w:p>
+      <w:pPr>
+        <w:pStyle w:val="BlockText"/>
+      </w:pPr>
+      <w:r>
+        <w:t xml:space="preserve">→</w:t>
+      </w:r>
+      <w:r>
+        <w:t xml:space="preserve"> </w:t>
+      </w:r>
+      <w:r>
+        <w:rPr>
+          <w:b/>
+          <w:bCs/>
+        </w:rPr>
+        <w:t xml:space="preserve">Précision.</w:t>
+      </w:r>
+      <w:r>
+        <w:t xml:space="preserve"> </w:t>
+      </w:r>
+      <w:r>
+        <w:t xml:space="preserve">C’est une mesure d’</w:t>
+      </w:r>
+      <w:r>
+        <w:rPr>
+          <w:b/>
+          <w:bCs/>
+        </w:rPr>
+        <w:t xml:space="preserve">appareil de labo</w:t>
+      </w:r>
+      <w:r>
+        <w:t xml:space="preserve"> </w:t>
+      </w:r>
+      <w:r>
+        <w:t xml:space="preserve">(hot-disk ou flash laser), pas sur</w:t>
+      </w:r>
+      <w:r>
+        <w:t xml:space="preserve"> </w:t>
+      </w:r>
+      <w:r>
+        <w:t xml:space="preserve">le banc de soudage : on dépose une impulsion de chaleur sur un petit</w:t>
+      </w:r>
+      <w:r>
+        <w:t xml:space="preserve"> </w:t>
+      </w:r>
+      <w:r>
+        <w:rPr>
+          <w:b/>
+          <w:bCs/>
+        </w:rPr>
+        <w:t xml:space="preserve">échantillon de</w:t>
+      </w:r>
+      <w:r>
+        <w:rPr>
+          <w:b/>
+          <w:bCs/>
+        </w:rPr>
+        <w:t xml:space="preserve"> </w:t>
+      </w:r>
+      <w:r>
+        <w:rPr>
+          <w:b/>
+          <w:bCs/>
+        </w:rPr>
+        <w:t xml:space="preserve">matière</w:t>
+      </w:r>
+      <w:r>
+        <w:t xml:space="preserve"> </w:t>
+      </w:r>
+      <w:r>
+        <w:t xml:space="preserve">et on chronomètre sa vitesse d’étalement → on en déduit la conductivité thermique</w:t>
+      </w:r>
+      <w:r>
+        <w:t xml:space="preserve"> </w:t>
+      </w:r>
+      <w:r>
+        <w:t xml:space="preserve">dans le plan</w:t>
+      </w:r>
+      <w:r>
+        <w:t xml:space="preserve"> </w:t>
+      </w:r>
+      <w:r>
+        <w:rPr>
+          <w:rStyle w:val="VerbatimChar"/>
+        </w:rPr>
+        <w:t xml:space="preserve">k_plan</w:t>
+      </w:r>
+      <w:r>
+        <w:t xml:space="preserve">. L’</w:t>
+      </w:r>
+      <w:r>
+        <w:rPr>
+          <w:b/>
+          <w:bCs/>
+        </w:rPr>
+        <w:t xml:space="preserve">expérience 6</w:t>
+      </w:r>
+      <w:r>
+        <w:t xml:space="preserve"> </w:t>
+      </w:r>
+      <w:r>
+        <w:t xml:space="preserve">(spot + TC en ligne sur le banc) en est le</w:t>
+      </w:r>
+      <w:r>
+        <w:t xml:space="preserve"> </w:t>
+      </w:r>
+      <w:r>
+        <w:t xml:space="preserve">substitut « maison ». Non prioritaire : sers-toi de l’exp 6 si tu veux vérifier</w:t>
+      </w:r>
+      <w:r>
+        <w:t xml:space="preserve"> </w:t>
+      </w:r>
+      <w:r>
+        <w:rPr>
+          <w:rStyle w:val="VerbatimChar"/>
+        </w:rPr>
+        <w:t xml:space="preserve">k_plan</w:t>
+      </w:r>
+      <w:r>
+        <w:t xml:space="preserve">.</w:t>
+      </w:r>
+    </w:p>
     <w:bookmarkEnd w:id="17"/>
-    <w:bookmarkStart w:id="20" w:name="Xbd611265407e50f203bfabccbfdafc710a5ac1e"/>
-    <w:p>
-      <w:pPr>
-        <w:pStyle w:val="Heading2"/>
-      </w:pPr>
-      <w:r>
-        <w:t xml:space="preserve">Niveau 3. Mesures de propriété (appareil de laboratoire)</w:t>
-      </w:r>
-    </w:p>
-    <w:bookmarkStart w:id="18" w:name="X65c8a4b8084d57e4184b75723c3c30610e8e8a5"/>
-    <w:p>
-      <w:pPr>
-        <w:pStyle w:val="Heading3"/>
-      </w:pPr>
-      <w:r>
-        <w:t xml:space="preserve">Mesure 9. Conductivité thermique dans le plan du laminé</w:t>
-      </w:r>
-    </w:p>
-    <w:p>
-      <w:pPr>
-        <w:pStyle w:val="FirstParagraph"/>
-      </w:pPr>
-      <w:r>
-        <w:rPr>
-          <w:b/>
-          <w:bCs/>
-        </w:rPr>
-        <w:t xml:space="preserve">Objectif.</w:t>
-      </w:r>
-      <w:r>
-        <w:t xml:space="preserve"> </w:t>
-      </w:r>
-      <w:r>
-        <w:t xml:space="preserve">Mesurer directement la conductivité thermique dans le plan du CF/PEKK.</w:t>
-      </w:r>
-    </w:p>
-    <w:p>
-      <w:pPr>
-        <w:pStyle w:val="BodyText"/>
-      </w:pPr>
-      <w:r>
-        <w:rPr>
-          <w:b/>
-          <w:bCs/>
-        </w:rPr>
-        <w:t xml:space="preserve">Méthode.</w:t>
-      </w:r>
-      <w:r>
-        <w:t xml:space="preserve"> </w:t>
-      </w:r>
-      <w:r>
-        <w:t xml:space="preserve">Flash laser ou disque chaud (hot-disk) sur un échantillon de laminé.</w:t>
-      </w:r>
-    </w:p>
-    <w:p>
-      <w:pPr>
-        <w:pStyle w:val="BodyText"/>
-      </w:pPr>
-      <w:r>
-        <w:rPr>
-          <w:b/>
-          <w:bCs/>
-        </w:rPr>
-        <w:t xml:space="preserve">Paramètre du modèle résolu.</w:t>
-      </w:r>
-      <w:r>
-        <w:t xml:space="preserve"> </w:t>
-      </w:r>
-      <w:r>
-        <w:t xml:space="preserve">La conductivité</w:t>
-      </w:r>
-      <w:r>
-        <w:t xml:space="preserve"> </w:t>
-      </w:r>
-      <w:r>
-        <w:rPr>
-          <w:rStyle w:val="VerbatimChar"/>
-        </w:rPr>
-        <w:t xml:space="preserve">k_plan</w:t>
-      </w:r>
-      <w:r>
-        <w:t xml:space="preserve">, la même que l’expérience 6 attaque</w:t>
-      </w:r>
-      <w:r>
-        <w:t xml:space="preserve"> </w:t>
-      </w:r>
-      <w:r>
-        <w:t xml:space="preserve">sur le banc.</w:t>
-      </w:r>
-    </w:p>
-    <w:p>
-      <w:pPr>
-        <w:pStyle w:val="BodyText"/>
-      </w:pPr>
-      <w:r>
-        <w:rPr>
-          <w:b/>
-          <w:bCs/>
-        </w:rPr>
-        <w:t xml:space="preserve">Gain attendu.</w:t>
-      </w:r>
-      <w:r>
-        <w:t xml:space="preserve"> </w:t>
-      </w:r>
-      <w:r>
-        <w:t xml:space="preserve">Transforme un</w:t>
-      </w:r>
-      <w:r>
-        <w:t xml:space="preserve"> </w:t>
-      </w:r>
-      <w:r>
-        <w:rPr>
-          <w:rStyle w:val="VerbatimChar"/>
-        </w:rPr>
-        <w:t xml:space="preserve">k_plan</w:t>
-      </w:r>
-      <w:r>
-        <w:t xml:space="preserve"> </w:t>
-      </w:r>
-      <w:r>
-        <w:t xml:space="preserve">assumé en propriété sourcée. L’écart d’un facteur 3</w:t>
-      </w:r>
-      <w:r>
-        <w:t xml:space="preserve"> </w:t>
-      </w:r>
-      <w:r>
-        <w:t xml:space="preserve">qui semblait requis le 23 juillet au matin ne l’est plus (voir l’encadré de tête), mais la</w:t>
-      </w:r>
-      <w:r>
-        <w:t xml:space="preserve"> </w:t>
-      </w:r>
-      <w:r>
-        <w:t xml:space="preserve">valeur homogénéisée de 3 W/m·K reste, elle, non vérifiée expérimentalement.</w:t>
-      </w:r>
-    </w:p>
-    <w:p>
-      <w:pPr>
-        <w:pStyle w:val="BodyText"/>
-      </w:pPr>
-      <w:r>
-        <w:rPr>
-          <w:b/>
-          <w:bCs/>
-        </w:rPr>
-        <w:t xml:space="preserve">Temps estimé.</w:t>
-      </w:r>
-      <w:r>
-        <w:t xml:space="preserve"> </w:t>
-      </w:r>
-      <w:r>
-        <w:t xml:space="preserve">Préparation d’échantillon plus appareil dédié. L’expérience 6 en est le</w:t>
-      </w:r>
-      <w:r>
-        <w:t xml:space="preserve"> </w:t>
-      </w:r>
-      <w:r>
-        <w:t xml:space="preserve">substitut rapide sur le banc du laboratoire.</w:t>
-      </w:r>
-    </w:p>
-    <w:p>
-      <w:pPr>
-        <w:pStyle w:val="BodyText"/>
-      </w:pPr>
-      <w:r>
-        <w:rPr>
-          <w:b/>
-          <w:bCs/>
-        </w:rPr>
-        <w:t xml:space="preserve">Réponse (utilisateur, 2026-07-27) :</w:t>
-      </w:r>
-      <w:r>
-        <w:t xml:space="preserve"> </w:t>
-      </w:r>
-      <w:r>
-        <w:t xml:space="preserve">« J’ai pas compris cette expérience. »</w:t>
-      </w:r>
-    </w:p>
-    <w:p>
-      <w:pPr>
-        <w:pStyle w:val="BlockText"/>
-      </w:pPr>
-      <w:r>
-        <w:t xml:space="preserve">→</w:t>
-      </w:r>
-      <w:r>
-        <w:t xml:space="preserve"> </w:t>
-      </w:r>
-      <w:r>
-        <w:rPr>
-          <w:b/>
-          <w:bCs/>
-        </w:rPr>
-        <w:t xml:space="preserve">Précision.</w:t>
-      </w:r>
-      <w:r>
-        <w:t xml:space="preserve"> </w:t>
-      </w:r>
-      <w:r>
-        <w:t xml:space="preserve">C’est une mesure d’</w:t>
-      </w:r>
-      <w:r>
-        <w:rPr>
-          <w:b/>
-          <w:bCs/>
-        </w:rPr>
-        <w:t xml:space="preserve">appareil de labo</w:t>
-      </w:r>
-      <w:r>
-        <w:t xml:space="preserve"> </w:t>
-      </w:r>
-      <w:r>
-        <w:t xml:space="preserve">(hot-disk ou flash laser), pas sur</w:t>
-      </w:r>
-      <w:r>
-        <w:t xml:space="preserve"> </w:t>
-      </w:r>
-      <w:r>
-        <w:t xml:space="preserve">le banc de soudage : on dépose une impulsion de chaleur sur un petit</w:t>
-      </w:r>
-      <w:r>
-        <w:t xml:space="preserve"> </w:t>
-      </w:r>
-      <w:r>
-        <w:rPr>
-          <w:b/>
-          <w:bCs/>
-        </w:rPr>
-        <w:t xml:space="preserve">échantillon de</w:t>
-      </w:r>
-      <w:r>
-        <w:rPr>
-          <w:b/>
-          <w:bCs/>
-        </w:rPr>
-        <w:t xml:space="preserve"> </w:t>
-      </w:r>
-      <w:r>
-        <w:rPr>
-          <w:b/>
-          <w:bCs/>
-        </w:rPr>
-        <w:t xml:space="preserve">matière</w:t>
-      </w:r>
-      <w:r>
-        <w:t xml:space="preserve"> </w:t>
-      </w:r>
-      <w:r>
-        <w:t xml:space="preserve">et on chronomètre sa vitesse d’étalement → on en déduit la conductivité thermique</w:t>
-      </w:r>
-      <w:r>
-        <w:t xml:space="preserve"> </w:t>
-      </w:r>
-      <w:r>
-        <w:t xml:space="preserve">dans le plan</w:t>
-      </w:r>
-      <w:r>
-        <w:t xml:space="preserve"> </w:t>
-      </w:r>
-      <w:r>
-        <w:rPr>
-          <w:rStyle w:val="VerbatimChar"/>
-        </w:rPr>
-        <w:t xml:space="preserve">k_plan</w:t>
-      </w:r>
-      <w:r>
-        <w:t xml:space="preserve">. L’</w:t>
-      </w:r>
-      <w:r>
-        <w:rPr>
-          <w:b/>
-          <w:bCs/>
-        </w:rPr>
-        <w:t xml:space="preserve">expérience 6</w:t>
-      </w:r>
-      <w:r>
-        <w:t xml:space="preserve"> </w:t>
-      </w:r>
-      <w:r>
-        <w:t xml:space="preserve">(spot + TC en ligne sur le banc) en est le</w:t>
-      </w:r>
-      <w:r>
-        <w:t xml:space="preserve"> </w:t>
-      </w:r>
-      <w:r>
-        <w:t xml:space="preserve">substitut « maison ». Non prioritaire : sers-toi de l’exp 6 si tu veux vérifier</w:t>
-      </w:r>
-      <w:r>
-        <w:t xml:space="preserve"> </w:t>
-      </w:r>
-      <w:r>
-        <w:rPr>
-          <w:rStyle w:val="VerbatimChar"/>
-        </w:rPr>
-        <w:t xml:space="preserve">k_plan</w:t>
-      </w:r>
-      <w:r>
-        <w:t xml:space="preserve">.</w:t>
-      </w:r>
-    </w:p>
-    <w:bookmarkEnd w:id="18"/>
-    <w:bookmarkStart w:id="19" w:name="Xbcbfbd036e1830f701e3e206f87ccdb9e70e470"/>
+    <w:bookmarkStart w:id="18" w:name="Xbcbfbd036e1830f701e3e206f87ccdb9e70e470"/>
     <w:p>
       <w:pPr>
         <w:pStyle w:val="Heading3"/>
@@ -3466,9 +3338,9 @@
         </w:pict>
       </w:r>
     </w:p>
+    <w:bookmarkEnd w:id="18"/>
     <w:bookmarkEnd w:id="19"/>
-    <w:bookmarkEnd w:id="20"/>
-    <w:bookmarkStart w:id="21" w:name="recommandation"/>
+    <w:bookmarkStart w:id="20" w:name="recommandation"/>
     <w:p>
       <w:pPr>
         <w:pStyle w:val="Heading2"/>
@@ -3642,8 +3514,8 @@
         </w:pict>
       </w:r>
     </w:p>
-    <w:bookmarkEnd w:id="21"/>
-    <w:bookmarkStart w:id="22" w:name="tableau-de-synthèse"/>
+    <w:bookmarkEnd w:id="20"/>
+    <w:bookmarkStart w:id="21" w:name="tableau-de-synthèse"/>
     <w:p>
       <w:pPr>
         <w:pStyle w:val="Heading2"/>
@@ -3811,7 +3683,7 @@
               <w:pStyle w:val="Compact"/>
             </w:pPr>
             <w:r>
-              <w:t xml:space="preserve">Fréquence générateur à 200 A</w:t>
+              <w:t xml:space="preserve">Fréquence générateur à 200 A ✔</w:t>
             </w:r>
           </w:p>
         </w:tc>
@@ -3833,18 +3705,28 @@
               <w:pStyle w:val="Compact"/>
             </w:pPr>
             <w:r>
-              <w:t xml:space="preserve">fréquence EM de A-3</w:t>
-            </w:r>
-          </w:p>
-        </w:tc>
-        <w:tc>
-          <w:tcPr/>
-          <w:p>
-            <w:pPr>
-              <w:pStyle w:val="Compact"/>
-            </w:pPr>
-            <w:r>
-              <w:t xml:space="preserve">1 lecture</w:t>
+              <w:rPr>
+                <w:b/>
+                <w:bCs/>
+              </w:rPr>
+              <w:t xml:space="preserve">383 kHz</w:t>
+            </w:r>
+            <w:r>
+              <w:t xml:space="preserve"> </w:t>
+            </w:r>
+            <w:r>
+              <w:t xml:space="preserve">(corr. A-3 préparée)</w:t>
+            </w:r>
+          </w:p>
+        </w:tc>
+        <w:tc>
+          <w:tcPr/>
+          <w:p>
+            <w:pPr>
+              <w:pStyle w:val="Compact"/>
+            </w:pPr>
+            <w:r>
+              <w:t xml:space="preserve">fait</w:t>
             </w:r>
           </w:p>
         </w:tc>
@@ -4385,7 +4267,7 @@
         </w:tc>
       </w:tr>
     </w:tbl>
-    <w:bookmarkEnd w:id="22"/>
+    <w:bookmarkEnd w:id="21"/>
     <w:sectPr>
       <w:footnotePr>
         <w:numRestart w:val="eachSect"/>

</xml_diff>

<commit_message>
Report exp 6/7 result into exp 7 fiche + journal
Reporte le résultat de la 1re cartographie bord->centre (2026-07-27) dans la
fiche exp 7 de mesures_a_realiser.md (bloc "Résultat partiel") et dans
journal_avancees.md (chronologie 27 juillet + résidu n°1) : vallée centrale du M
CONFIRMÉE, lobes de bord vraisemblablement sur-prédits, mais NON quantitatif
(géométrie non standard, TC1 mort, vidéo illisible) -> reprise propre à faire.
.docx régénéré.

Co-Authored-By: Claude Opus 4.8 <noreply@anthropic.com>
</commit_message>
<xml_diff>
--- a/docs/mesures_a_realiser.docx
+++ b/docs/mesures_a_realiser.docx
@@ -2615,6 +2615,184 @@
       </w:r>
       <w:r>
         <w:t xml:space="preserve">falsifier la cible chiffrée ci-dessus.</w:t>
+      </w:r>
+    </w:p>
+    <w:p>
+      <w:pPr>
+        <w:pStyle w:val="BlockText"/>
+      </w:pPr>
+      <w:r>
+        <w:t xml:space="preserve">▶</w:t>
+      </w:r>
+      <w:r>
+        <w:t xml:space="preserve"> </w:t>
+      </w:r>
+      <w:r>
+        <w:rPr>
+          <w:b/>
+          <w:bCs/>
+        </w:rPr>
+        <w:t xml:space="preserve">RÉSULTAT PARTIEL (2026-07-27).</w:t>
+      </w:r>
+      <w:r>
+        <w:t xml:space="preserve"> </w:t>
+      </w:r>
+      <w:r>
+        <w:t xml:space="preserve">Une première manip a été réalisée (déposée sous</w:t>
+      </w:r>
+      <w:r>
+        <w:t xml:space="preserve"> </w:t>
+      </w:r>
+      <w:r>
+        <w:rPr>
+          <w:rStyle w:val="VerbatimChar"/>
+        </w:rPr>
+        <w:t xml:space="preserve">data/exp6_diffusivite_2026-07-27/</w:t>
+      </w:r>
+      <w:r>
+        <w:t xml:space="preserve">, étiquetée « exp 6 » mais c’est bien CETTE cartographie).</w:t>
+      </w:r>
+      <w:r>
+        <w:t xml:space="preserve"> </w:t>
+      </w:r>
+      <w:r>
+        <w:t xml:space="preserve">5 TC en largeur au spot 3, 200 A. Analyse complète dans le README du dossier.</w:t>
+      </w:r>
+      <w:r>
+        <w:t xml:space="preserve"> </w:t>
+      </w:r>
+      <w:r>
+        <w:rPr>
+          <w:b/>
+          <w:bCs/>
+        </w:rPr>
+        <w:t xml:space="preserve">La vallée</w:t>
+      </w:r>
+      <w:r>
+        <w:rPr>
+          <w:b/>
+          <w:bCs/>
+        </w:rPr>
+        <w:t xml:space="preserve"> </w:t>
+      </w:r>
+      <w:r>
+        <w:rPr>
+          <w:b/>
+          <w:bCs/>
+        </w:rPr>
+        <w:t xml:space="preserve">centrale du M est CONFIRMÉE</w:t>
+      </w:r>
+      <w:r>
+        <w:t xml:space="preserve"> </w:t>
+      </w:r>
+      <w:r>
+        <w:t xml:space="preserve">: le centre (TC3, y=20) est un creux (101 °C, min local, plus</w:t>
+      </w:r>
+      <w:r>
+        <w:t xml:space="preserve"> </w:t>
+      </w:r>
+      <w:r>
+        <w:t xml:space="preserve">froid que ses voisins TC2=139/TC4=147) et le plus lent à monter (4,2 vs 9-14 °C/s). Les</w:t>
+      </w:r>
+      <w:r>
+        <w:t xml:space="preserve"> </w:t>
+      </w:r>
+      <w:r>
+        <w:rPr>
+          <w:b/>
+          <w:bCs/>
+        </w:rPr>
+        <w:t xml:space="preserve">lobes de bord semblent moins extrêmes que la prédiction</w:t>
+      </w:r>
+      <w:r>
+        <w:t xml:space="preserve"> </w:t>
+      </w:r>
+      <w:r>
+        <w:t xml:space="preserve">(chant ≈1,2× le voisin, modèle</w:t>
+      </w:r>
+      <w:r>
+        <w:t xml:space="preserve"> </w:t>
+      </w:r>
+      <w:r>
+        <w:t xml:space="preserve">≈2×) → indice que le modèle</w:t>
+      </w:r>
+      <w:r>
+        <w:t xml:space="preserve"> </w:t>
+      </w:r>
+      <w:r>
+        <w:rPr>
+          <w:b/>
+          <w:bCs/>
+        </w:rPr>
+        <w:t xml:space="preserve">sur-prédit les lobes</w:t>
+      </w:r>
+      <w:r>
+        <w:t xml:space="preserve"> </w:t>
+      </w:r>
+      <w:r>
+        <w:t xml:space="preserve">(M trop contrasté), cohérent avec le</w:t>
+      </w:r>
+      <w:r>
+        <w:t xml:space="preserve"> </w:t>
+      </w:r>
+      <w:r>
+        <w:t xml:space="preserve">point du chauffe (395 mesuré vs 292 prédit).</w:t>
+      </w:r>
+      <w:r>
+        <w:t xml:space="preserve"> </w:t>
+      </w:r>
+      <w:r>
+        <w:t xml:space="preserve">⚠</w:t>
+      </w:r>
+      <w:r>
+        <w:t xml:space="preserve"> </w:t>
+      </w:r>
+      <w:r>
+        <w:rPr>
+          <w:b/>
+          <w:bCs/>
+        </w:rPr>
+        <w:t xml:space="preserve">PAS une falsification quantitative</w:t>
+      </w:r>
+      <w:r>
+        <w:t xml:space="preserve"> </w:t>
+      </w:r>
+      <w:r>
+        <w:t xml:space="preserve">: céramique + pression retirées → gap ≈ 0 → source</w:t>
+      </w:r>
+      <w:r>
+        <w:t xml:space="preserve"> </w:t>
+      </w:r>
+      <w:r>
+        <w:t xml:space="preserve">EM différente du modèle (valeurs absolues non comparables à la cible) ; TC1 (un chant)</w:t>
+      </w:r>
+      <w:r>
+        <w:t xml:space="preserve"> </w:t>
+      </w:r>
+      <w:r>
+        <w:t xml:space="preserve">défaillant ; profil asymétrique (spot non centré) ; vidéo caméra illisible (MP4 non finalisé).</w:t>
+      </w:r>
+      <w:r>
+        <w:t xml:space="preserve"> </w:t>
+      </w:r>
+      <w:r>
+        <w:rPr>
+          <w:b/>
+          <w:bCs/>
+        </w:rPr>
+        <w:t xml:space="preserve">REPRISE PROPRE À FAIRE</w:t>
+      </w:r>
+      <w:r>
+        <w:t xml:space="preserve"> </w:t>
+      </w:r>
+      <w:r>
+        <w:t xml:space="preserve">: géométrie STANDARD (céramique en place), 5 TC valides à</w:t>
+      </w:r>
+      <w:r>
+        <w:t xml:space="preserve"> </w:t>
+      </w:r>
+      <w:r>
+        <w:t xml:space="preserve">l’interface, montage symétrique, enregistrement caméra finalisé (ou CSV radiométrique).</w:t>
       </w:r>
     </w:p>
     <w:bookmarkEnd w:id="14"/>

</xml_diff>

<commit_message>
Add 250A width-mapping essai: M-valley reproduced across two currents
2e essai bord->centre à 250 A (data/exp6_diffusivite_2026-07-27/250A 5TC
Camera.txt), même montage que le 200 A. La forme est IDENTIQUE aux deux
courants : creux net au centre (y=20), montée vers y=40, TC1 défaillant.
Contraste chant/centre = 1,88 (200 A) / 1,85 (250 A) -> stable et EN-DESSOUS du
2,46 prédit par le modèle. Le M-vallée n'est donc pas un aléa d'un essai : le
modèle SUR-CONTRASTE (lobes de bord sur-prédits), même sens que le point du
chauffe (395 vs 292).

Réserves inchangées (pas de falsification quantitative de l'amplitude) :
géométrie non standard (céramique + pression retirées, gap~0), TC1 mort, profil
asymétrique. Reprise propre à faire.

README dossier + fiche exp 7 + journal (chronologie + résidu n°1) MAJ ;
figure profil_largeur_200vs250.png ; .docx régénéré.

Co-Authored-By: Claude Opus 4.8 <noreply@anthropic.com>
</commit_message>
<xml_diff>
--- a/docs/mesures_a_realiser.docx
+++ b/docs/mesures_a_realiser.docx
@@ -2632,16 +2632,19 @@
           <w:b/>
           <w:bCs/>
         </w:rPr>
-        <w:t xml:space="preserve">RÉSULTAT PARTIEL (2026-07-27).</w:t>
-      </w:r>
-      <w:r>
-        <w:t xml:space="preserve"> </w:t>
-      </w:r>
-      <w:r>
-        <w:t xml:space="preserve">Une première manip a été réalisée (déposée sous</w:t>
-      </w:r>
-      <w:r>
-        <w:t xml:space="preserve"> </w:t>
+        <w:t xml:space="preserve">RÉSULTAT PARTIEL — REPRODUIT sur 2 courants (2026-07-27).</w:t>
+      </w:r>
+      <w:r>
+        <w:t xml:space="preserve"> </w:t>
+      </w:r>
+      <w:r>
+        <w:t xml:space="preserve">Deux manips réalisées</w:t>
+      </w:r>
+      <w:r>
+        <w:t xml:space="preserve"> </w:t>
+      </w:r>
+      <w:r>
+        <w:t xml:space="preserve">(</w:t>
       </w:r>
       <w:r>
         <w:rPr>
@@ -2650,93 +2653,122 @@
         <w:t xml:space="preserve">data/exp6_diffusivite_2026-07-27/</w:t>
       </w:r>
       <w:r>
-        <w:t xml:space="preserve">, étiquetée « exp 6 » mais c’est bien CETTE cartographie).</w:t>
-      </w:r>
-      <w:r>
-        <w:t xml:space="preserve"> </w:t>
-      </w:r>
-      <w:r>
-        <w:t xml:space="preserve">5 TC en largeur au spot 3, 200 A. Analyse complète dans le README du dossier.</w:t>
-      </w:r>
-      <w:r>
-        <w:t xml:space="preserve"> </w:t>
-      </w:r>
-      <w:r>
-        <w:rPr>
-          <w:b/>
-          <w:bCs/>
-        </w:rPr>
-        <w:t xml:space="preserve">La vallée</w:t>
-      </w:r>
-      <w:r>
-        <w:rPr>
-          <w:b/>
-          <w:bCs/>
-        </w:rPr>
-        <w:t xml:space="preserve"> </w:t>
-      </w:r>
-      <w:r>
-        <w:rPr>
-          <w:b/>
-          <w:bCs/>
-        </w:rPr>
-        <w:t xml:space="preserve">centrale du M est CONFIRMÉE</w:t>
-      </w:r>
-      <w:r>
-        <w:t xml:space="preserve"> </w:t>
-      </w:r>
-      <w:r>
-        <w:t xml:space="preserve">: le centre (TC3, y=20) est un creux (101 °C, min local, plus</w:t>
-      </w:r>
-      <w:r>
-        <w:t xml:space="preserve"> </w:t>
-      </w:r>
-      <w:r>
-        <w:t xml:space="preserve">froid que ses voisins TC2=139/TC4=147) et le plus lent à monter (4,2 vs 9-14 °C/s). Les</w:t>
-      </w:r>
-      <w:r>
-        <w:t xml:space="preserve"> </w:t>
-      </w:r>
-      <w:r>
-        <w:rPr>
-          <w:b/>
-          <w:bCs/>
-        </w:rPr>
-        <w:t xml:space="preserve">lobes de bord semblent moins extrêmes que la prédiction</w:t>
-      </w:r>
-      <w:r>
-        <w:t xml:space="preserve"> </w:t>
-      </w:r>
-      <w:r>
-        <w:t xml:space="preserve">(chant ≈1,2× le voisin, modèle</w:t>
-      </w:r>
-      <w:r>
-        <w:t xml:space="preserve"> </w:t>
-      </w:r>
-      <w:r>
-        <w:t xml:space="preserve">≈2×) → indice que le modèle</w:t>
-      </w:r>
-      <w:r>
-        <w:t xml:space="preserve"> </w:t>
-      </w:r>
-      <w:r>
-        <w:rPr>
-          <w:b/>
-          <w:bCs/>
-        </w:rPr>
-        <w:t xml:space="preserve">sur-prédit les lobes</w:t>
-      </w:r>
-      <w:r>
-        <w:t xml:space="preserve"> </w:t>
-      </w:r>
-      <w:r>
-        <w:t xml:space="preserve">(M trop contrasté), cohérent avec le</w:t>
-      </w:r>
-      <w:r>
-        <w:t xml:space="preserve"> </w:t>
-      </w:r>
-      <w:r>
-        <w:t xml:space="preserve">point du chauffe (395 mesuré vs 292 prédit).</w:t>
+        <w:t xml:space="preserve">, étiquetées « exp 6 » mais c’est bien CETTE</w:t>
+      </w:r>
+      <w:r>
+        <w:t xml:space="preserve"> </w:t>
+      </w:r>
+      <w:r>
+        <w:t xml:space="preserve">cartographie) : 5 TC en largeur au spot 3,</w:t>
+      </w:r>
+      <w:r>
+        <w:t xml:space="preserve"> </w:t>
+      </w:r>
+      <w:r>
+        <w:rPr>
+          <w:b/>
+          <w:bCs/>
+        </w:rPr>
+        <w:t xml:space="preserve">200 A puis 250 A</w:t>
+      </w:r>
+      <w:r>
+        <w:t xml:space="preserve">.</w:t>
+      </w:r>
+      <w:r>
+        <w:t xml:space="preserve"> </w:t>
+      </w:r>
+      <w:r>
+        <w:rPr>
+          <w:b/>
+          <w:bCs/>
+        </w:rPr>
+        <w:t xml:space="preserve">La vallée centrale du M</w:t>
+      </w:r>
+      <w:r>
+        <w:rPr>
+          <w:b/>
+          <w:bCs/>
+        </w:rPr>
+        <w:t xml:space="preserve"> </w:t>
+      </w:r>
+      <w:r>
+        <w:rPr>
+          <w:b/>
+          <w:bCs/>
+        </w:rPr>
+        <w:t xml:space="preserve">est CONFIRMÉE et reproduite</w:t>
+      </w:r>
+      <w:r>
+        <w:t xml:space="preserve"> </w:t>
+      </w:r>
+      <w:r>
+        <w:t xml:space="preserve">: à 200 comme à 250 A, le centre (y=20) est un creux (min local,</w:t>
+      </w:r>
+      <w:r>
+        <w:t xml:space="preserve"> </w:t>
+      </w:r>
+      <w:r>
+        <w:t xml:space="preserve">plus froid que ses voisins) et le plus lent à monter.</w:t>
+      </w:r>
+      <w:r>
+        <w:t xml:space="preserve"> </w:t>
+      </w:r>
+      <w:r>
+        <w:rPr>
+          <w:b/>
+          <w:bCs/>
+        </w:rPr>
+        <w:t xml:space="preserve">Le modèle SUR-CONTRASTE</w:t>
+      </w:r>
+      <w:r>
+        <w:t xml:space="preserve"> </w:t>
+      </w:r>
+      <w:r>
+        <w:t xml:space="preserve">: contraste</w:t>
+      </w:r>
+      <w:r>
+        <w:t xml:space="preserve"> </w:t>
+      </w:r>
+      <w:r>
+        <w:t xml:space="preserve">chant/centre mesuré</w:t>
+      </w:r>
+      <w:r>
+        <w:t xml:space="preserve"> </w:t>
+      </w:r>
+      <w:r>
+        <w:rPr>
+          <w:b/>
+          <w:bCs/>
+        </w:rPr>
+        <w:t xml:space="preserve">1,88 (200 A) / 1,85 (250 A)</w:t>
+      </w:r>
+      <w:r>
+        <w:t xml:space="preserve"> </w:t>
+      </w:r>
+      <w:r>
+        <w:t xml:space="preserve">vs</w:t>
+      </w:r>
+      <w:r>
+        <w:t xml:space="preserve"> </w:t>
+      </w:r>
+      <w:r>
+        <w:rPr>
+          <w:b/>
+          <w:bCs/>
+        </w:rPr>
+        <w:t xml:space="preserve">2,46 prédit</w:t>
+      </w:r>
+      <w:r>
+        <w:t xml:space="preserve"> </w:t>
+      </w:r>
+      <w:r>
+        <w:t xml:space="preserve">— même sens que le point</w:t>
+      </w:r>
+      <w:r>
+        <w:t xml:space="preserve"> </w:t>
+      </w:r>
+      <w:r>
+        <w:t xml:space="preserve">du chauffe (395 mesuré vs 292 prédit). Analyse complète : README du dossier.</w:t>
       </w:r>
       <w:r>
         <w:t xml:space="preserve"> </w:t>
@@ -2752,25 +2784,31 @@
           <w:b/>
           <w:bCs/>
         </w:rPr>
-        <w:t xml:space="preserve">PAS une falsification quantitative</w:t>
-      </w:r>
-      <w:r>
-        <w:t xml:space="preserve"> </w:t>
-      </w:r>
-      <w:r>
-        <w:t xml:space="preserve">: céramique + pression retirées → gap ≈ 0 → source</w:t>
-      </w:r>
-      <w:r>
-        <w:t xml:space="preserve"> </w:t>
-      </w:r>
-      <w:r>
-        <w:t xml:space="preserve">EM différente du modèle (valeurs absolues non comparables à la cible) ; TC1 (un chant)</w:t>
-      </w:r>
-      <w:r>
-        <w:t xml:space="preserve"> </w:t>
-      </w:r>
-      <w:r>
-        <w:t xml:space="preserve">défaillant ; profil asymétrique (spot non centré) ; vidéo caméra illisible (MP4 non finalisé).</w:t>
+        <w:t xml:space="preserve">PAS une falsification quantitative de l’AMPLITUDE</w:t>
+      </w:r>
+      <w:r>
+        <w:t xml:space="preserve"> </w:t>
+      </w:r>
+      <w:r>
+        <w:t xml:space="preserve">: céramique + pression retirées → gap</w:t>
+      </w:r>
+      <w:r>
+        <w:t xml:space="preserve"> </w:t>
+      </w:r>
+      <w:r>
+        <w:t xml:space="preserve">≈ 0 → source EM différente du modèle (absolus non comparables à la cible) ; TC1 (un chant)</w:t>
+      </w:r>
+      <w:r>
+        <w:t xml:space="preserve"> </w:t>
+      </w:r>
+      <w:r>
+        <w:t xml:space="preserve">défaillant dans les deux ; profil asymétrique (spot non centré) ; vidéo 200 A illisible (MP4</w:t>
+      </w:r>
+      <w:r>
+        <w:t xml:space="preserve"> </w:t>
+      </w:r>
+      <w:r>
+        <w:t xml:space="preserve">non finalisé).</w:t>
       </w:r>
       <w:r>
         <w:t xml:space="preserve"> </w:t>
@@ -2786,13 +2824,13 @@
         <w:t xml:space="preserve"> </w:t>
       </w:r>
       <w:r>
-        <w:t xml:space="preserve">: géométrie STANDARD (céramique en place), 5 TC valides à</w:t>
-      </w:r>
-      <w:r>
-        <w:t xml:space="preserve"> </w:t>
-      </w:r>
-      <w:r>
-        <w:t xml:space="preserve">l’interface, montage symétrique, enregistrement caméra finalisé (ou CSV radiométrique).</w:t>
+        <w:t xml:space="preserve">: géométrie STANDARD (céramique en place), 5 TC</w:t>
+      </w:r>
+      <w:r>
+        <w:t xml:space="preserve"> </w:t>
+      </w:r>
+      <w:r>
+        <w:t xml:space="preserve">valides à l’interface, montage symétrique, enregistrement caméra finalisé (ou CSV radiométrique).</w:t>
       </w:r>
     </w:p>
     <w:bookmarkEnd w:id="14"/>

</xml_diff>

<commit_message>
Plan exp 7 clean rerun (2026-07-28) with ceramic — checklist in fiche
La reprise propre de la cartographie bord->centre est prévue le 28 juillet.
Ajoute une checklist actionnable dans la fiche exp 7 (céramique en place = gap
standard, 5 TC interface valides + TC1 remplacé, montage centré/symétrique,
250 A, caméra finalisée ou CSV radiométrique, dossier data/exp7_*) et met à jour
la recommandation en conséquence. .docx régénéré.

Co-Authored-By: Claude Opus 4.8 <noreply@anthropic.com>
</commit_message>
<xml_diff>
--- a/docs/mesures_a_realiser.docx
+++ b/docs/mesures_a_realiser.docx
@@ -2833,744 +2833,40 @@
         <w:t xml:space="preserve">valides à l’interface, montage symétrique, enregistrement caméra finalisé (ou CSV radiométrique).</w:t>
       </w:r>
     </w:p>
-    <w:bookmarkEnd w:id="14"/>
-    <w:bookmarkStart w:id="15" w:name="X3c1cdae2de844c3576b3855646d50728992e02e"/>
-    <w:p>
-      <w:pPr>
-        <w:pStyle w:val="Heading3"/>
-      </w:pPr>
-      <w:r>
-        <w:t xml:space="preserve">Expérience 8. Température de la face active du concentrateur</w:t>
-      </w:r>
-    </w:p>
-    <w:p>
-      <w:pPr>
-        <w:pStyle w:val="FirstParagraph"/>
-      </w:pPr>
-      <w:r>
-        <w:rPr>
-          <w:b/>
-          <w:bCs/>
-        </w:rPr>
-        <w:t xml:space="preserve">Objectif.</w:t>
-      </w:r>
-      <w:r>
-        <w:t xml:space="preserve"> </w:t>
-      </w:r>
-      <w:r>
-        <w:t xml:space="preserve">Mesurer la température du concentrateur pendant une chauffe.</w:t>
-      </w:r>
-    </w:p>
-    <w:p>
-      <w:pPr>
-        <w:pStyle w:val="BodyText"/>
-      </w:pPr>
-      <w:r>
-        <w:rPr>
-          <w:b/>
-          <w:bCs/>
-        </w:rPr>
-        <w:t xml:space="preserve">Méthode.</w:t>
-      </w:r>
-      <w:r>
-        <w:t xml:space="preserve"> </w:t>
-      </w:r>
-      <w:r>
-        <w:t xml:space="preserve">La caméra FLIR A700 pointée sur la face active du CFC, ou un thermocouple posé</w:t>
-      </w:r>
-      <w:r>
-        <w:t xml:space="preserve"> </w:t>
-      </w:r>
-      <w:r>
-        <w:t xml:space="preserve">dessus.</w:t>
-      </w:r>
-    </w:p>
-    <w:p>
-      <w:pPr>
-        <w:pStyle w:val="BodyText"/>
-      </w:pPr>
-      <w:r>
-        <w:rPr>
-          <w:b/>
-          <w:bCs/>
-        </w:rPr>
-        <w:t xml:space="preserve">Paramètre du modèle résolu.</w:t>
-      </w:r>
-      <w:r>
-        <w:t xml:space="preserve"> </w:t>
-      </w:r>
-      <w:r>
-        <w:t xml:space="preserve">Le déficit de chauffe en surface (TC1). Aucun essai actuel ne</w:t>
-      </w:r>
-      <w:r>
-        <w:t xml:space="preserve"> </w:t>
-      </w:r>
-      <w:r>
-        <w:t xml:space="preserve">mesure la température du concentrateur lui-même.</w:t>
-      </w:r>
-    </w:p>
-    <w:p>
-      <w:pPr>
-        <w:pStyle w:val="BodyText"/>
-      </w:pPr>
-      <w:r>
-        <w:rPr>
-          <w:b/>
-          <w:bCs/>
-        </w:rPr>
-        <w:t xml:space="preserve">Gain attendu.</w:t>
-      </w:r>
-      <w:r>
-        <w:t xml:space="preserve"> </w:t>
-      </w:r>
-      <w:r>
-        <w:t xml:space="preserve">Seule mesure capable de discriminer les causes du déficit de surface. La</w:t>
-      </w:r>
-      <w:r>
-        <w:t xml:space="preserve"> </w:t>
-      </w:r>
-      <w:r>
-        <w:t xml:space="preserve">caméra est déjà disponible au laboratoire.</w:t>
-      </w:r>
-    </w:p>
-    <w:p>
-      <w:pPr>
-        <w:pStyle w:val="BodyText"/>
-      </w:pPr>
-      <w:r>
-        <w:rPr>
-          <w:b/>
-          <w:bCs/>
-        </w:rPr>
-        <w:t xml:space="preserve">Temps estimé.</w:t>
-      </w:r>
-      <w:r>
-        <w:t xml:space="preserve"> </w:t>
-      </w:r>
-      <w:r>
-        <w:t xml:space="preserve">Un essai avec la caméra.</w:t>
-      </w:r>
-    </w:p>
-    <w:p>
-      <w:pPr>
-        <w:pStyle w:val="BodyText"/>
-      </w:pPr>
-      <w:r>
-        <w:rPr>
-          <w:b/>
-          <w:bCs/>
-        </w:rPr>
-        <w:t xml:space="preserve">Réponse (utilisateur, 2026-07-27) :</w:t>
-      </w:r>
-      <w:r>
-        <w:t xml:space="preserve"> </w:t>
-      </w:r>
-      <w:r>
-        <w:t xml:space="preserve">« Je vais réaliser l’expérience demain ou cet</w:t>
-      </w:r>
-      <w:r>
-        <w:t xml:space="preserve"> </w:t>
-      </w:r>
-      <w:r>
-        <w:t xml:space="preserve">après-midi. »</w:t>
-      </w:r>
-    </w:p>
     <w:p>
       <w:pPr>
         <w:pStyle w:val="BlockText"/>
       </w:pPr>
       <w:r>
-        <w:t xml:space="preserve">→ Parfait. La caméra vue de dessus (ton idée pour les exp 6/7) est</w:t>
-      </w:r>
-      <w:r>
-        <w:t xml:space="preserve"> </w:t>
-      </w:r>
-      <w:r>
-        <w:rPr>
-          <w:b/>
-          <w:bCs/>
-        </w:rPr>
-        <w:t xml:space="preserve">idéale ici</w:t>
-      </w:r>
-      <w:r>
-        <w:t xml:space="preserve"> </w:t>
-      </w:r>
-      <w:r>
-        <w:t xml:space="preserve">: la face</w:t>
-      </w:r>
-      <w:r>
-        <w:t xml:space="preserve"> </w:t>
-      </w:r>
-      <w:r>
-        <w:t xml:space="preserve">active du CFC est directement visible. Vise une acquisition pendant une chauffe simple spot ;</w:t>
-      </w:r>
-      <w:r>
-        <w:t xml:space="preserve"> </w:t>
-      </w:r>
-      <w:r>
-        <w:t xml:space="preserve">compare la montée du CFC à celle de TC1 (surface) — c’est la seule mesure qui attaque le</w:t>
-      </w:r>
-      <w:r>
-        <w:t xml:space="preserve"> </w:t>
-      </w:r>
-      <w:r>
-        <w:t xml:space="preserve">déficit de chauffe en surface.</w:t>
-      </w:r>
-    </w:p>
-    <w:p>
-      <w:r>
-        <w:pict>
-          <v:rect style="width:0;height:1.5pt" o:hralign="center" o:hrstd="t" o:hr="t"/>
-        </w:pict>
-      </w:r>
-    </w:p>
-    <w:bookmarkEnd w:id="15"/>
-    <w:bookmarkEnd w:id="16"/>
-    <w:bookmarkStart w:id="19" w:name="Xbd611265407e50f203bfabccbfdafc710a5ac1e"/>
-    <w:p>
-      <w:pPr>
-        <w:pStyle w:val="Heading2"/>
-      </w:pPr>
-      <w:r>
-        <w:t xml:space="preserve">Niveau 3. Mesures de propriété (appareil de laboratoire)</w:t>
-      </w:r>
-    </w:p>
-    <w:bookmarkStart w:id="17" w:name="X65c8a4b8084d57e4184b75723c3c30610e8e8a5"/>
-    <w:p>
-      <w:pPr>
-        <w:pStyle w:val="Heading3"/>
-      </w:pPr>
-      <w:r>
-        <w:t xml:space="preserve">Mesure 9. Conductivité thermique dans le plan du laminé</w:t>
-      </w:r>
-    </w:p>
-    <w:p>
-      <w:pPr>
-        <w:pStyle w:val="FirstParagraph"/>
-      </w:pPr>
-      <w:r>
-        <w:rPr>
-          <w:b/>
-          <w:bCs/>
-        </w:rPr>
-        <w:t xml:space="preserve">Objectif.</w:t>
-      </w:r>
-      <w:r>
-        <w:t xml:space="preserve"> </w:t>
-      </w:r>
-      <w:r>
-        <w:t xml:space="preserve">Mesurer directement la conductivité thermique dans le plan du CF/PEKK.</w:t>
-      </w:r>
-    </w:p>
-    <w:p>
-      <w:pPr>
-        <w:pStyle w:val="BodyText"/>
-      </w:pPr>
-      <w:r>
-        <w:rPr>
-          <w:b/>
-          <w:bCs/>
-        </w:rPr>
-        <w:t xml:space="preserve">Méthode.</w:t>
-      </w:r>
-      <w:r>
-        <w:t xml:space="preserve"> </w:t>
-      </w:r>
-      <w:r>
-        <w:t xml:space="preserve">Flash laser ou disque chaud (hot-disk) sur un échantillon de laminé.</w:t>
-      </w:r>
-    </w:p>
-    <w:p>
-      <w:pPr>
-        <w:pStyle w:val="BodyText"/>
-      </w:pPr>
-      <w:r>
-        <w:rPr>
-          <w:b/>
-          <w:bCs/>
-        </w:rPr>
-        <w:t xml:space="preserve">Paramètre du modèle résolu.</w:t>
-      </w:r>
-      <w:r>
-        <w:t xml:space="preserve"> </w:t>
-      </w:r>
-      <w:r>
-        <w:t xml:space="preserve">La conductivité</w:t>
-      </w:r>
-      <w:r>
-        <w:t xml:space="preserve"> </w:t>
-      </w:r>
-      <w:r>
-        <w:rPr>
-          <w:rStyle w:val="VerbatimChar"/>
-        </w:rPr>
-        <w:t xml:space="preserve">k_plan</w:t>
-      </w:r>
-      <w:r>
-        <w:t xml:space="preserve">, la même que l’expérience 6 attaque</w:t>
-      </w:r>
-      <w:r>
-        <w:t xml:space="preserve"> </w:t>
-      </w:r>
-      <w:r>
-        <w:t xml:space="preserve">sur le banc.</w:t>
-      </w:r>
-    </w:p>
-    <w:p>
-      <w:pPr>
-        <w:pStyle w:val="BodyText"/>
-      </w:pPr>
-      <w:r>
-        <w:rPr>
-          <w:b/>
-          <w:bCs/>
-        </w:rPr>
-        <w:t xml:space="preserve">Gain attendu.</w:t>
-      </w:r>
-      <w:r>
-        <w:t xml:space="preserve"> </w:t>
-      </w:r>
-      <w:r>
-        <w:t xml:space="preserve">Transforme un</w:t>
-      </w:r>
-      <w:r>
-        <w:t xml:space="preserve"> </w:t>
-      </w:r>
-      <w:r>
-        <w:rPr>
-          <w:rStyle w:val="VerbatimChar"/>
-        </w:rPr>
-        <w:t xml:space="preserve">k_plan</w:t>
-      </w:r>
-      <w:r>
-        <w:t xml:space="preserve"> </w:t>
-      </w:r>
-      <w:r>
-        <w:t xml:space="preserve">assumé en propriété sourcée. L’écart d’un facteur 3</w:t>
-      </w:r>
-      <w:r>
-        <w:t xml:space="preserve"> </w:t>
-      </w:r>
-      <w:r>
-        <w:t xml:space="preserve">qui semblait requis le 23 juillet au matin ne l’est plus (voir l’encadré de tête), mais la</w:t>
-      </w:r>
-      <w:r>
-        <w:t xml:space="preserve"> </w:t>
-      </w:r>
-      <w:r>
-        <w:t xml:space="preserve">valeur homogénéisée de 3 W/m·K reste, elle, non vérifiée expérimentalement.</w:t>
-      </w:r>
-    </w:p>
-    <w:p>
-      <w:pPr>
-        <w:pStyle w:val="BodyText"/>
-      </w:pPr>
-      <w:r>
-        <w:rPr>
-          <w:b/>
-          <w:bCs/>
-        </w:rPr>
-        <w:t xml:space="preserve">Temps estimé.</w:t>
-      </w:r>
-      <w:r>
-        <w:t xml:space="preserve"> </w:t>
-      </w:r>
-      <w:r>
-        <w:t xml:space="preserve">Préparation d’échantillon plus appareil dédié. L’expérience 6 en est le</w:t>
-      </w:r>
-      <w:r>
-        <w:t xml:space="preserve"> </w:t>
-      </w:r>
-      <w:r>
-        <w:t xml:space="preserve">substitut rapide sur le banc du laboratoire.</w:t>
-      </w:r>
-    </w:p>
-    <w:p>
-      <w:pPr>
-        <w:pStyle w:val="BodyText"/>
-      </w:pPr>
-      <w:r>
-        <w:rPr>
-          <w:b/>
-          <w:bCs/>
-        </w:rPr>
-        <w:t xml:space="preserve">Réponse (utilisateur, 2026-07-27) :</w:t>
-      </w:r>
-      <w:r>
-        <w:t xml:space="preserve"> </w:t>
-      </w:r>
-      <w:r>
-        <w:t xml:space="preserve">« J’ai pas compris cette expérience. »</w:t>
-      </w:r>
-    </w:p>
-    <w:p>
-      <w:pPr>
-        <w:pStyle w:val="BlockText"/>
-      </w:pPr>
-      <w:r>
-        <w:t xml:space="preserve">→</w:t>
-      </w:r>
-      <w:r>
-        <w:t xml:space="preserve"> </w:t>
-      </w:r>
-      <w:r>
-        <w:rPr>
-          <w:b/>
-          <w:bCs/>
-        </w:rPr>
-        <w:t xml:space="preserve">Précision.</w:t>
-      </w:r>
-      <w:r>
-        <w:t xml:space="preserve"> </w:t>
-      </w:r>
-      <w:r>
-        <w:t xml:space="preserve">C’est une mesure d’</w:t>
-      </w:r>
-      <w:r>
-        <w:rPr>
-          <w:b/>
-          <w:bCs/>
-        </w:rPr>
-        <w:t xml:space="preserve">appareil de labo</w:t>
-      </w:r>
-      <w:r>
-        <w:t xml:space="preserve"> </w:t>
-      </w:r>
-      <w:r>
-        <w:t xml:space="preserve">(hot-disk ou flash laser), pas sur</w:t>
-      </w:r>
-      <w:r>
-        <w:t xml:space="preserve"> </w:t>
-      </w:r>
-      <w:r>
-        <w:t xml:space="preserve">le banc de soudage : on dépose une impulsion de chaleur sur un petit</w:t>
-      </w:r>
-      <w:r>
-        <w:t xml:space="preserve"> </w:t>
-      </w:r>
-      <w:r>
-        <w:rPr>
-          <w:b/>
-          <w:bCs/>
-        </w:rPr>
-        <w:t xml:space="preserve">échantillon de</w:t>
-      </w:r>
-      <w:r>
-        <w:rPr>
-          <w:b/>
-          <w:bCs/>
-        </w:rPr>
-        <w:t xml:space="preserve"> </w:t>
-      </w:r>
-      <w:r>
-        <w:rPr>
-          <w:b/>
-          <w:bCs/>
-        </w:rPr>
-        <w:t xml:space="preserve">matière</w:t>
-      </w:r>
-      <w:r>
-        <w:t xml:space="preserve"> </w:t>
-      </w:r>
-      <w:r>
-        <w:t xml:space="preserve">et on chronomètre sa vitesse d’étalement → on en déduit la conductivité thermique</w:t>
-      </w:r>
-      <w:r>
-        <w:t xml:space="preserve"> </w:t>
-      </w:r>
-      <w:r>
-        <w:t xml:space="preserve">dans le plan</w:t>
-      </w:r>
-      <w:r>
-        <w:t xml:space="preserve"> </w:t>
-      </w:r>
-      <w:r>
-        <w:rPr>
-          <w:rStyle w:val="VerbatimChar"/>
-        </w:rPr>
-        <w:t xml:space="preserve">k_plan</w:t>
-      </w:r>
-      <w:r>
-        <w:t xml:space="preserve">. L’</w:t>
-      </w:r>
-      <w:r>
-        <w:rPr>
-          <w:b/>
-          <w:bCs/>
-        </w:rPr>
-        <w:t xml:space="preserve">expérience 6</w:t>
-      </w:r>
-      <w:r>
-        <w:t xml:space="preserve"> </w:t>
-      </w:r>
-      <w:r>
-        <w:t xml:space="preserve">(spot + TC en ligne sur le banc) en est le</w:t>
-      </w:r>
-      <w:r>
-        <w:t xml:space="preserve"> </w:t>
-      </w:r>
-      <w:r>
-        <w:t xml:space="preserve">substitut « maison ». Non prioritaire : sers-toi de l’exp 6 si tu veux vérifier</w:t>
-      </w:r>
-      <w:r>
-        <w:t xml:space="preserve"> </w:t>
-      </w:r>
-      <w:r>
-        <w:rPr>
-          <w:rStyle w:val="VerbatimChar"/>
-        </w:rPr>
-        <w:t xml:space="preserve">k_plan</w:t>
-      </w:r>
-      <w:r>
-        <w:t xml:space="preserve">.</w:t>
-      </w:r>
-    </w:p>
-    <w:bookmarkEnd w:id="17"/>
-    <w:bookmarkStart w:id="18" w:name="Xbcbfbd036e1830f701e3e206f87ccdb9e70e470"/>
-    <w:p>
-      <w:pPr>
-        <w:pStyle w:val="Heading3"/>
-      </w:pPr>
-      <w:r>
-        <w:t xml:space="preserve">Mesure 10. Conductivité électrique en fonction de la température σ(T)</w:t>
-      </w:r>
-    </w:p>
-    <w:p>
-      <w:pPr>
-        <w:pStyle w:val="FirstParagraph"/>
-      </w:pPr>
-      <w:r>
-        <w:rPr>
-          <w:b/>
-          <w:bCs/>
-        </w:rPr>
-        <w:t xml:space="preserve">Objectif.</w:t>
-      </w:r>
-      <w:r>
-        <w:t xml:space="preserve"> </w:t>
-      </w:r>
-      <w:r>
-        <w:t xml:space="preserve">Mesurer la dépendance en température de la conductivité électrique du laminé et</w:t>
-      </w:r>
-      <w:r>
-        <w:t xml:space="preserve"> </w:t>
-      </w:r>
-      <w:r>
-        <w:t xml:space="preserve">du twill.</w:t>
-      </w:r>
-    </w:p>
-    <w:p>
-      <w:pPr>
-        <w:pStyle w:val="BodyText"/>
-      </w:pPr>
-      <w:r>
-        <w:rPr>
-          <w:b/>
-          <w:bCs/>
-        </w:rPr>
-        <w:t xml:space="preserve">Méthode.</w:t>
-      </w:r>
-      <w:r>
-        <w:t xml:space="preserve"> </w:t>
-      </w:r>
-      <w:r>
-        <w:t xml:space="preserve">Mesure quatre pointes en montée en température.</w:t>
-      </w:r>
-    </w:p>
-    <w:p>
-      <w:pPr>
-        <w:pStyle w:val="BodyText"/>
-      </w:pPr>
-      <w:r>
-        <w:rPr>
-          <w:b/>
-          <w:bCs/>
-        </w:rPr>
-        <w:t xml:space="preserve">Paramètre du modèle résolu.</w:t>
-      </w:r>
-      <w:r>
-        <w:t xml:space="preserve"> </w:t>
-      </w:r>
-      <w:r>
-        <w:t xml:space="preserve">La dépendance σ(T), aujourd’hui absente (σ pris constant).</w:t>
-      </w:r>
-    </w:p>
-    <w:p>
-      <w:pPr>
-        <w:pStyle w:val="BodyText"/>
-      </w:pPr>
-      <w:r>
-        <w:rPr>
-          <w:b/>
-          <w:bCs/>
-        </w:rPr>
-        <w:t xml:space="preserve">Gain attendu.</w:t>
-      </w:r>
-      <w:r>
-        <w:t xml:space="preserve"> </w:t>
-      </w:r>
-      <w:r>
-        <w:t xml:space="preserve">Explique qu’un facteur d’échelle unique ne colle pas simultanément à la</w:t>
-      </w:r>
-      <w:r>
-        <w:t xml:space="preserve"> </w:t>
-      </w:r>
-      <w:r>
-        <w:t xml:space="preserve">montée, au pic et à la descente. O’Shaughnessey (2014) et Duhovic et al. (2012) recommandent</w:t>
-      </w:r>
-      <w:r>
-        <w:t xml:space="preserve"> </w:t>
-      </w:r>
-      <w:r>
-        <w:t xml:space="preserve">cette prise en compte.</w:t>
-      </w:r>
-    </w:p>
-    <w:p>
-      <w:pPr>
-        <w:pStyle w:val="BodyText"/>
-      </w:pPr>
-      <w:r>
-        <w:rPr>
-          <w:b/>
-          <w:bCs/>
-        </w:rPr>
-        <w:t xml:space="preserve">Temps estimé.</w:t>
-      </w:r>
-      <w:r>
-        <w:t xml:space="preserve"> </w:t>
-      </w:r>
-      <w:r>
-        <w:t xml:space="preserve">Mesure plus difficile, à réserver si les niveaux 1 et 2 ne suffisent pas.</w:t>
-      </w:r>
-    </w:p>
-    <w:p>
-      <w:pPr>
-        <w:pStyle w:val="BodyText"/>
-      </w:pPr>
-      <w:r>
-        <w:rPr>
-          <w:b/>
-          <w:bCs/>
-        </w:rPr>
-        <w:t xml:space="preserve">Réponse (utilisateur, 2026-07-27) :</w:t>
-      </w:r>
-      <w:r>
-        <w:t xml:space="preserve"> </w:t>
-      </w:r>
-      <w:r>
-        <w:t xml:space="preserve">« J’ai pas compris cette expérience non plus. »</w:t>
-      </w:r>
-    </w:p>
-    <w:p>
-      <w:pPr>
-        <w:pStyle w:val="BlockText"/>
-      </w:pPr>
-      <w:r>
-        <w:t xml:space="preserve">→</w:t>
-      </w:r>
-      <w:r>
-        <w:t xml:space="preserve"> </w:t>
-      </w:r>
-      <w:r>
-        <w:rPr>
-          <w:b/>
-          <w:bCs/>
-        </w:rPr>
-        <w:t xml:space="preserve">Précision.</w:t>
-      </w:r>
-      <w:r>
-        <w:t xml:space="preserve"> </w:t>
-      </w:r>
-      <w:r>
-        <w:t xml:space="preserve">Mesure</w:t>
-      </w:r>
-      <w:r>
-        <w:t xml:space="preserve"> </w:t>
-      </w:r>
-      <w:r>
-        <w:rPr>
-          <w:b/>
-          <w:bCs/>
-        </w:rPr>
-        <w:t xml:space="preserve">4 pointes</w:t>
-      </w:r>
-      <w:r>
-        <w:t xml:space="preserve"> </w:t>
-      </w:r>
-      <w:r>
-        <w:t xml:space="preserve">(van der Pauw) sur un échantillon de laminé/twill que</w:t>
-      </w:r>
-      <w:r>
-        <w:t xml:space="preserve"> </w:t>
-      </w:r>
-      <w:r>
-        <w:t xml:space="preserve">l’on chauffe progressivement : on lit la résistance électrique à chaque température, ce qui</w:t>
-      </w:r>
-      <w:r>
-        <w:t xml:space="preserve"> </w:t>
-      </w:r>
-      <w:r>
-        <w:t xml:space="preserve">donne σ(T), la variation de la conductivité électrique avec la température. Le modèle prend</w:t>
-      </w:r>
-      <w:r>
-        <w:t xml:space="preserve"> </w:t>
-      </w:r>
-      <w:r>
-        <w:t xml:space="preserve">aujourd’hui σ</w:t>
-      </w:r>
-      <w:r>
-        <w:t xml:space="preserve"> </w:t>
-      </w:r>
-      <w:r>
-        <w:rPr>
-          <w:b/>
-          <w:bCs/>
-        </w:rPr>
-        <w:t xml:space="preserve">constante</w:t>
-      </w:r>
-      <w:r>
-        <w:t xml:space="preserve"> </w:t>
-      </w:r>
-      <w:r>
-        <w:t xml:space="preserve">; en réalité elle change avec T, ce qui explique en partie qu’un</w:t>
-      </w:r>
-      <w:r>
-        <w:t xml:space="preserve"> </w:t>
-      </w:r>
-      <w:r>
-        <w:t xml:space="preserve">facteur d’échelle unique ne colle pas à la fois à la montée, au pic et à la descente. Mesure</w:t>
-      </w:r>
-      <w:r>
-        <w:t xml:space="preserve"> </w:t>
-      </w:r>
-      <w:r>
-        <w:t xml:space="preserve">la plus lourde des dix, à réserver si les niveaux 1-2 ne suffisent pas.</w:t>
-      </w:r>
-    </w:p>
-    <w:p>
-      <w:r>
-        <w:pict>
-          <v:rect style="width:0;height:1.5pt" o:hralign="center" o:hrstd="t" o:hr="t"/>
-        </w:pict>
-      </w:r>
-    </w:p>
-    <w:bookmarkEnd w:id="18"/>
-    <w:bookmarkEnd w:id="19"/>
-    <w:bookmarkStart w:id="20" w:name="recommandation"/>
-    <w:p>
-      <w:pPr>
-        <w:pStyle w:val="Heading2"/>
-      </w:pPr>
-      <w:r>
-        <w:t xml:space="preserve">Recommandation</w:t>
-      </w:r>
-    </w:p>
-    <w:p>
-      <w:pPr>
-        <w:pStyle w:val="FirstParagraph"/>
-      </w:pPr>
-      <w:r>
-        <w:t xml:space="preserve">Les relevés 3, 4 et 5 sont tranchés (réponses du 27 juillet). Reste, par ordre de priorité :</w:t>
+        <w:t xml:space="preserve">📋</w:t>
+      </w:r>
+      <w:r>
+        <w:t xml:space="preserve"> </w:t>
+      </w:r>
+      <w:r>
+        <w:rPr>
+          <w:b/>
+          <w:bCs/>
+        </w:rPr>
+        <w:t xml:space="preserve">REPRISE PROPRE — PRÉVUE LE 2026-07-28 (checklist).</w:t>
+      </w:r>
+      <w:r>
+        <w:t xml:space="preserve"> </w:t>
+      </w:r>
+      <w:r>
+        <w:t xml:space="preserve">Objectif : caler l’AMPLITUDE du M</w:t>
+      </w:r>
+      <w:r>
+        <w:t xml:space="preserve"> </w:t>
+      </w:r>
+      <w:r>
+        <w:t xml:space="preserve">(falsification quantitative contre la cible 717/382/292 à 250 A). Corriger les 4 réserves de</w:t>
+      </w:r>
+      <w:r>
+        <w:t xml:space="preserve"> </w:t>
+      </w:r>
+      <w:r>
+        <w:t xml:space="preserve">la 1re série :</w:t>
       </w:r>
     </w:p>
     <w:p>
@@ -3586,47 +2882,25 @@
           <w:b/>
           <w:bCs/>
         </w:rPr>
-        <w:t xml:space="preserve">L’expérience 7</w:t>
-      </w:r>
-      <w:r>
-        <w:t xml:space="preserve"> </w:t>
-      </w:r>
-      <w:r>
-        <w:t xml:space="preserve">(cartographie bord→centre) : c’est désormais LA mesure clé. La</w:t>
-      </w:r>
-      <w:r>
-        <w:t xml:space="preserve"> </w:t>
-      </w:r>
-      <w:r>
-        <w:t xml:space="preserve">géométrie EM étant entièrement cadrée, l’écart de pic résiduel vient de la forme de la</w:t>
-      </w:r>
-      <w:r>
-        <w:t xml:space="preserve"> </w:t>
-      </w:r>
-      <w:r>
-        <w:t xml:space="preserve">source (profil en « M »), dont l’amplitude ne se calibre qu’avec cette cartographie —</w:t>
-      </w:r>
-      <w:r>
-        <w:t xml:space="preserve"> </w:t>
-      </w:r>
-      <w:r>
-        <w:rPr>
-          <w:b/>
-          <w:bCs/>
-        </w:rPr>
-        <w:t xml:space="preserve">par des TC noyés à l’interface</w:t>
-      </w:r>
-      <w:r>
-        <w:t xml:space="preserve"> </w:t>
-      </w:r>
-      <w:r>
-        <w:t xml:space="preserve">(la caméra de dessus ne voit pas l’interface). Un seul</w:t>
-      </w:r>
-      <w:r>
-        <w:t xml:space="preserve"> </w:t>
-      </w:r>
-      <w:r>
-        <w:t xml:space="preserve">essai de chauffe, ligne de 5 TC, contre la cible chiffrée (2,46× de contraste bord/centre).</w:t>
+        <w:t xml:space="preserve">Céramique d’espacement EN PLACE</w:t>
+      </w:r>
+      <w:r>
+        <w:t xml:space="preserve"> </w:t>
+      </w:r>
+      <w:r>
+        <w:t xml:space="preserve">(+ pression nominale) → géométrie standard, gap 2 mm =</w:t>
+      </w:r>
+      <w:r>
+        <w:t xml:space="preserve"> </w:t>
+      </w:r>
+      <w:r>
+        <w:t xml:space="preserve">celle du modèle. C’est LE point : sans ça, la source EM diffère et les absolus ne se</w:t>
+      </w:r>
+      <w:r>
+        <w:t xml:space="preserve"> </w:t>
+      </w:r>
+      <w:r>
+        <w:t xml:space="preserve">comparent pas à la cible.</w:t>
       </w:r>
     </w:p>
     <w:p>
@@ -3642,19 +2916,32 @@
           <w:b/>
           <w:bCs/>
         </w:rPr>
-        <w:t xml:space="preserve">L’expérience 8</w:t>
-      </w:r>
-      <w:r>
-        <w:t xml:space="preserve"> </w:t>
-      </w:r>
-      <w:r>
-        <w:t xml:space="preserve">(face du CFC, caméra thermique) : à réaliser prochainement ; seule</w:t>
-      </w:r>
-      <w:r>
-        <w:t xml:space="preserve"> </w:t>
-      </w:r>
-      <w:r>
-        <w:t xml:space="preserve">mesure qui attaque le déficit de chauffe en surface (TC1).</w:t>
+        <w:t xml:space="preserve">5 TC valides à l’INTERFACE</w:t>
+      </w:r>
+      <w:r>
+        <w:t xml:space="preserve">, y = 0/10/20/30/40 mm, x = 60 mm (spot 3 ou spot centré).</w:t>
+      </w:r>
+      <w:r>
+        <w:t xml:space="preserve"> </w:t>
+      </w:r>
+      <w:r>
+        <w:rPr>
+          <w:b/>
+          <w:bCs/>
+        </w:rPr>
+        <w:t xml:space="preserve">Remplacer TC1</w:t>
+      </w:r>
+      <w:r>
+        <w:t xml:space="preserve"> </w:t>
+      </w:r>
+      <w:r>
+        <w:t xml:space="preserve">(défaillant sur les deux essais). Vérifier chaque voie avant l’essai</w:t>
+      </w:r>
+      <w:r>
+        <w:t xml:space="preserve"> </w:t>
+      </w:r>
+      <w:r>
+        <w:t xml:space="preserve">(toutes doivent lire l’ambiant proprement, sans saut).</w:t>
       </w:r>
     </w:p>
     <w:p>
@@ -3663,6 +2950,1030 @@
         <w:numPr>
           <w:ilvl w:val="0"/>
           <w:numId w:val="1001"/>
+        </w:numPr>
+      </w:pPr>
+      <w:r>
+        <w:rPr>
+          <w:b/>
+          <w:bCs/>
+        </w:rPr>
+        <w:t xml:space="preserve">Montage bien CENTRÉ en largeur</w:t>
+      </w:r>
+      <w:r>
+        <w:t xml:space="preserve"> </w:t>
+      </w:r>
+      <w:r>
+        <w:t xml:space="preserve">(le profil montait vers y=40 → spot/CFC décalé). Viser</w:t>
+      </w:r>
+      <w:r>
+        <w:t xml:space="preserve"> </w:t>
+      </w:r>
+      <w:r>
+        <w:t xml:space="preserve">TC1↔TC5 symétriques à l’ambiant.</w:t>
+      </w:r>
+    </w:p>
+    <w:p>
+      <w:pPr>
+        <w:pStyle w:val="Compact"/>
+        <w:numPr>
+          <w:ilvl w:val="0"/>
+          <w:numId w:val="1001"/>
+        </w:numPr>
+      </w:pPr>
+      <w:r>
+        <w:rPr>
+          <w:b/>
+          <w:bCs/>
+        </w:rPr>
+        <w:t xml:space="preserve">Courant 250 A</w:t>
+      </w:r>
+      <w:r>
+        <w:t xml:space="preserve"> </w:t>
+      </w:r>
+      <w:r>
+        <w:t xml:space="preserve">(comparable à la cible), rester si possible dans une plage exploitable ;</w:t>
+      </w:r>
+      <w:r>
+        <w:t xml:space="preserve"> </w:t>
+      </w:r>
+      <w:r>
+        <w:t xml:space="preserve">noter la fréquence (383 kHz à 200 A, 388 à 250 A).</w:t>
+      </w:r>
+    </w:p>
+    <w:p>
+      <w:pPr>
+        <w:pStyle w:val="Compact"/>
+        <w:numPr>
+          <w:ilvl w:val="0"/>
+          <w:numId w:val="1001"/>
+        </w:numPr>
+      </w:pPr>
+      <w:r>
+        <w:rPr>
+          <w:b/>
+          <w:bCs/>
+        </w:rPr>
+        <w:t xml:space="preserve">Caméra</w:t>
+      </w:r>
+      <w:r>
+        <w:t xml:space="preserve"> </w:t>
+      </w:r>
+      <w:r>
+        <w:t xml:space="preserve">(optionnelle) : bien</w:t>
+      </w:r>
+      <w:r>
+        <w:t xml:space="preserve"> </w:t>
+      </w:r>
+      <w:r>
+        <w:rPr>
+          <w:b/>
+          <w:bCs/>
+        </w:rPr>
+        <w:t xml:space="preserve">finaliser l’enregistrement</w:t>
+      </w:r>
+      <w:r>
+        <w:t xml:space="preserve"> </w:t>
+      </w:r>
+      <w:r>
+        <w:t xml:space="preserve">(la vidéo 200 A était</w:t>
+      </w:r>
+      <w:r>
+        <w:t xml:space="preserve"> </w:t>
+      </w:r>
+      <w:r>
+        <w:t xml:space="preserve">tronquée, atome</w:t>
+      </w:r>
+      <w:r>
+        <w:t xml:space="preserve"> </w:t>
+      </w:r>
+      <w:r>
+        <w:rPr>
+          <w:rStyle w:val="VerbatimChar"/>
+        </w:rPr>
+        <w:t xml:space="preserve">moov</w:t>
+      </w:r>
+      <w:r>
+        <w:t xml:space="preserve"> </w:t>
+      </w:r>
+      <w:r>
+        <w:t xml:space="preserve">manquant) ou exporter un</w:t>
+      </w:r>
+      <w:r>
+        <w:t xml:space="preserve"> </w:t>
+      </w:r>
+      <w:r>
+        <w:rPr>
+          <w:b/>
+          <w:bCs/>
+        </w:rPr>
+        <w:t xml:space="preserve">CSV radiométrique</w:t>
+      </w:r>
+      <w:r>
+        <w:t xml:space="preserve"> </w:t>
+      </w:r>
+      <w:r>
+        <w:t xml:space="preserve">(ligne/points ROI).</w:t>
+      </w:r>
+    </w:p>
+    <w:p>
+      <w:pPr>
+        <w:pStyle w:val="Compact"/>
+        <w:numPr>
+          <w:ilvl w:val="0"/>
+          <w:numId w:val="1001"/>
+        </w:numPr>
+      </w:pPr>
+      <w:r>
+        <w:t xml:space="preserve">Déposer les fichiers dans un dossier</w:t>
+      </w:r>
+      <w:r>
+        <w:t xml:space="preserve"> </w:t>
+      </w:r>
+      <w:r>
+        <w:rPr>
+          <w:rStyle w:val="VerbatimChar"/>
+        </w:rPr>
+        <w:t xml:space="preserve">data/exp7_bord_centre_2026-07-28/</w:t>
+      </w:r>
+      <w:r>
+        <w:t xml:space="preserve"> </w:t>
+      </w:r>
+      <w:r>
+        <w:t xml:space="preserve">(+ remplir un</w:t>
+      </w:r>
+      <w:r>
+        <w:t xml:space="preserve"> </w:t>
+      </w:r>
+      <w:r>
+        <w:t xml:space="preserve">README avec courant, géométrie, positions TC, repère spatial). → analyse + confrontation à</w:t>
+      </w:r>
+      <w:r>
+        <w:t xml:space="preserve"> </w:t>
+      </w:r>
+      <w:r>
+        <w:t xml:space="preserve">la cible à la réception.</w:t>
+      </w:r>
+    </w:p>
+    <w:bookmarkEnd w:id="14"/>
+    <w:bookmarkStart w:id="15" w:name="X3c1cdae2de844c3576b3855646d50728992e02e"/>
+    <w:p>
+      <w:pPr>
+        <w:pStyle w:val="Heading3"/>
+      </w:pPr>
+      <w:r>
+        <w:t xml:space="preserve">Expérience 8. Température de la face active du concentrateur</w:t>
+      </w:r>
+    </w:p>
+    <w:p>
+      <w:pPr>
+        <w:pStyle w:val="FirstParagraph"/>
+      </w:pPr>
+      <w:r>
+        <w:rPr>
+          <w:b/>
+          <w:bCs/>
+        </w:rPr>
+        <w:t xml:space="preserve">Objectif.</w:t>
+      </w:r>
+      <w:r>
+        <w:t xml:space="preserve"> </w:t>
+      </w:r>
+      <w:r>
+        <w:t xml:space="preserve">Mesurer la température du concentrateur pendant une chauffe.</w:t>
+      </w:r>
+    </w:p>
+    <w:p>
+      <w:pPr>
+        <w:pStyle w:val="BodyText"/>
+      </w:pPr>
+      <w:r>
+        <w:rPr>
+          <w:b/>
+          <w:bCs/>
+        </w:rPr>
+        <w:t xml:space="preserve">Méthode.</w:t>
+      </w:r>
+      <w:r>
+        <w:t xml:space="preserve"> </w:t>
+      </w:r>
+      <w:r>
+        <w:t xml:space="preserve">La caméra FLIR A700 pointée sur la face active du CFC, ou un thermocouple posé</w:t>
+      </w:r>
+      <w:r>
+        <w:t xml:space="preserve"> </w:t>
+      </w:r>
+      <w:r>
+        <w:t xml:space="preserve">dessus.</w:t>
+      </w:r>
+    </w:p>
+    <w:p>
+      <w:pPr>
+        <w:pStyle w:val="BodyText"/>
+      </w:pPr>
+      <w:r>
+        <w:rPr>
+          <w:b/>
+          <w:bCs/>
+        </w:rPr>
+        <w:t xml:space="preserve">Paramètre du modèle résolu.</w:t>
+      </w:r>
+      <w:r>
+        <w:t xml:space="preserve"> </w:t>
+      </w:r>
+      <w:r>
+        <w:t xml:space="preserve">Le déficit de chauffe en surface (TC1). Aucun essai actuel ne</w:t>
+      </w:r>
+      <w:r>
+        <w:t xml:space="preserve"> </w:t>
+      </w:r>
+      <w:r>
+        <w:t xml:space="preserve">mesure la température du concentrateur lui-même.</w:t>
+      </w:r>
+    </w:p>
+    <w:p>
+      <w:pPr>
+        <w:pStyle w:val="BodyText"/>
+      </w:pPr>
+      <w:r>
+        <w:rPr>
+          <w:b/>
+          <w:bCs/>
+        </w:rPr>
+        <w:t xml:space="preserve">Gain attendu.</w:t>
+      </w:r>
+      <w:r>
+        <w:t xml:space="preserve"> </w:t>
+      </w:r>
+      <w:r>
+        <w:t xml:space="preserve">Seule mesure capable de discriminer les causes du déficit de surface. La</w:t>
+      </w:r>
+      <w:r>
+        <w:t xml:space="preserve"> </w:t>
+      </w:r>
+      <w:r>
+        <w:t xml:space="preserve">caméra est déjà disponible au laboratoire.</w:t>
+      </w:r>
+    </w:p>
+    <w:p>
+      <w:pPr>
+        <w:pStyle w:val="BodyText"/>
+      </w:pPr>
+      <w:r>
+        <w:rPr>
+          <w:b/>
+          <w:bCs/>
+        </w:rPr>
+        <w:t xml:space="preserve">Temps estimé.</w:t>
+      </w:r>
+      <w:r>
+        <w:t xml:space="preserve"> </w:t>
+      </w:r>
+      <w:r>
+        <w:t xml:space="preserve">Un essai avec la caméra.</w:t>
+      </w:r>
+    </w:p>
+    <w:p>
+      <w:pPr>
+        <w:pStyle w:val="BodyText"/>
+      </w:pPr>
+      <w:r>
+        <w:rPr>
+          <w:b/>
+          <w:bCs/>
+        </w:rPr>
+        <w:t xml:space="preserve">Réponse (utilisateur, 2026-07-27) :</w:t>
+      </w:r>
+      <w:r>
+        <w:t xml:space="preserve"> </w:t>
+      </w:r>
+      <w:r>
+        <w:t xml:space="preserve">« Je vais réaliser l’expérience demain ou cet</w:t>
+      </w:r>
+      <w:r>
+        <w:t xml:space="preserve"> </w:t>
+      </w:r>
+      <w:r>
+        <w:t xml:space="preserve">après-midi. »</w:t>
+      </w:r>
+    </w:p>
+    <w:p>
+      <w:pPr>
+        <w:pStyle w:val="BlockText"/>
+      </w:pPr>
+      <w:r>
+        <w:t xml:space="preserve">→ Parfait. La caméra vue de dessus (ton idée pour les exp 6/7) est</w:t>
+      </w:r>
+      <w:r>
+        <w:t xml:space="preserve"> </w:t>
+      </w:r>
+      <w:r>
+        <w:rPr>
+          <w:b/>
+          <w:bCs/>
+        </w:rPr>
+        <w:t xml:space="preserve">idéale ici</w:t>
+      </w:r>
+      <w:r>
+        <w:t xml:space="preserve"> </w:t>
+      </w:r>
+      <w:r>
+        <w:t xml:space="preserve">: la face</w:t>
+      </w:r>
+      <w:r>
+        <w:t xml:space="preserve"> </w:t>
+      </w:r>
+      <w:r>
+        <w:t xml:space="preserve">active du CFC est directement visible. Vise une acquisition pendant une chauffe simple spot ;</w:t>
+      </w:r>
+      <w:r>
+        <w:t xml:space="preserve"> </w:t>
+      </w:r>
+      <w:r>
+        <w:t xml:space="preserve">compare la montée du CFC à celle de TC1 (surface) — c’est la seule mesure qui attaque le</w:t>
+      </w:r>
+      <w:r>
+        <w:t xml:space="preserve"> </w:t>
+      </w:r>
+      <w:r>
+        <w:t xml:space="preserve">déficit de chauffe en surface.</w:t>
+      </w:r>
+    </w:p>
+    <w:p>
+      <w:r>
+        <w:pict>
+          <v:rect style="width:0;height:1.5pt" o:hralign="center" o:hrstd="t" o:hr="t"/>
+        </w:pict>
+      </w:r>
+    </w:p>
+    <w:bookmarkEnd w:id="15"/>
+    <w:bookmarkEnd w:id="16"/>
+    <w:bookmarkStart w:id="19" w:name="Xbd611265407e50f203bfabccbfdafc710a5ac1e"/>
+    <w:p>
+      <w:pPr>
+        <w:pStyle w:val="Heading2"/>
+      </w:pPr>
+      <w:r>
+        <w:t xml:space="preserve">Niveau 3. Mesures de propriété (appareil de laboratoire)</w:t>
+      </w:r>
+    </w:p>
+    <w:bookmarkStart w:id="17" w:name="X65c8a4b8084d57e4184b75723c3c30610e8e8a5"/>
+    <w:p>
+      <w:pPr>
+        <w:pStyle w:val="Heading3"/>
+      </w:pPr>
+      <w:r>
+        <w:t xml:space="preserve">Mesure 9. Conductivité thermique dans le plan du laminé</w:t>
+      </w:r>
+    </w:p>
+    <w:p>
+      <w:pPr>
+        <w:pStyle w:val="FirstParagraph"/>
+      </w:pPr>
+      <w:r>
+        <w:rPr>
+          <w:b/>
+          <w:bCs/>
+        </w:rPr>
+        <w:t xml:space="preserve">Objectif.</w:t>
+      </w:r>
+      <w:r>
+        <w:t xml:space="preserve"> </w:t>
+      </w:r>
+      <w:r>
+        <w:t xml:space="preserve">Mesurer directement la conductivité thermique dans le plan du CF/PEKK.</w:t>
+      </w:r>
+    </w:p>
+    <w:p>
+      <w:pPr>
+        <w:pStyle w:val="BodyText"/>
+      </w:pPr>
+      <w:r>
+        <w:rPr>
+          <w:b/>
+          <w:bCs/>
+        </w:rPr>
+        <w:t xml:space="preserve">Méthode.</w:t>
+      </w:r>
+      <w:r>
+        <w:t xml:space="preserve"> </w:t>
+      </w:r>
+      <w:r>
+        <w:t xml:space="preserve">Flash laser ou disque chaud (hot-disk) sur un échantillon de laminé.</w:t>
+      </w:r>
+    </w:p>
+    <w:p>
+      <w:pPr>
+        <w:pStyle w:val="BodyText"/>
+      </w:pPr>
+      <w:r>
+        <w:rPr>
+          <w:b/>
+          <w:bCs/>
+        </w:rPr>
+        <w:t xml:space="preserve">Paramètre du modèle résolu.</w:t>
+      </w:r>
+      <w:r>
+        <w:t xml:space="preserve"> </w:t>
+      </w:r>
+      <w:r>
+        <w:t xml:space="preserve">La conductivité</w:t>
+      </w:r>
+      <w:r>
+        <w:t xml:space="preserve"> </w:t>
+      </w:r>
+      <w:r>
+        <w:rPr>
+          <w:rStyle w:val="VerbatimChar"/>
+        </w:rPr>
+        <w:t xml:space="preserve">k_plan</w:t>
+      </w:r>
+      <w:r>
+        <w:t xml:space="preserve">, la même que l’expérience 6 attaque</w:t>
+      </w:r>
+      <w:r>
+        <w:t xml:space="preserve"> </w:t>
+      </w:r>
+      <w:r>
+        <w:t xml:space="preserve">sur le banc.</w:t>
+      </w:r>
+    </w:p>
+    <w:p>
+      <w:pPr>
+        <w:pStyle w:val="BodyText"/>
+      </w:pPr>
+      <w:r>
+        <w:rPr>
+          <w:b/>
+          <w:bCs/>
+        </w:rPr>
+        <w:t xml:space="preserve">Gain attendu.</w:t>
+      </w:r>
+      <w:r>
+        <w:t xml:space="preserve"> </w:t>
+      </w:r>
+      <w:r>
+        <w:t xml:space="preserve">Transforme un</w:t>
+      </w:r>
+      <w:r>
+        <w:t xml:space="preserve"> </w:t>
+      </w:r>
+      <w:r>
+        <w:rPr>
+          <w:rStyle w:val="VerbatimChar"/>
+        </w:rPr>
+        <w:t xml:space="preserve">k_plan</w:t>
+      </w:r>
+      <w:r>
+        <w:t xml:space="preserve"> </w:t>
+      </w:r>
+      <w:r>
+        <w:t xml:space="preserve">assumé en propriété sourcée. L’écart d’un facteur 3</w:t>
+      </w:r>
+      <w:r>
+        <w:t xml:space="preserve"> </w:t>
+      </w:r>
+      <w:r>
+        <w:t xml:space="preserve">qui semblait requis le 23 juillet au matin ne l’est plus (voir l’encadré de tête), mais la</w:t>
+      </w:r>
+      <w:r>
+        <w:t xml:space="preserve"> </w:t>
+      </w:r>
+      <w:r>
+        <w:t xml:space="preserve">valeur homogénéisée de 3 W/m·K reste, elle, non vérifiée expérimentalement.</w:t>
+      </w:r>
+    </w:p>
+    <w:p>
+      <w:pPr>
+        <w:pStyle w:val="BodyText"/>
+      </w:pPr>
+      <w:r>
+        <w:rPr>
+          <w:b/>
+          <w:bCs/>
+        </w:rPr>
+        <w:t xml:space="preserve">Temps estimé.</w:t>
+      </w:r>
+      <w:r>
+        <w:t xml:space="preserve"> </w:t>
+      </w:r>
+      <w:r>
+        <w:t xml:space="preserve">Préparation d’échantillon plus appareil dédié. L’expérience 6 en est le</w:t>
+      </w:r>
+      <w:r>
+        <w:t xml:space="preserve"> </w:t>
+      </w:r>
+      <w:r>
+        <w:t xml:space="preserve">substitut rapide sur le banc du laboratoire.</w:t>
+      </w:r>
+    </w:p>
+    <w:p>
+      <w:pPr>
+        <w:pStyle w:val="BodyText"/>
+      </w:pPr>
+      <w:r>
+        <w:rPr>
+          <w:b/>
+          <w:bCs/>
+        </w:rPr>
+        <w:t xml:space="preserve">Réponse (utilisateur, 2026-07-27) :</w:t>
+      </w:r>
+      <w:r>
+        <w:t xml:space="preserve"> </w:t>
+      </w:r>
+      <w:r>
+        <w:t xml:space="preserve">« J’ai pas compris cette expérience. »</w:t>
+      </w:r>
+    </w:p>
+    <w:p>
+      <w:pPr>
+        <w:pStyle w:val="BlockText"/>
+      </w:pPr>
+      <w:r>
+        <w:t xml:space="preserve">→</w:t>
+      </w:r>
+      <w:r>
+        <w:t xml:space="preserve"> </w:t>
+      </w:r>
+      <w:r>
+        <w:rPr>
+          <w:b/>
+          <w:bCs/>
+        </w:rPr>
+        <w:t xml:space="preserve">Précision.</w:t>
+      </w:r>
+      <w:r>
+        <w:t xml:space="preserve"> </w:t>
+      </w:r>
+      <w:r>
+        <w:t xml:space="preserve">C’est une mesure d’</w:t>
+      </w:r>
+      <w:r>
+        <w:rPr>
+          <w:b/>
+          <w:bCs/>
+        </w:rPr>
+        <w:t xml:space="preserve">appareil de labo</w:t>
+      </w:r>
+      <w:r>
+        <w:t xml:space="preserve"> </w:t>
+      </w:r>
+      <w:r>
+        <w:t xml:space="preserve">(hot-disk ou flash laser), pas sur</w:t>
+      </w:r>
+      <w:r>
+        <w:t xml:space="preserve"> </w:t>
+      </w:r>
+      <w:r>
+        <w:t xml:space="preserve">le banc de soudage : on dépose une impulsion de chaleur sur un petit</w:t>
+      </w:r>
+      <w:r>
+        <w:t xml:space="preserve"> </w:t>
+      </w:r>
+      <w:r>
+        <w:rPr>
+          <w:b/>
+          <w:bCs/>
+        </w:rPr>
+        <w:t xml:space="preserve">échantillon de</w:t>
+      </w:r>
+      <w:r>
+        <w:rPr>
+          <w:b/>
+          <w:bCs/>
+        </w:rPr>
+        <w:t xml:space="preserve"> </w:t>
+      </w:r>
+      <w:r>
+        <w:rPr>
+          <w:b/>
+          <w:bCs/>
+        </w:rPr>
+        <w:t xml:space="preserve">matière</w:t>
+      </w:r>
+      <w:r>
+        <w:t xml:space="preserve"> </w:t>
+      </w:r>
+      <w:r>
+        <w:t xml:space="preserve">et on chronomètre sa vitesse d’étalement → on en déduit la conductivité thermique</w:t>
+      </w:r>
+      <w:r>
+        <w:t xml:space="preserve"> </w:t>
+      </w:r>
+      <w:r>
+        <w:t xml:space="preserve">dans le plan</w:t>
+      </w:r>
+      <w:r>
+        <w:t xml:space="preserve"> </w:t>
+      </w:r>
+      <w:r>
+        <w:rPr>
+          <w:rStyle w:val="VerbatimChar"/>
+        </w:rPr>
+        <w:t xml:space="preserve">k_plan</w:t>
+      </w:r>
+      <w:r>
+        <w:t xml:space="preserve">. L’</w:t>
+      </w:r>
+      <w:r>
+        <w:rPr>
+          <w:b/>
+          <w:bCs/>
+        </w:rPr>
+        <w:t xml:space="preserve">expérience 6</w:t>
+      </w:r>
+      <w:r>
+        <w:t xml:space="preserve"> </w:t>
+      </w:r>
+      <w:r>
+        <w:t xml:space="preserve">(spot + TC en ligne sur le banc) en est le</w:t>
+      </w:r>
+      <w:r>
+        <w:t xml:space="preserve"> </w:t>
+      </w:r>
+      <w:r>
+        <w:t xml:space="preserve">substitut « maison ». Non prioritaire : sers-toi de l’exp 6 si tu veux vérifier</w:t>
+      </w:r>
+      <w:r>
+        <w:t xml:space="preserve"> </w:t>
+      </w:r>
+      <w:r>
+        <w:rPr>
+          <w:rStyle w:val="VerbatimChar"/>
+        </w:rPr>
+        <w:t xml:space="preserve">k_plan</w:t>
+      </w:r>
+      <w:r>
+        <w:t xml:space="preserve">.</w:t>
+      </w:r>
+    </w:p>
+    <w:bookmarkEnd w:id="17"/>
+    <w:bookmarkStart w:id="18" w:name="Xbcbfbd036e1830f701e3e206f87ccdb9e70e470"/>
+    <w:p>
+      <w:pPr>
+        <w:pStyle w:val="Heading3"/>
+      </w:pPr>
+      <w:r>
+        <w:t xml:space="preserve">Mesure 10. Conductivité électrique en fonction de la température σ(T)</w:t>
+      </w:r>
+    </w:p>
+    <w:p>
+      <w:pPr>
+        <w:pStyle w:val="FirstParagraph"/>
+      </w:pPr>
+      <w:r>
+        <w:rPr>
+          <w:b/>
+          <w:bCs/>
+        </w:rPr>
+        <w:t xml:space="preserve">Objectif.</w:t>
+      </w:r>
+      <w:r>
+        <w:t xml:space="preserve"> </w:t>
+      </w:r>
+      <w:r>
+        <w:t xml:space="preserve">Mesurer la dépendance en température de la conductivité électrique du laminé et</w:t>
+      </w:r>
+      <w:r>
+        <w:t xml:space="preserve"> </w:t>
+      </w:r>
+      <w:r>
+        <w:t xml:space="preserve">du twill.</w:t>
+      </w:r>
+    </w:p>
+    <w:p>
+      <w:pPr>
+        <w:pStyle w:val="BodyText"/>
+      </w:pPr>
+      <w:r>
+        <w:rPr>
+          <w:b/>
+          <w:bCs/>
+        </w:rPr>
+        <w:t xml:space="preserve">Méthode.</w:t>
+      </w:r>
+      <w:r>
+        <w:t xml:space="preserve"> </w:t>
+      </w:r>
+      <w:r>
+        <w:t xml:space="preserve">Mesure quatre pointes en montée en température.</w:t>
+      </w:r>
+    </w:p>
+    <w:p>
+      <w:pPr>
+        <w:pStyle w:val="BodyText"/>
+      </w:pPr>
+      <w:r>
+        <w:rPr>
+          <w:b/>
+          <w:bCs/>
+        </w:rPr>
+        <w:t xml:space="preserve">Paramètre du modèle résolu.</w:t>
+      </w:r>
+      <w:r>
+        <w:t xml:space="preserve"> </w:t>
+      </w:r>
+      <w:r>
+        <w:t xml:space="preserve">La dépendance σ(T), aujourd’hui absente (σ pris constant).</w:t>
+      </w:r>
+    </w:p>
+    <w:p>
+      <w:pPr>
+        <w:pStyle w:val="BodyText"/>
+      </w:pPr>
+      <w:r>
+        <w:rPr>
+          <w:b/>
+          <w:bCs/>
+        </w:rPr>
+        <w:t xml:space="preserve">Gain attendu.</w:t>
+      </w:r>
+      <w:r>
+        <w:t xml:space="preserve"> </w:t>
+      </w:r>
+      <w:r>
+        <w:t xml:space="preserve">Explique qu’un facteur d’échelle unique ne colle pas simultanément à la</w:t>
+      </w:r>
+      <w:r>
+        <w:t xml:space="preserve"> </w:t>
+      </w:r>
+      <w:r>
+        <w:t xml:space="preserve">montée, au pic et à la descente. O’Shaughnessey (2014) et Duhovic et al. (2012) recommandent</w:t>
+      </w:r>
+      <w:r>
+        <w:t xml:space="preserve"> </w:t>
+      </w:r>
+      <w:r>
+        <w:t xml:space="preserve">cette prise en compte.</w:t>
+      </w:r>
+    </w:p>
+    <w:p>
+      <w:pPr>
+        <w:pStyle w:val="BodyText"/>
+      </w:pPr>
+      <w:r>
+        <w:rPr>
+          <w:b/>
+          <w:bCs/>
+        </w:rPr>
+        <w:t xml:space="preserve">Temps estimé.</w:t>
+      </w:r>
+      <w:r>
+        <w:t xml:space="preserve"> </w:t>
+      </w:r>
+      <w:r>
+        <w:t xml:space="preserve">Mesure plus difficile, à réserver si les niveaux 1 et 2 ne suffisent pas.</w:t>
+      </w:r>
+    </w:p>
+    <w:p>
+      <w:pPr>
+        <w:pStyle w:val="BodyText"/>
+      </w:pPr>
+      <w:r>
+        <w:rPr>
+          <w:b/>
+          <w:bCs/>
+        </w:rPr>
+        <w:t xml:space="preserve">Réponse (utilisateur, 2026-07-27) :</w:t>
+      </w:r>
+      <w:r>
+        <w:t xml:space="preserve"> </w:t>
+      </w:r>
+      <w:r>
+        <w:t xml:space="preserve">« J’ai pas compris cette expérience non plus. »</w:t>
+      </w:r>
+    </w:p>
+    <w:p>
+      <w:pPr>
+        <w:pStyle w:val="BlockText"/>
+      </w:pPr>
+      <w:r>
+        <w:t xml:space="preserve">→</w:t>
+      </w:r>
+      <w:r>
+        <w:t xml:space="preserve"> </w:t>
+      </w:r>
+      <w:r>
+        <w:rPr>
+          <w:b/>
+          <w:bCs/>
+        </w:rPr>
+        <w:t xml:space="preserve">Précision.</w:t>
+      </w:r>
+      <w:r>
+        <w:t xml:space="preserve"> </w:t>
+      </w:r>
+      <w:r>
+        <w:t xml:space="preserve">Mesure</w:t>
+      </w:r>
+      <w:r>
+        <w:t xml:space="preserve"> </w:t>
+      </w:r>
+      <w:r>
+        <w:rPr>
+          <w:b/>
+          <w:bCs/>
+        </w:rPr>
+        <w:t xml:space="preserve">4 pointes</w:t>
+      </w:r>
+      <w:r>
+        <w:t xml:space="preserve"> </w:t>
+      </w:r>
+      <w:r>
+        <w:t xml:space="preserve">(van der Pauw) sur un échantillon de laminé/twill que</w:t>
+      </w:r>
+      <w:r>
+        <w:t xml:space="preserve"> </w:t>
+      </w:r>
+      <w:r>
+        <w:t xml:space="preserve">l’on chauffe progressivement : on lit la résistance électrique à chaque température, ce qui</w:t>
+      </w:r>
+      <w:r>
+        <w:t xml:space="preserve"> </w:t>
+      </w:r>
+      <w:r>
+        <w:t xml:space="preserve">donne σ(T), la variation de la conductivité électrique avec la température. Le modèle prend</w:t>
+      </w:r>
+      <w:r>
+        <w:t xml:space="preserve"> </w:t>
+      </w:r>
+      <w:r>
+        <w:t xml:space="preserve">aujourd’hui σ</w:t>
+      </w:r>
+      <w:r>
+        <w:t xml:space="preserve"> </w:t>
+      </w:r>
+      <w:r>
+        <w:rPr>
+          <w:b/>
+          <w:bCs/>
+        </w:rPr>
+        <w:t xml:space="preserve">constante</w:t>
+      </w:r>
+      <w:r>
+        <w:t xml:space="preserve"> </w:t>
+      </w:r>
+      <w:r>
+        <w:t xml:space="preserve">; en réalité elle change avec T, ce qui explique en partie qu’un</w:t>
+      </w:r>
+      <w:r>
+        <w:t xml:space="preserve"> </w:t>
+      </w:r>
+      <w:r>
+        <w:t xml:space="preserve">facteur d’échelle unique ne colle pas à la fois à la montée, au pic et à la descente. Mesure</w:t>
+      </w:r>
+      <w:r>
+        <w:t xml:space="preserve"> </w:t>
+      </w:r>
+      <w:r>
+        <w:t xml:space="preserve">la plus lourde des dix, à réserver si les niveaux 1-2 ne suffisent pas.</w:t>
+      </w:r>
+    </w:p>
+    <w:p>
+      <w:r>
+        <w:pict>
+          <v:rect style="width:0;height:1.5pt" o:hralign="center" o:hrstd="t" o:hr="t"/>
+        </w:pict>
+      </w:r>
+    </w:p>
+    <w:bookmarkEnd w:id="18"/>
+    <w:bookmarkEnd w:id="19"/>
+    <w:bookmarkStart w:id="20" w:name="recommandation"/>
+    <w:p>
+      <w:pPr>
+        <w:pStyle w:val="Heading2"/>
+      </w:pPr>
+      <w:r>
+        <w:t xml:space="preserve">Recommandation</w:t>
+      </w:r>
+    </w:p>
+    <w:p>
+      <w:pPr>
+        <w:pStyle w:val="FirstParagraph"/>
+      </w:pPr>
+      <w:r>
+        <w:t xml:space="preserve">Les relevés 2, 3, 4 et 5 sont tranchés (réponses du 27 juillet). Reste, par ordre de priorité :</w:t>
+      </w:r>
+    </w:p>
+    <w:p>
+      <w:pPr>
+        <w:pStyle w:val="Compact"/>
+        <w:numPr>
+          <w:ilvl w:val="0"/>
+          <w:numId w:val="1002"/>
+        </w:numPr>
+      </w:pPr>
+      <w:r>
+        <w:rPr>
+          <w:b/>
+          <w:bCs/>
+        </w:rPr>
+        <w:t xml:space="preserve">L’expérience 7 — REPRISE PROPRE prévue le 2026-07-28.</w:t>
+      </w:r>
+      <w:r>
+        <w:t xml:space="preserve"> </w:t>
+      </w:r>
+      <w:r>
+        <w:t xml:space="preserve">La 1re série (200/250 A) a</w:t>
+      </w:r>
+      <w:r>
+        <w:t xml:space="preserve"> </w:t>
+      </w:r>
+      <w:r>
+        <w:t xml:space="preserve">confirmé la vallée du M et montré que le modèle sur-contraste (chant/centre ~1,85 vs 2,46),</w:t>
+      </w:r>
+      <w:r>
+        <w:t xml:space="preserve"> </w:t>
+      </w:r>
+      <w:r>
+        <w:t xml:space="preserve">mais SANS céramique → amplitude non falsifiable. La reprise avec</w:t>
+      </w:r>
+      <w:r>
+        <w:t xml:space="preserve"> </w:t>
+      </w:r>
+      <w:r>
+        <w:rPr>
+          <w:b/>
+          <w:bCs/>
+        </w:rPr>
+        <w:t xml:space="preserve">céramique en place, 5 TC</w:t>
+      </w:r>
+      <w:r>
+        <w:rPr>
+          <w:b/>
+          <w:bCs/>
+        </w:rPr>
+        <w:t xml:space="preserve"> </w:t>
+      </w:r>
+      <w:r>
+        <w:rPr>
+          <w:b/>
+          <w:bCs/>
+        </w:rPr>
+        <w:t xml:space="preserve">interface valides, montage symétrique</w:t>
+      </w:r>
+      <w:r>
+        <w:t xml:space="preserve"> </w:t>
+      </w:r>
+      <w:r>
+        <w:t xml:space="preserve">(checklist dans la fiche exp 7) doit caler</w:t>
+      </w:r>
+      <w:r>
+        <w:t xml:space="preserve"> </w:t>
+      </w:r>
+      <w:r>
+        <w:t xml:space="preserve">l’amplitude contre la cible 717/382/292.</w:t>
+      </w:r>
+      <w:r>
+        <w:t xml:space="preserve"> </w:t>
+      </w:r>
+      <w:r>
+        <w:rPr>
+          <w:b/>
+          <w:bCs/>
+        </w:rPr>
+        <w:t xml:space="preserve">C’est la mesure clé</w:t>
+      </w:r>
+      <w:r>
+        <w:t xml:space="preserve"> </w:t>
+      </w:r>
+      <w:r>
+        <w:t xml:space="preserve">du levier « forme ».</w:t>
+      </w:r>
+    </w:p>
+    <w:p>
+      <w:pPr>
+        <w:pStyle w:val="Compact"/>
+        <w:numPr>
+          <w:ilvl w:val="0"/>
+          <w:numId w:val="1002"/>
+        </w:numPr>
+      </w:pPr>
+      <w:r>
+        <w:rPr>
+          <w:b/>
+          <w:bCs/>
+        </w:rPr>
+        <w:t xml:space="preserve">L’expérience 8</w:t>
+      </w:r>
+      <w:r>
+        <w:t xml:space="preserve"> </w:t>
+      </w:r>
+      <w:r>
+        <w:t xml:space="preserve">(face du CFC, caméra thermique) : à réaliser prochainement ; seule</w:t>
+      </w:r>
+      <w:r>
+        <w:t xml:space="preserve"> </w:t>
+      </w:r>
+      <w:r>
+        <w:t xml:space="preserve">mesure qui attaque le déficit de chauffe en surface (TC1).</w:t>
+      </w:r>
+    </w:p>
+    <w:p>
+      <w:pPr>
+        <w:pStyle w:val="Compact"/>
+        <w:numPr>
+          <w:ilvl w:val="0"/>
+          <w:numId w:val="1002"/>
         </w:numPr>
       </w:pPr>
       <w:r>
@@ -4683,6 +4994,36 @@
     <w:abstractNumId w:val="990"/>
   </w:num>
   <w:num w:numId="1001">
+    <w:abstractNumId w:val="99411"/>
+    <w:lvlOverride w:ilvl="0">
+      <w:startOverride w:val="1"/>
+    </w:lvlOverride>
+    <w:lvlOverride w:ilvl="1">
+      <w:startOverride w:val="1"/>
+    </w:lvlOverride>
+    <w:lvlOverride w:ilvl="2">
+      <w:startOverride w:val="1"/>
+    </w:lvlOverride>
+    <w:lvlOverride w:ilvl="3">
+      <w:startOverride w:val="1"/>
+    </w:lvlOverride>
+    <w:lvlOverride w:ilvl="4">
+      <w:startOverride w:val="1"/>
+    </w:lvlOverride>
+    <w:lvlOverride w:ilvl="5">
+      <w:startOverride w:val="1"/>
+    </w:lvlOverride>
+    <w:lvlOverride w:ilvl="6">
+      <w:startOverride w:val="1"/>
+    </w:lvlOverride>
+    <w:lvlOverride w:ilvl="7">
+      <w:startOverride w:val="1"/>
+    </w:lvlOverride>
+    <w:lvlOverride w:ilvl="8">
+      <w:startOverride w:val="1"/>
+    </w:lvlOverride>
+  </w:num>
+  <w:num w:numId="1002">
     <w:abstractNumId w:val="99411"/>
     <w:lvlOverride w:ilvl="0">
       <w:startOverride w:val="1"/>

</xml_diff>

<commit_message>
Add Exp 9 longitudinal-dissipation protocol + curves start at ambient
- docs/protocole_exp_dissipation_longitudinale.md: detailed protocol sheet
  for the new experiment (T(x) heat dissipation along the length). Two
  phases (edge y=0 = source+conduction, center y=20 = near-pure conduction)
  that separate source footprint from k_plan. Non-melting (<=270 C, samples
  reusable), >=5 Hz acquisition, records cooldown. Realizes the Exp 6 goal.
- mesures_a_realiser .md/.docx: Exp 9 added as top priority (fiche prête),
  renumbered; Exp 6 marked as covered by Exp 9; synthesis table updated.
- figures_article T(t) curves regenerated: each essai now starts exactly at
  ambient (last ambient point before the rise), pre-heating idle removed,
  window [0, 72 s] with cooldown.

Co-Authored-By: Claude Opus 4.8 <noreply@anthropic.com>
</commit_message>
<xml_diff>
--- a/docs/mesures_a_realiser.docx
+++ b/docs/mesures_a_realiser.docx
@@ -329,7 +329,7 @@
         </w:pict>
       </w:r>
     </w:p>
-    <w:bookmarkStart w:id="14" w:name="à-faire-par-priorité"/>
+    <w:bookmarkStart w:id="16" w:name="à-faire-par-priorité"/>
     <w:p>
       <w:pPr>
         <w:pStyle w:val="Heading2"/>
@@ -338,13 +338,13 @@
         <w:t xml:space="preserve">À faire — par priorité</w:t>
       </w:r>
     </w:p>
-    <w:bookmarkStart w:id="10" w:name="Xc8b8f394d32c9886f26180670e10cb34e625d40"/>
+    <w:bookmarkStart w:id="11" w:name="Xaa86e6653c8f600948297c50da5eba936b99c7a"/>
     <w:p>
       <w:pPr>
         <w:pStyle w:val="Heading3"/>
       </w:pPr>
       <w:r>
-        <w:t xml:space="preserve">1. Exp 8 — Température de la face active du CFC</w:t>
+        <w:t xml:space="preserve">1. ★ Exp 9 — Dissipation longitudinale de la chaleur T(x) — PROCHAINE (fiche prête)</w:t>
       </w:r>
     </w:p>
     <w:p>
@@ -362,13 +362,47 @@
         <w:t xml:space="preserve"> </w:t>
       </w:r>
       <w:r>
-        <w:t xml:space="preserve">Mesurer la température du concentrateur pendant une chauffe (caméra FLIR A700 sur</w:t>
-      </w:r>
-      <w:r>
-        <w:t xml:space="preserve"> </w:t>
-      </w:r>
-      <w:r>
-        <w:t xml:space="preserve">la face active, ou TC posé). Vue de dessus idéale ici (la face du CFC est directement visible).</w:t>
+        <w:t xml:space="preserve">Cartographier la décroissance de température le long de la</w:t>
+      </w:r>
+      <w:r>
+        <w:t xml:space="preserve"> </w:t>
+      </w:r>
+      <w:r>
+        <w:rPr>
+          <w:b/>
+          <w:bCs/>
+        </w:rPr>
+        <w:t xml:space="preserve">longueur</w:t>
+      </w:r>
+      <w:r>
+        <w:t xml:space="preserve"> </w:t>
+      </w:r>
+      <w:r>
+        <w:t xml:space="preserve">(ligne de TC</w:t>
+      </w:r>
+      <w:r>
+        <w:t xml:space="preserve"> </w:t>
+      </w:r>
+      <w:r>
+        <w:t xml:space="preserve">en x), phase 1 au bord (</w:t>
+      </w:r>
+      <w:r>
+        <w:rPr>
+          <w:rStyle w:val="VerbatimChar"/>
+        </w:rPr>
+        <w:t xml:space="preserve">y=0</w:t>
+      </w:r>
+      <w:r>
+        <w:t xml:space="preserve">), phase 2 au centre (</w:t>
+      </w:r>
+      <w:r>
+        <w:rPr>
+          <w:rStyle w:val="VerbatimChar"/>
+        </w:rPr>
+        <w:t xml:space="preserve">y=20</w:t>
+      </w:r>
+      <w:r>
+        <w:t xml:space="preserve">).</w:t>
       </w:r>
       <w:r>
         <w:t xml:space="preserve"> </w:t>
@@ -384,23 +418,90 @@
         <w:t xml:space="preserve"> </w:t>
       </w:r>
       <w:r>
-        <w:t xml:space="preserve">: le déficit de chauffe en surface (TC1) — seule mesure qui l’attaque. Comparer la</w:t>
-      </w:r>
-      <w:r>
-        <w:t xml:space="preserve"> </w:t>
-      </w:r>
-      <w:r>
-        <w:t xml:space="preserve">montée du CFC à celle de TC1. Un essai.</w:t>
+        <w:t xml:space="preserve">le résidu n°1 (étalement de</w:t>
+      </w:r>
+      <w:r>
+        <w:t xml:space="preserve"> </w:t>
+      </w:r>
+      <w:r>
+        <w:t xml:space="preserve">chaleur trop lent) : donne la longueur de décroissance et la diffusivité</w:t>
+      </w:r>
+      <w:r>
+        <w:t xml:space="preserve"> </w:t>
+      </w:r>
+      <w:r>
+        <w:rPr>
+          <w:rStyle w:val="VerbatimChar"/>
+        </w:rPr>
+        <w:t xml:space="preserve">α = k_plan/(ρ·cp·e)</w:t>
+      </w:r>
+      <w:r>
+        <w:t xml:space="preserve"> </w:t>
+      </w:r>
+      <w:r>
+        <w:t xml:space="preserve">→</w:t>
+      </w:r>
+      <w:r>
+        <w:t xml:space="preserve"> </w:t>
+      </w:r>
+      <w:r>
+        <w:t xml:space="preserve">valide</w:t>
+      </w:r>
+      <w:r>
+        <w:t xml:space="preserve"> </w:t>
+      </w:r>
+      <w:r>
+        <w:rPr>
+          <w:rStyle w:val="VerbatimChar"/>
+        </w:rPr>
+        <w:t xml:space="preserve">k_plan</w:t>
+      </w:r>
+      <w:r>
+        <w:t xml:space="preserve">. Échantillons réutilisables (≤ 270 °C, pas de fusion). Réalise l’objectif d’Exp 6.</w:t>
+      </w:r>
+      <w:r>
+        <w:t xml:space="preserve"> </w:t>
+      </w:r>
+      <w:r>
+        <w:rPr>
+          <w:b/>
+          <w:bCs/>
+        </w:rPr>
+        <w:t xml:space="preserve">Fiche protocole détaillée :</w:t>
+      </w:r>
+      <w:r>
+        <w:rPr>
+          <w:b/>
+          <w:bCs/>
+        </w:rPr>
+        <w:t xml:space="preserve"> </w:t>
+      </w:r>
+      <w:hyperlink r:id="rId10">
+        <w:r>
+          <w:rPr>
+            <w:rStyle w:val="VerbatimChar"/>
+            <w:b/>
+            <w:bCs/>
+          </w:rPr>
+          <w:t xml:space="preserve">protocole_exp_dissipation_longitudinale.md</w:t>
+        </w:r>
+      </w:hyperlink>
+      <w:r>
+        <w:rPr>
+          <w:b/>
+          <w:bCs/>
+        </w:rPr>
+        <w:t xml:space="preserve">.</w:t>
       </w:r>
     </w:p>
-    <w:bookmarkEnd w:id="10"/>
-    <w:bookmarkStart w:id="11" w:name="Xfe243462107251bb9d0358a4a665fccc3e012f5"/>
+    <w:bookmarkEnd w:id="11"/>
+    <w:bookmarkStart w:id="12" w:name="Xc8b8f394d32c9886f26180670e10cb34e625d40"/>
     <w:p>
       <w:pPr>
         <w:pStyle w:val="Heading3"/>
       </w:pPr>
       <w:r>
-        <w:t xml:space="preserve">2. Relevé 1 — Position longitudinale de la bobine</w:t>
+        <w:t xml:space="preserve">2. Exp 8 — Température de la face active du CFC</w:t>
       </w:r>
     </w:p>
     <w:p>
@@ -418,63 +519,45 @@
         <w:t xml:space="preserve"> </w:t>
       </w:r>
       <w:r>
-        <w:t xml:space="preserve">Mesurer le décalage en x du centre de la bobine par rapport au spot visé</w:t>
-      </w:r>
-      <w:r>
-        <w:t xml:space="preserve"> </w:t>
-      </w:r>
-      <w:r>
-        <w:t xml:space="preserve">(paramètre</w:t>
-      </w:r>
-      <w:r>
-        <w:t xml:space="preserve"> </w:t>
-      </w:r>
-      <w:r>
-        <w:rPr>
-          <w:rStyle w:val="VerbatimChar"/>
-        </w:rPr>
-        <w:t xml:space="preserve">decalage_x</w:t>
-      </w:r>
-      <w:r>
-        <w:t xml:space="preserve">, figé à 0 faute de mesure). Pied à coulisse, 15 min.</w:t>
-      </w:r>
-      <w:r>
-        <w:t xml:space="preserve"> </w:t>
-      </w:r>
-      <w:r>
-        <w:rPr>
-          <w:b/>
-          <w:bCs/>
-        </w:rPr>
-        <w:t xml:space="preserve">Peu critique</w:t>
-      </w:r>
-      <w:r>
-        <w:t xml:space="preserve"> </w:t>
-      </w:r>
-      <w:r>
-        <w:t xml:space="preserve">:</w:t>
-      </w:r>
-      <w:r>
-        <w:t xml:space="preserve"> </w:t>
-      </w:r>
-      <w:r>
-        <w:t xml:space="preserve">si non mesurable facilement, on le laisse figé. (Les cotes propres de la bobine sont déjà</w:t>
-      </w:r>
-      <w:r>
-        <w:t xml:space="preserve"> </w:t>
-      </w:r>
-      <w:r>
-        <w:t xml:space="preserve">résolues, cf. archive.)</w:t>
+        <w:t xml:space="preserve">Mesurer la température du concentrateur pendant une chauffe (caméra FLIR A700 sur</w:t>
+      </w:r>
+      <w:r>
+        <w:t xml:space="preserve"> </w:t>
+      </w:r>
+      <w:r>
+        <w:t xml:space="preserve">la face active, ou TC posé). Vue de dessus idéale ici (la face du CFC est directement visible).</w:t>
+      </w:r>
+      <w:r>
+        <w:t xml:space="preserve"> </w:t>
+      </w:r>
+      <w:r>
+        <w:rPr>
+          <w:b/>
+          <w:bCs/>
+        </w:rPr>
+        <w:t xml:space="preserve">Résout</w:t>
+      </w:r>
+      <w:r>
+        <w:t xml:space="preserve"> </w:t>
+      </w:r>
+      <w:r>
+        <w:t xml:space="preserve">: le déficit de chauffe en surface (TC1) — seule mesure qui l’attaque. Comparer la</w:t>
+      </w:r>
+      <w:r>
+        <w:t xml:space="preserve"> </w:t>
+      </w:r>
+      <w:r>
+        <w:t xml:space="preserve">montée du CFC à celle de TC1. Un essai.</w:t>
       </w:r>
     </w:p>
-    <w:bookmarkEnd w:id="11"/>
-    <w:bookmarkStart w:id="12" w:name="Xe2593bb5cf4f10e3375cd3a973efa99c3adaa70"/>
+    <w:bookmarkEnd w:id="12"/>
+    <w:bookmarkStart w:id="13" w:name="Xfe243462107251bb9d0358a4a665fccc3e012f5"/>
     <w:p>
       <w:pPr>
         <w:pStyle w:val="Heading3"/>
       </w:pPr>
       <w:r>
-        <w:t xml:space="preserve">3. Exp 6 — Diffusivité latérale (optionnel, non prioritaire)</w:t>
+        <w:t xml:space="preserve">3. Relevé 1 — Position longitudinale de la bobine</w:t>
       </w:r>
     </w:p>
     <w:p>
@@ -492,75 +575,142 @@
         <w:t xml:space="preserve"> </w:t>
       </w:r>
       <w:r>
+        <w:t xml:space="preserve">Mesurer le décalage en x du centre de la bobine par rapport au spot visé</w:t>
+      </w:r>
+      <w:r>
+        <w:t xml:space="preserve"> </w:t>
+      </w:r>
+      <w:r>
+        <w:t xml:space="preserve">(paramètre</w:t>
+      </w:r>
+      <w:r>
+        <w:t xml:space="preserve"> </w:t>
+      </w:r>
+      <w:r>
         <w:rPr>
           <w:rStyle w:val="VerbatimChar"/>
         </w:rPr>
+        <w:t xml:space="preserve">decalage_x</w:t>
+      </w:r>
+      <w:r>
+        <w:t xml:space="preserve">, figé à 0 faute de mesure). Pied à coulisse, 15 min.</w:t>
+      </w:r>
+      <w:r>
+        <w:t xml:space="preserve"> </w:t>
+      </w:r>
+      <w:r>
+        <w:rPr>
+          <w:b/>
+          <w:bCs/>
+        </w:rPr>
+        <w:t xml:space="preserve">Peu critique</w:t>
+      </w:r>
+      <w:r>
+        <w:t xml:space="preserve"> </w:t>
+      </w:r>
+      <w:r>
+        <w:t xml:space="preserve">:</w:t>
+      </w:r>
+      <w:r>
+        <w:t xml:space="preserve"> </w:t>
+      </w:r>
+      <w:r>
+        <w:t xml:space="preserve">si non mesurable facilement, on le laisse figé. (Les cotes propres de la bobine sont déjà</w:t>
+      </w:r>
+      <w:r>
+        <w:t xml:space="preserve"> </w:t>
+      </w:r>
+      <w:r>
+        <w:t xml:space="preserve">résolues, cf. archive.)</w:t>
+      </w:r>
+    </w:p>
+    <w:bookmarkEnd w:id="13"/>
+    <w:bookmarkStart w:id="14" w:name="Xc95284d183e22d111a969a659ad44503f34d1a5"/>
+    <w:p>
+      <w:pPr>
+        <w:pStyle w:val="Heading3"/>
+      </w:pPr>
+      <w:r>
+        <w:t xml:space="preserve">4. Exp 6 — Diffusivité latérale (→ désormais couverte par Exp 9)</w:t>
+      </w:r>
+    </w:p>
+    <w:p>
+      <w:pPr>
+        <w:pStyle w:val="FirstParagraph"/>
+      </w:pPr>
+      <w:r>
+        <w:rPr>
+          <w:b/>
+          <w:bCs/>
+        </w:rPr>
+        <w:t xml:space="preserve">Objectif.</w:t>
+      </w:r>
+      <w:r>
+        <w:t xml:space="preserve"> </w:t>
+      </w:r>
+      <w:r>
+        <w:rPr>
+          <w:rStyle w:val="VerbatimChar"/>
+        </w:rPr>
         <w:t xml:space="preserve">k_plan</w:t>
       </w:r>
       <w:r>
         <w:t xml:space="preserve"> </w:t>
       </w:r>
       <w:r>
-        <w:t xml:space="preserve">effectif via la décroissance latérale de T. Depuis la correction de</w:t>
-      </w:r>
-      <w:r>
-        <w:t xml:space="preserve"> </w:t>
-      </w:r>
-      <w:r>
-        <w:t xml:space="preserve">géométrie, le modèle s’accorde à</w:t>
-      </w:r>
-      <w:r>
-        <w:t xml:space="preserve"> </w:t>
-      </w:r>
-      <w:r>
-        <w:rPr>
-          <w:rStyle w:val="VerbatimChar"/>
-        </w:rPr>
-        <w:t xml:space="preserve">k_plan = 3 W/m·K</w:t>
-      </w:r>
-      <w:r>
-        <w:t xml:space="preserve"> </w:t>
-      </w:r>
-      <w:r>
-        <w:t xml:space="preserve">(physique) : cette mesure ne tranche plus</w:t>
-      </w:r>
-      <w:r>
-        <w:t xml:space="preserve"> </w:t>
-      </w:r>
-      <w:r>
-        <w:t xml:space="preserve">un écart ouvert, elle</w:t>
-      </w:r>
-      <w:r>
-        <w:t xml:space="preserve"> </w:t>
-      </w:r>
-      <w:r>
-        <w:rPr>
-          <w:b/>
-          <w:bCs/>
-        </w:rPr>
-        <w:t xml:space="preserve">vérifie</w:t>
-      </w:r>
-      <w:r>
-        <w:t xml:space="preserve"> </w:t>
-      </w:r>
-      <w:r>
-        <w:t xml:space="preserve">une propriété assumée. Protocole caméra détaillé dans</w:t>
-      </w:r>
-      <w:r>
-        <w:t xml:space="preserve"> </w:t>
-      </w:r>
-      <w:r>
-        <w:t xml:space="preserve">l’archive. Un essai, sous Tf, échantillons réutilisables.</w:t>
+        <w:t xml:space="preserve">effectif via la décroissance latérale de T.</w:t>
+      </w:r>
+      <w:r>
+        <w:t xml:space="preserve"> </w:t>
+      </w:r>
+      <w:r>
+        <w:rPr>
+          <w:b/>
+          <w:bCs/>
+        </w:rPr>
+        <w:t xml:space="preserve">Réalisée sous une forme</w:t>
+      </w:r>
+      <w:r>
+        <w:rPr>
+          <w:b/>
+          <w:bCs/>
+        </w:rPr>
+        <w:t xml:space="preserve"> </w:t>
+      </w:r>
+      <w:r>
+        <w:rPr>
+          <w:b/>
+          <w:bCs/>
+        </w:rPr>
+        <w:t xml:space="preserve">directe par Exp 9</w:t>
+      </w:r>
+      <w:r>
+        <w:t xml:space="preserve"> </w:t>
+      </w:r>
+      <w:r>
+        <w:t xml:space="preserve">(ligne de TC en longueur, phase centre = conduction pure). Garder cette entrée</w:t>
+      </w:r>
+      <w:r>
+        <w:t xml:space="preserve"> </w:t>
+      </w:r>
+      <w:r>
+        <w:t xml:space="preserve">comme rappel de l’option « caméra » (protocole détaillé dans l’archive) si l’on préfère l’imagerie</w:t>
+      </w:r>
+      <w:r>
+        <w:t xml:space="preserve"> </w:t>
+      </w:r>
+      <w:r>
+        <w:t xml:space="preserve">aux thermocouples.</w:t>
       </w:r>
     </w:p>
-    <w:bookmarkEnd w:id="12"/>
-    <w:bookmarkStart w:id="13" w:name="Xe64e2534bde4dc347a04e8b1b2630333f71be38"/>
+    <w:bookmarkEnd w:id="14"/>
+    <w:bookmarkStart w:id="15" w:name="Xee5de81a9223a7b864e6619e883d74a6fd49c0f"/>
     <w:p>
       <w:pPr>
         <w:pStyle w:val="Heading3"/>
       </w:pPr>
       <w:r>
-        <w:t xml:space="preserve">4. Mesures de propriété au labo (optionnel, si les niveaux 1-3 ne suffisent pas)</w:t>
+        <w:t xml:space="preserve">5. Mesures de propriété au labo (optionnel, si les niveaux 1-4 ne suffisent pas)</w:t>
       </w:r>
     </w:p>
     <w:p>
@@ -649,9 +799,9 @@
         </w:pict>
       </w:r>
     </w:p>
-    <w:bookmarkEnd w:id="13"/>
-    <w:bookmarkEnd w:id="14"/>
-    <w:bookmarkStart w:id="15" w:name="X319a7103beb0a1b1bc66c1fb6c6a76654e6a4ce"/>
+    <w:bookmarkEnd w:id="15"/>
+    <w:bookmarkEnd w:id="16"/>
+    <w:bookmarkStart w:id="17" w:name="X319a7103beb0a1b1bc66c1fb6c6a76654e6a4ce"/>
     <w:p>
       <w:pPr>
         <w:pStyle w:val="Heading2"/>
@@ -875,8 +1025,8 @@
         </w:pict>
       </w:r>
     </w:p>
-    <w:bookmarkEnd w:id="15"/>
-    <w:bookmarkStart w:id="16" w:name="tableau-de-synthèse-items-ouverts"/>
+    <w:bookmarkEnd w:id="17"/>
+    <w:bookmarkStart w:id="18" w:name="tableau-de-synthèse-items-ouverts"/>
     <w:p>
       <w:pPr>
         <w:pStyle w:val="Heading2"/>
@@ -955,7 +1105,11 @@
               <w:pStyle w:val="Compact"/>
             </w:pPr>
             <w:r>
-              <w:t xml:space="preserve">Exp 8</w:t>
+              <w:rPr>
+                <w:b/>
+                <w:bCs/>
+              </w:rPr>
+              <w:t xml:space="preserve">Exp 9</w:t>
             </w:r>
           </w:p>
         </w:tc>
@@ -966,7 +1120,17 @@
               <w:pStyle w:val="Compact"/>
             </w:pPr>
             <w:r>
-              <w:t xml:space="preserve">Température face active du CFC</w:t>
+              <w:rPr>
+                <w:b/>
+                <w:bCs/>
+              </w:rPr>
+              <w:t xml:space="preserve">Dissipation longitudinale T(x)</w:t>
+            </w:r>
+            <w:r>
+              <w:t xml:space="preserve"> </w:t>
+            </w:r>
+            <w:r>
+              <w:t xml:space="preserve">(fiche prête)</w:t>
             </w:r>
           </w:p>
         </w:tc>
@@ -977,7 +1141,17 @@
               <w:pStyle w:val="Compact"/>
             </w:pPr>
             <w:r>
-              <w:t xml:space="preserve">moyenne</w:t>
+              <w:t xml:space="preserve">★</w:t>
+            </w:r>
+            <w:r>
+              <w:t xml:space="preserve"> </w:t>
+            </w:r>
+            <w:r>
+              <w:rPr>
+                <w:b/>
+                <w:bCs/>
+              </w:rPr>
+              <w:t xml:space="preserve">haute</w:t>
             </w:r>
           </w:p>
         </w:tc>
@@ -988,7 +1162,16 @@
               <w:pStyle w:val="Compact"/>
             </w:pPr>
             <w:r>
-              <w:t xml:space="preserve">déficit de surface TC1</w:t>
+              <w:t xml:space="preserve">étalement trop lent +</w:t>
+            </w:r>
+            <w:r>
+              <w:t xml:space="preserve"> </w:t>
+            </w:r>
+            <w:r>
+              <w:rPr>
+                <w:rStyle w:val="VerbatimChar"/>
+              </w:rPr>
+              <w:t xml:space="preserve">k_plan</w:t>
             </w:r>
           </w:p>
         </w:tc>
@@ -1001,7 +1184,7 @@
               <w:pStyle w:val="Compact"/>
             </w:pPr>
             <w:r>
-              <w:t xml:space="preserve">Relevé 1</w:t>
+              <w:t xml:space="preserve">Exp 8</w:t>
             </w:r>
           </w:p>
         </w:tc>
@@ -1012,7 +1195,7 @@
               <w:pStyle w:val="Compact"/>
             </w:pPr>
             <w:r>
-              <w:t xml:space="preserve">Position longitudinale bobine</w:t>
+              <w:t xml:space="preserve">Température face active du CFC</w:t>
             </w:r>
           </w:p>
         </w:tc>
@@ -1023,7 +1206,7 @@
               <w:pStyle w:val="Compact"/>
             </w:pPr>
             <w:r>
-              <w:t xml:space="preserve">basse</w:t>
+              <w:t xml:space="preserve">moyenne</w:t>
             </w:r>
           </w:p>
         </w:tc>
@@ -1034,16 +1217,7 @@
               <w:pStyle w:val="Compact"/>
             </w:pPr>
             <w:r>
-              <w:rPr>
-                <w:rStyle w:val="VerbatimChar"/>
-              </w:rPr>
-              <w:t xml:space="preserve">decalage_x</w:t>
-            </w:r>
-            <w:r>
-              <w:t xml:space="preserve"> </w:t>
-            </w:r>
-            <w:r>
-              <w:t xml:space="preserve">(figé)</w:t>
+              <w:t xml:space="preserve">déficit de surface TC1</w:t>
             </w:r>
           </w:p>
         </w:tc>
@@ -1056,7 +1230,7 @@
               <w:pStyle w:val="Compact"/>
             </w:pPr>
             <w:r>
-              <w:t xml:space="preserve">Exp 6</w:t>
+              <w:t xml:space="preserve">Relevé 1</w:t>
             </w:r>
           </w:p>
         </w:tc>
@@ -1067,7 +1241,7 @@
               <w:pStyle w:val="Compact"/>
             </w:pPr>
             <w:r>
-              <w:t xml:space="preserve">Diffusivité latérale</w:t>
+              <w:t xml:space="preserve">Position longitudinale bobine</w:t>
             </w:r>
           </w:p>
         </w:tc>
@@ -1078,7 +1252,7 @@
               <w:pStyle w:val="Compact"/>
             </w:pPr>
             <w:r>
-              <w:t xml:space="preserve">basse (vérif.)</w:t>
+              <w:t xml:space="preserve">basse</w:t>
             </w:r>
           </w:p>
         </w:tc>
@@ -1092,7 +1266,13 @@
               <w:rPr>
                 <w:rStyle w:val="VerbatimChar"/>
               </w:rPr>
-              <w:t xml:space="preserve">k_plan</w:t>
+              <w:t xml:space="preserve">decalage_x</w:t>
+            </w:r>
+            <w:r>
+              <w:t xml:space="preserve"> </w:t>
+            </w:r>
+            <w:r>
+              <w:t xml:space="preserve">(figé)</w:t>
             </w:r>
           </w:p>
         </w:tc>
@@ -1105,7 +1285,7 @@
               <w:pStyle w:val="Compact"/>
             </w:pPr>
             <w:r>
-              <w:t xml:space="preserve">Mesure 9</w:t>
+              <w:t xml:space="preserve">Exp 6</w:t>
             </w:r>
           </w:p>
         </w:tc>
@@ -1116,16 +1296,7 @@
               <w:pStyle w:val="Compact"/>
             </w:pPr>
             <w:r>
-              <w:rPr>
-                <w:rStyle w:val="VerbatimChar"/>
-              </w:rPr>
-              <w:t xml:space="preserve">k_plan</w:t>
-            </w:r>
-            <w:r>
-              <w:t xml:space="preserve"> </w:t>
-            </w:r>
-            <w:r>
-              <w:t xml:space="preserve">direct (labo)</w:t>
+              <w:t xml:space="preserve">Diffusivité latérale</w:t>
             </w:r>
           </w:p>
         </w:tc>
@@ -1136,7 +1307,7 @@
               <w:pStyle w:val="Compact"/>
             </w:pPr>
             <w:r>
-              <w:t xml:space="preserve">basse</w:t>
+              <w:t xml:space="preserve">→ couverte par Exp 9</w:t>
             </w:r>
           </w:p>
         </w:tc>
@@ -1151,12 +1322,6 @@
                 <w:rStyle w:val="VerbatimChar"/>
               </w:rPr>
               <w:t xml:space="preserve">k_plan</w:t>
-            </w:r>
-            <w:r>
-              <w:t xml:space="preserve"> </w:t>
-            </w:r>
-            <w:r>
-              <w:t xml:space="preserve">sourcé</w:t>
             </w:r>
           </w:p>
         </w:tc>
@@ -1169,6 +1334,70 @@
               <w:pStyle w:val="Compact"/>
             </w:pPr>
             <w:r>
+              <w:t xml:space="preserve">Mesure 9</w:t>
+            </w:r>
+          </w:p>
+        </w:tc>
+        <w:tc>
+          <w:tcPr/>
+          <w:p>
+            <w:pPr>
+              <w:pStyle w:val="Compact"/>
+            </w:pPr>
+            <w:r>
+              <w:rPr>
+                <w:rStyle w:val="VerbatimChar"/>
+              </w:rPr>
+              <w:t xml:space="preserve">k_plan</w:t>
+            </w:r>
+            <w:r>
+              <w:t xml:space="preserve"> </w:t>
+            </w:r>
+            <w:r>
+              <w:t xml:space="preserve">direct (labo)</w:t>
+            </w:r>
+          </w:p>
+        </w:tc>
+        <w:tc>
+          <w:tcPr/>
+          <w:p>
+            <w:pPr>
+              <w:pStyle w:val="Compact"/>
+            </w:pPr>
+            <w:r>
+              <w:t xml:space="preserve">basse</w:t>
+            </w:r>
+          </w:p>
+        </w:tc>
+        <w:tc>
+          <w:tcPr/>
+          <w:p>
+            <w:pPr>
+              <w:pStyle w:val="Compact"/>
+            </w:pPr>
+            <w:r>
+              <w:rPr>
+                <w:rStyle w:val="VerbatimChar"/>
+              </w:rPr>
+              <w:t xml:space="preserve">k_plan</w:t>
+            </w:r>
+            <w:r>
+              <w:t xml:space="preserve"> </w:t>
+            </w:r>
+            <w:r>
+              <w:t xml:space="preserve">sourcé</w:t>
+            </w:r>
+          </w:p>
+        </w:tc>
+      </w:tr>
+      <w:tr>
+        <w:tc>
+          <w:tcPr/>
+          <w:p>
+            <w:pPr>
+              <w:pStyle w:val="Compact"/>
+            </w:pPr>
+            <w:r>
               <w:t xml:space="preserve">Mesure 10</w:t>
             </w:r>
           </w:p>
@@ -1296,7 +1525,7 @@
         <w:t xml:space="preserve">.</w:t>
       </w:r>
     </w:p>
-    <w:bookmarkEnd w:id="16"/>
+    <w:bookmarkEnd w:id="18"/>
     <w:sectPr>
       <w:footnotePr>
         <w:numRestart w:val="eachSect"/>

</xml_diff>